<commit_message>
Add SRS gap analysis, benchmarking walkthrough and CI workflow
- SRS Gap Analysis (Word/PDF): requirement-by-requirement status,
  measurements, document gaps and next steps
- User Guide: Run 6 benchmarking walkthrough, scenarios for every other
  module, seven organizations and groups
- Installation Guide: seven organizations, groups, backup and restore
- Coverage Checklist and Traceability screen show assessed SRS status
- CI workflow runs seed, tests and build on Linux, Windows and macOS

Co-Authored-By: Claude Opus 5.5 <noreply@anthropic.com>
Claude-Session: https://claude.ai/code/session_017KtXLt3mYH4XoBGFVP5Vh6
</commit_message>
<xml_diff>
--- a/cortexplm/docs/guides/CortexPLM_Coverage_Checklist.docx
+++ b/cortexplm/docs/guides/CortexPLM_Coverage_Checklist.docx
@@ -174,7 +174,7 @@
             </w:rPr>
             <w:fldChar w:fldCharType="separate"/>
           </w:r>
-          <w:hyperlink w:anchor="__RefHeading___Toc10651_3479964216">
+          <w:hyperlink w:anchor="__RefHeading___Toc11781_1092322862">
             <w:r>
               <w:rPr>
                 <w:webHidden/>
@@ -195,7 +195,7 @@
             </w:tabs>
             <w:rPr/>
           </w:pPr>
-          <w:hyperlink w:anchor="__RefHeading___Toc10653_3479964216">
+          <w:hyperlink w:anchor="__RefHeading___Toc11783_1092322862">
             <w:r>
               <w:rPr>
                 <w:webHidden/>
@@ -216,7 +216,7 @@
             </w:tabs>
             <w:rPr/>
           </w:pPr>
-          <w:hyperlink w:anchor="__RefHeading___Toc10655_3479964216">
+          <w:hyperlink w:anchor="__RefHeading___Toc11785_1092322862">
             <w:r>
               <w:rPr>
                 <w:webHidden/>
@@ -237,7 +237,7 @@
             </w:tabs>
             <w:rPr/>
           </w:pPr>
-          <w:hyperlink w:anchor="__RefHeading___Toc10657_3479964216">
+          <w:hyperlink w:anchor="__RefHeading___Toc11787_1092322862">
             <w:r>
               <w:rPr>
                 <w:webHidden/>
@@ -258,7 +258,7 @@
             </w:tabs>
             <w:rPr/>
           </w:pPr>
-          <w:hyperlink w:anchor="__RefHeading___Toc10659_3479964216">
+          <w:hyperlink w:anchor="__RefHeading___Toc11789_1092322862">
             <w:r>
               <w:rPr>
                 <w:webHidden/>
@@ -279,7 +279,7 @@
             </w:tabs>
             <w:rPr/>
           </w:pPr>
-          <w:hyperlink w:anchor="__RefHeading___Toc10661_3479964216">
+          <w:hyperlink w:anchor="__RefHeading___Toc11791_1092322862">
             <w:r>
               <w:rPr>
                 <w:webHidden/>
@@ -300,7 +300,7 @@
             </w:tabs>
             <w:rPr/>
           </w:pPr>
-          <w:hyperlink w:anchor="__RefHeading___Toc10663_3479964216">
+          <w:hyperlink w:anchor="__RefHeading___Toc11793_1092322862">
             <w:r>
               <w:rPr>
                 <w:webHidden/>
@@ -321,7 +321,7 @@
             </w:tabs>
             <w:rPr/>
           </w:pPr>
-          <w:hyperlink w:anchor="__RefHeading___Toc10665_3479964216">
+          <w:hyperlink w:anchor="__RefHeading___Toc11795_1092322862">
             <w:r>
               <w:rPr>
                 <w:webHidden/>
@@ -371,7 +371,7 @@
         <w:spacing w:before="0" w:after="160"/>
         <w:rPr/>
       </w:pPr>
-      <w:bookmarkStart w:id="0" w:name="__RefHeading___Toc10651_3479964216"/>
+      <w:bookmarkStart w:id="0" w:name="__RefHeading___Toc11781_1092322862"/>
       <w:bookmarkEnd w:id="0"/>
       <w:r>
         <w:rPr/>
@@ -387,7 +387,7 @@
         <w:rPr>
           <w:rFonts w:eastAsia="Times New Roman" w:cs="Times New Roman"/>
         </w:rPr>
-        <w:t>All 41 content blocks of the five source documents and of the request are covered. Counts come from the running application after a fresh demonstration seed, not from the documents.</w:t>
+        <w:t>41 of 43 content blocks of the five source documents and of the request are fully covered. The SRS blocks are marked Partial: 148 of 155 SRS requirements are met, and the remaining ones are listed with next steps in the SRS Gap Analysis. Counts come from the running application after a fresh demonstration seed.</w:t>
       </w:r>
     </w:p>
     <w:tbl>
@@ -814,7 +814,7 @@
               <w:bottom w:val="single" w:sz="4" w:space="0" w:color="E3E3E4"/>
               <w:right w:val="single" w:sz="4" w:space="0" w:color="E3E3E4"/>
             </w:tcBorders>
-            <w:shd w:color="auto" w:fill="D9EAD3" w:val="clear"/>
+            <w:shd w:color="auto" w:fill="FBE0B5" w:val="clear"/>
           </w:tcPr>
           <w:p>
             <w:pPr>
@@ -828,7 +828,7 @@
                 <w:rFonts w:eastAsia="Times New Roman" w:cs="Times New Roman"/>
                 <w:sz w:val="19"/>
               </w:rPr>
-              <w:t>Covered</w:t>
+              <w:t>Partial</w:t>
             </w:r>
           </w:p>
         </w:tc>
@@ -967,7 +967,7 @@
                 <w:rFonts w:eastAsia="Times New Roman" w:cs="Times New Roman"/>
                 <w:sz w:val="19"/>
               </w:rPr>
-              <w:t>3</w:t>
+              <w:t>5</w:t>
             </w:r>
           </w:p>
         </w:tc>
@@ -1079,7 +1079,7 @@
         <w:pStyle w:val="Heading1"/>
         <w:rPr/>
       </w:pPr>
-      <w:bookmarkStart w:id="1" w:name="__RefHeading___Toc10653_3479964216"/>
+      <w:bookmarkStart w:id="1" w:name="__RefHeading___Toc11783_1092322862"/>
       <w:bookmarkEnd w:id="1"/>
       <w:r>
         <w:rPr/>
@@ -2373,7 +2373,7 @@
         <w:pStyle w:val="Heading1"/>
         <w:rPr/>
       </w:pPr>
-      <w:bookmarkStart w:id="2" w:name="__RefHeading___Toc10655_3479964216"/>
+      <w:bookmarkStart w:id="2" w:name="__RefHeading___Toc11785_1092322862"/>
       <w:bookmarkEnd w:id="2"/>
       <w:r>
         <w:rPr/>
@@ -3075,7 +3075,7 @@
                 <w:rFonts w:eastAsia="Times New Roman" w:cs="Times New Roman"/>
                 <w:sz w:val="17"/>
               </w:rPr>
-              <w:t>64 / 64 / 64 / 64 / 64 / 64 per organization (60 reference + organization rules)</w:t>
+              <w:t>64 / 64 / 64 / 64 / 64 / 64 / 64 per organization (60 reference + organization rules)</w:t>
             </w:r>
           </w:p>
         </w:tc>
@@ -3347,7 +3347,7 @@
                 <w:rFonts w:eastAsia="Times New Roman" w:cs="Times New Roman"/>
                 <w:sz w:val="17"/>
               </w:rPr>
-              <w:t>58 / 53 / 59 / 53 / 54 / 57 per organization (47 reference + compliance starters)</w:t>
+              <w:t>58 / 53 / 59 / 53 / 54 / 57 / 57 per organization (47 reference + compliance starters)</w:t>
             </w:r>
           </w:p>
         </w:tc>
@@ -3481,7 +3481,7 @@
                 <w:rFonts w:eastAsia="Times New Roman" w:cs="Times New Roman"/>
                 <w:sz w:val="17"/>
               </w:rPr>
-              <w:t>49 / 50 / 49 / 49 / 48 / 50 per organization (27 reference + project risks)</w:t>
+              <w:t>50 / 48 / 50 / 48 / 49 / 48 / 48 per organization (27 reference + project risks)</w:t>
             </w:r>
           </w:p>
         </w:tc>
@@ -3619,7 +3619,7 @@
                 <w:rFonts w:eastAsia="Times New Roman" w:cs="Times New Roman"/>
                 <w:sz w:val="17"/>
               </w:rPr>
-              <w:t>38 / 38 / 38 / 38 / 38 / 38 per organization (38 of 38)</w:t>
+              <w:t>38 / 38 / 38 / 38 / 38 / 38 / 38 per organization (38 of 38)</w:t>
             </w:r>
           </w:p>
         </w:tc>
@@ -4297,7 +4297,7 @@
                 <w:rFonts w:eastAsia="Times New Roman" w:cs="Times New Roman"/>
                 <w:sz w:val="17"/>
               </w:rPr>
-              <w:t>23 / 23 / 23 / 23 / 23 / 23 per organization (23 of 23)</w:t>
+              <w:t>23 / 23 / 23 / 23 / 23 / 23 / 23 per organization (23 of 23)</w:t>
             </w:r>
           </w:p>
         </w:tc>
@@ -4617,7 +4617,7 @@
         <w:pStyle w:val="Heading1"/>
         <w:rPr/>
       </w:pPr>
-      <w:bookmarkStart w:id="3" w:name="__RefHeading___Toc10657_3479964216"/>
+      <w:bookmarkStart w:id="3" w:name="__RefHeading___Toc11787_1092322862"/>
       <w:bookmarkEnd w:id="3"/>
       <w:r>
         <w:rPr/>
@@ -5773,7 +5773,7 @@
         <w:pStyle w:val="Heading1"/>
         <w:rPr/>
       </w:pPr>
-      <w:bookmarkStart w:id="4" w:name="__RefHeading___Toc10659_3479964216"/>
+      <w:bookmarkStart w:id="4" w:name="__RefHeading___Toc11789_1092322862"/>
       <w:bookmarkEnd w:id="4"/>
       <w:r>
         <w:rPr/>
@@ -6149,7 +6149,7 @@
                 <w:rFonts w:eastAsia="Times New Roman" w:cs="Times New Roman"/>
                 <w:sz w:val="17"/>
               </w:rPr>
-              <w:t>Every requirement traced to a screen and a server module</w:t>
+              <w:t>Each requirement assessed individually (see the SRS Gap Analysis)</w:t>
             </w:r>
           </w:p>
         </w:tc>
@@ -6203,7 +6203,7 @@
                 <w:rFonts w:eastAsia="Times New Roman" w:cs="Times New Roman"/>
                 <w:sz w:val="17"/>
               </w:rPr>
-              <w:t>155 of 155 requirements traced</w:t>
+              <w:t>110 of 112 met; partial: FR-DA-TEN-08, FR-DA-I18N-01</w:t>
             </w:r>
           </w:p>
         </w:tc>
@@ -6216,21 +6216,21 @@
               <w:bottom w:val="single" w:sz="4" w:space="0" w:color="E3E3E4"/>
               <w:right w:val="single" w:sz="4" w:space="0" w:color="E3E3E4"/>
             </w:tcBorders>
-            <w:shd w:color="auto" w:fill="D9EAD3" w:val="clear"/>
-          </w:tcPr>
-          <w:p>
-            <w:pPr>
-              <w:pStyle w:val="Normal"/>
-              <w:spacing w:lineRule="auto" w:line="240" w:before="0" w:after="0"/>
-              <w:jc w:val="left"/>
-              <w:rPr/>
-            </w:pPr>
-            <w:r>
-              <w:rPr>
-                <w:rFonts w:eastAsia="Times New Roman" w:cs="Times New Roman"/>
-                <w:sz w:val="17"/>
-              </w:rPr>
-              <w:t>Covered</w:t>
+            <w:shd w:color="auto" w:fill="FBE0B5" w:val="clear"/>
+          </w:tcPr>
+          <w:p>
+            <w:pPr>
+              <w:pStyle w:val="Normal"/>
+              <w:spacing w:lineRule="auto" w:line="240" w:before="0" w:after="0"/>
+              <w:jc w:val="left"/>
+              <w:rPr/>
+            </w:pPr>
+            <w:r>
+              <w:rPr>
+                <w:rFonts w:eastAsia="Times New Roman" w:cs="Times New Roman"/>
+                <w:sz w:val="17"/>
+              </w:rPr>
+              <w:t>Partial</w:t>
             </w:r>
           </w:p>
         </w:tc>
@@ -6285,7 +6285,7 @@
                 <w:rFonts w:eastAsia="Times New Roman" w:cs="Times New Roman"/>
                 <w:sz w:val="17"/>
               </w:rPr>
-              <w:t>Security headers, rate limit, encryption, tenant isolation tests, accessibility, RTL, exports</w:t>
+              <w:t>Measured: response times, 100 concurrent users, BPMN round trip, WCAG scan, phone width; tests in CI</w:t>
             </w:r>
           </w:p>
         </w:tc>
@@ -6337,7 +6337,7 @@
                 <w:rFonts w:eastAsia="Times New Roman" w:cs="Times New Roman"/>
                 <w:sz w:val="17"/>
               </w:rPr>
-              <w:t>Included in the 155</w:t>
+              <w:t>38 of 43 met; partial or hosting: NFR-DA-REL-02, NFR-DA-SCALE-03, NFR-DA-UX-03, NFR-DA-PORT-02, NFR-DA-MAINT-01</w:t>
             </w:r>
           </w:p>
         </w:tc>
@@ -6350,21 +6350,21 @@
               <w:bottom w:val="single" w:sz="4" w:space="0" w:color="E3E3E4"/>
               <w:right w:val="single" w:sz="4" w:space="0" w:color="E3E3E4"/>
             </w:tcBorders>
-            <w:shd w:color="auto" w:fill="D9EAD3" w:val="clear"/>
-          </w:tcPr>
-          <w:p>
-            <w:pPr>
-              <w:pStyle w:val="Normal"/>
-              <w:spacing w:lineRule="auto" w:line="240" w:before="0" w:after="0"/>
-              <w:jc w:val="left"/>
-              <w:rPr/>
-            </w:pPr>
-            <w:r>
-              <w:rPr>
-                <w:rFonts w:eastAsia="Times New Roman" w:cs="Times New Roman"/>
-                <w:sz w:val="17"/>
-              </w:rPr>
-              <w:t>Covered</w:t>
+            <w:shd w:color="auto" w:fill="FBE0B5" w:val="clear"/>
+          </w:tcPr>
+          <w:p>
+            <w:pPr>
+              <w:pStyle w:val="Normal"/>
+              <w:spacing w:lineRule="auto" w:line="240" w:before="0" w:after="0"/>
+              <w:jc w:val="left"/>
+              <w:rPr/>
+            </w:pPr>
+            <w:r>
+              <w:rPr>
+                <w:rFonts w:eastAsia="Times New Roman" w:cs="Times New Roman"/>
+                <w:sz w:val="17"/>
+              </w:rPr>
+              <w:t>Partial</w:t>
             </w:r>
           </w:p>
         </w:tc>
@@ -6523,7 +6523,7 @@
         <w:pStyle w:val="Heading1"/>
         <w:rPr/>
       </w:pPr>
-      <w:bookmarkStart w:id="5" w:name="__RefHeading___Toc10661_3479964216"/>
+      <w:bookmarkStart w:id="5" w:name="__RefHeading___Toc11791_1092322862"/>
       <w:bookmarkEnd w:id="5"/>
       <w:r>
         <w:rPr/>
@@ -6815,7 +6815,7 @@
                 <w:rFonts w:eastAsia="Times New Roman" w:cs="Times New Roman"/>
                 <w:sz w:val="17"/>
               </w:rPr>
-              <w:t>saas active 25/60 / saas active 24/40 / saas active 24/40 / saas active 24/30 / saas warning 24/30 / saas active 24/30</w:t>
+              <w:t>saas active 25/60 / saas active 24/40 / saas active 24/40 / saas active 24/30 / saas warning 24/30 / saas active 24/30 / saas active 24/40</w:t>
             </w:r>
           </w:p>
         </w:tc>
@@ -7273,7 +7273,7 @@
         <w:pStyle w:val="Heading1"/>
         <w:rPr/>
       </w:pPr>
-      <w:bookmarkStart w:id="6" w:name="__RefHeading___Toc10663_3479964216"/>
+      <w:bookmarkStart w:id="6" w:name="__RefHeading___Toc11793_1092322862"/>
       <w:bookmarkEnd w:id="6"/>
       <w:r>
         <w:rPr/>
@@ -7487,7 +7487,7 @@
                 <w:rFonts w:eastAsia="Times New Roman" w:cs="Times New Roman"/>
                 <w:sz w:val="17"/>
               </w:rPr>
-              <w:t>Six industries: Public Sector, Manufacturing in Construction, Healthcare, Agro-Business – Dairy, Transportation, Oil/Gas/Energy</w:t>
+              <w:t>Seven sectors: Public Sector, Manufacturing in Construction, Healthcare, Agro-Business – Dairy, Transportation, Oil/Gas/Energy, Construction</w:t>
             </w:r>
           </w:p>
         </w:tc>
@@ -7513,7 +7513,7 @@
                 <w:rFonts w:eastAsia="Times New Roman" w:cs="Times New Roman"/>
                 <w:sz w:val="17"/>
               </w:rPr>
-              <w:t>One organization per industry with 24–25 users and 21 projects</w:t>
+              <w:t>One organization per sector with 24–25 users and 21 projects</w:t>
             </w:r>
           </w:p>
         </w:tc>
@@ -7565,7 +7565,279 @@
                 <w:rFonts w:eastAsia="Times New Roman" w:cs="Times New Roman"/>
                 <w:sz w:val="17"/>
               </w:rPr>
-              <w:t>Public Sector / Manufacturing in Construction / Healthcare / Agro-Business - Dairy Products / Transportation / Oil, Gas &amp; Energy</w:t>
+              <w:t>Public Sector / Manufacturing in Construction / Healthcare / Agro-Business - Dairy Products / Transportation / Oil, Gas &amp; Energy / Construction</w:t>
+            </w:r>
+          </w:p>
+        </w:tc>
+        <w:tc>
+          <w:tcPr>
+            <w:tcW w:w="892" w:type="dxa"/>
+            <w:tcBorders>
+              <w:top w:val="single" w:sz="4" w:space="0" w:color="E3E3E4"/>
+              <w:left w:val="single" w:sz="4" w:space="0" w:color="E3E3E4"/>
+              <w:bottom w:val="single" w:sz="4" w:space="0" w:color="E3E3E4"/>
+              <w:right w:val="single" w:sz="4" w:space="0" w:color="E3E3E4"/>
+            </w:tcBorders>
+            <w:shd w:color="auto" w:fill="D9EAD3" w:val="clear"/>
+          </w:tcPr>
+          <w:p>
+            <w:pPr>
+              <w:pStyle w:val="Normal"/>
+              <w:spacing w:lineRule="auto" w:line="240" w:before="0" w:after="0"/>
+              <w:jc w:val="left"/>
+              <w:rPr/>
+            </w:pPr>
+            <w:r>
+              <w:rPr>
+                <w:rFonts w:eastAsia="Times New Roman" w:cs="Times New Roman"/>
+                <w:sz w:val="17"/>
+              </w:rPr>
+              <w:t>Covered</w:t>
+            </w:r>
+          </w:p>
+        </w:tc>
+      </w:tr>
+      <w:tr>
+        <w:trPr/>
+        <w:tc>
+          <w:tcPr>
+            <w:tcW w:w="2591" w:type="dxa"/>
+            <w:tcBorders>
+              <w:top w:val="single" w:sz="4" w:space="0" w:color="E3E3E4"/>
+              <w:left w:val="single" w:sz="4" w:space="0" w:color="E3E3E4"/>
+              <w:bottom w:val="single" w:sz="4" w:space="0" w:color="E3E3E4"/>
+              <w:right w:val="single" w:sz="4" w:space="0" w:color="E3E3E4"/>
+            </w:tcBorders>
+            <w:shd w:color="auto" w:fill="F2F2F3" w:val="clear"/>
+          </w:tcPr>
+          <w:p>
+            <w:pPr>
+              <w:pStyle w:val="Normal"/>
+              <w:spacing w:lineRule="auto" w:line="240" w:before="0" w:after="0"/>
+              <w:jc w:val="left"/>
+              <w:rPr/>
+            </w:pPr>
+            <w:r>
+              <w:rPr>
+                <w:rFonts w:eastAsia="Times New Roman" w:cs="Times New Roman"/>
+                <w:sz w:val="17"/>
+              </w:rPr>
+              <w:t>Tenant model: Group (Yes/No), Organization, Project</w:t>
+            </w:r>
+          </w:p>
+        </w:tc>
+        <w:tc>
+          <w:tcPr>
+            <w:tcW w:w="2737" w:type="dxa"/>
+            <w:tcBorders>
+              <w:top w:val="single" w:sz="4" w:space="0" w:color="E3E3E4"/>
+              <w:left w:val="single" w:sz="4" w:space="0" w:color="E3E3E4"/>
+              <w:bottom w:val="single" w:sz="4" w:space="0" w:color="E3E3E4"/>
+              <w:right w:val="single" w:sz="4" w:space="0" w:color="E3E3E4"/>
+            </w:tcBorders>
+            <w:shd w:color="auto" w:fill="F2F2F3" w:val="clear"/>
+          </w:tcPr>
+          <w:p>
+            <w:pPr>
+              <w:pStyle w:val="Normal"/>
+              <w:spacing w:lineRule="auto" w:line="240" w:before="0" w:after="0"/>
+              <w:jc w:val="left"/>
+              <w:rPr/>
+            </w:pPr>
+            <w:r>
+              <w:rPr>
+                <w:rFonts w:eastAsia="Times New Roman" w:cs="Times New Roman"/>
+                <w:sz w:val="17"/>
+              </w:rPr>
+              <w:t>Atlas Infrastructure Holding (Cedarline, Ridgeway, Orvane); Crescent Agro-Energy Group (Valdora, Kestrel); Metro City and Meridale independent</w:t>
+            </w:r>
+          </w:p>
+        </w:tc>
+        <w:tc>
+          <w:tcPr>
+            <w:tcW w:w="1944" w:type="dxa"/>
+            <w:tcBorders>
+              <w:top w:val="single" w:sz="4" w:space="0" w:color="E3E3E4"/>
+              <w:left w:val="single" w:sz="4" w:space="0" w:color="E3E3E4"/>
+              <w:bottom w:val="single" w:sz="4" w:space="0" w:color="E3E3E4"/>
+              <w:right w:val="single" w:sz="4" w:space="0" w:color="E3E3E4"/>
+            </w:tcBorders>
+            <w:shd w:color="auto" w:fill="F2F2F3" w:val="clear"/>
+          </w:tcPr>
+          <w:p>
+            <w:pPr>
+              <w:pStyle w:val="Normal"/>
+              <w:spacing w:lineRule="auto" w:line="240" w:before="0" w:after="0"/>
+              <w:jc w:val="left"/>
+              <w:rPr/>
+            </w:pPr>
+            <w:r>
+              <w:rPr>
+                <w:rFonts w:eastAsia="Times New Roman" w:cs="Times New Roman"/>
+                <w:sz w:val="17"/>
+              </w:rPr>
+              <w:t>Administration &gt; Organizations &amp; OBS</w:t>
+            </w:r>
+          </w:p>
+        </w:tc>
+        <w:tc>
+          <w:tcPr>
+            <w:tcW w:w="1584" w:type="dxa"/>
+            <w:tcBorders>
+              <w:top w:val="single" w:sz="4" w:space="0" w:color="E3E3E4"/>
+              <w:left w:val="single" w:sz="4" w:space="0" w:color="E3E3E4"/>
+              <w:bottom w:val="single" w:sz="4" w:space="0" w:color="E3E3E4"/>
+              <w:right w:val="single" w:sz="4" w:space="0" w:color="E3E3E4"/>
+            </w:tcBorders>
+            <w:shd w:color="auto" w:fill="F2F2F3" w:val="clear"/>
+          </w:tcPr>
+          <w:p>
+            <w:pPr>
+              <w:pStyle w:val="Normal"/>
+              <w:spacing w:lineRule="auto" w:line="240" w:before="0" w:after="0"/>
+              <w:jc w:val="left"/>
+              <w:rPr/>
+            </w:pPr>
+            <w:r>
+              <w:rPr>
+                <w:rFonts w:eastAsia="Times New Roman" w:cs="Times New Roman"/>
+                <w:sz w:val="17"/>
+              </w:rPr>
+              <w:t>2 groups, 5 members, 2 independent</w:t>
+            </w:r>
+          </w:p>
+        </w:tc>
+        <w:tc>
+          <w:tcPr>
+            <w:tcW w:w="892" w:type="dxa"/>
+            <w:tcBorders>
+              <w:top w:val="single" w:sz="4" w:space="0" w:color="E3E3E4"/>
+              <w:left w:val="single" w:sz="4" w:space="0" w:color="E3E3E4"/>
+              <w:bottom w:val="single" w:sz="4" w:space="0" w:color="E3E3E4"/>
+              <w:right w:val="single" w:sz="4" w:space="0" w:color="E3E3E4"/>
+            </w:tcBorders>
+            <w:shd w:color="auto" w:fill="D9EAD3" w:val="clear"/>
+          </w:tcPr>
+          <w:p>
+            <w:pPr>
+              <w:pStyle w:val="Normal"/>
+              <w:spacing w:lineRule="auto" w:line="240" w:before="0" w:after="0"/>
+              <w:jc w:val="left"/>
+              <w:rPr/>
+            </w:pPr>
+            <w:r>
+              <w:rPr>
+                <w:rFonts w:eastAsia="Times New Roman" w:cs="Times New Roman"/>
+                <w:sz w:val="17"/>
+              </w:rPr>
+              <w:t>Covered</w:t>
+            </w:r>
+          </w:p>
+        </w:tc>
+      </w:tr>
+      <w:tr>
+        <w:trPr/>
+        <w:tc>
+          <w:tcPr>
+            <w:tcW w:w="2591" w:type="dxa"/>
+            <w:tcBorders>
+              <w:top w:val="single" w:sz="4" w:space="0" w:color="E3E3E4"/>
+              <w:left w:val="single" w:sz="4" w:space="0" w:color="E3E3E4"/>
+              <w:bottom w:val="single" w:sz="4" w:space="0" w:color="E3E3E4"/>
+              <w:right w:val="single" w:sz="4" w:space="0" w:color="E3E3E4"/>
+            </w:tcBorders>
+          </w:tcPr>
+          <w:p>
+            <w:pPr>
+              <w:pStyle w:val="Normal"/>
+              <w:spacing w:lineRule="auto" w:line="240" w:before="0" w:after="0"/>
+              <w:jc w:val="left"/>
+              <w:rPr/>
+            </w:pPr>
+            <w:r>
+              <w:rPr>
+                <w:rFonts w:eastAsia="Times New Roman" w:cs="Times New Roman"/>
+                <w:sz w:val="17"/>
+              </w:rPr>
+              <w:t>Benchmarking within the organization and within the group (external out of scope)</w:t>
+            </w:r>
+          </w:p>
+        </w:tc>
+        <w:tc>
+          <w:tcPr>
+            <w:tcW w:w="2737" w:type="dxa"/>
+            <w:tcBorders>
+              <w:top w:val="single" w:sz="4" w:space="0" w:color="E3E3E4"/>
+              <w:left w:val="single" w:sz="4" w:space="0" w:color="E3E3E4"/>
+              <w:bottom w:val="single" w:sz="4" w:space="0" w:color="E3E3E4"/>
+              <w:right w:val="single" w:sz="4" w:space="0" w:color="E3E3E4"/>
+            </w:tcBorders>
+          </w:tcPr>
+          <w:p>
+            <w:pPr>
+              <w:pStyle w:val="Normal"/>
+              <w:spacing w:lineRule="auto" w:line="240" w:before="0" w:after="0"/>
+              <w:jc w:val="left"/>
+              <w:rPr/>
+            </w:pPr>
+            <w:r>
+              <w:rPr>
+                <w:rFonts w:eastAsia="Times New Roman" w:cs="Times New Roman"/>
+                <w:sz w:val="17"/>
+              </w:rPr>
+              <w:t>Project type, track and department comparison; group comparison of aggregates with opt-out; 5 automated tests</w:t>
+            </w:r>
+          </w:p>
+        </w:tc>
+        <w:tc>
+          <w:tcPr>
+            <w:tcW w:w="1944" w:type="dxa"/>
+            <w:tcBorders>
+              <w:top w:val="single" w:sz="4" w:space="0" w:color="E3E3E4"/>
+              <w:left w:val="single" w:sz="4" w:space="0" w:color="E3E3E4"/>
+              <w:bottom w:val="single" w:sz="4" w:space="0" w:color="E3E3E4"/>
+              <w:right w:val="single" w:sz="4" w:space="0" w:color="E3E3E4"/>
+            </w:tcBorders>
+          </w:tcPr>
+          <w:p>
+            <w:pPr>
+              <w:pStyle w:val="Normal"/>
+              <w:spacing w:lineRule="auto" w:line="240" w:before="0" w:after="0"/>
+              <w:jc w:val="left"/>
+              <w:rPr/>
+            </w:pPr>
+            <w:r>
+              <w:rPr>
+                <w:rFonts w:eastAsia="Times New Roman" w:cs="Times New Roman"/>
+                <w:sz w:val="17"/>
+              </w:rPr>
+              <w:t>Reports &gt; Benchmarking</w:t>
+            </w:r>
+          </w:p>
+        </w:tc>
+        <w:tc>
+          <w:tcPr>
+            <w:tcW w:w="1584" w:type="dxa"/>
+            <w:tcBorders>
+              <w:top w:val="single" w:sz="4" w:space="0" w:color="E3E3E4"/>
+              <w:left w:val="single" w:sz="4" w:space="0" w:color="E3E3E4"/>
+              <w:bottom w:val="single" w:sz="4" w:space="0" w:color="E3E3E4"/>
+              <w:right w:val="single" w:sz="4" w:space="0" w:color="E3E3E4"/>
+            </w:tcBorders>
+          </w:tcPr>
+          <w:p>
+            <w:pPr>
+              <w:pStyle w:val="Normal"/>
+              <w:spacing w:lineRule="auto" w:line="240" w:before="0" w:after="0"/>
+              <w:jc w:val="left"/>
+              <w:rPr/>
+            </w:pPr>
+            <w:r>
+              <w:rPr>
+                <w:rFonts w:eastAsia="Times New Roman" w:cs="Times New Roman"/>
+                <w:sz w:val="17"/>
+              </w:rPr>
+              <w:t>13 indicators</w:t>
             </w:r>
           </w:p>
         </w:tc>
@@ -7885,7 +8157,7 @@
         <w:pStyle w:val="Heading1"/>
         <w:rPr/>
       </w:pPr>
-      <w:bookmarkStart w:id="7" w:name="__RefHeading___Toc10665_3479964216"/>
+      <w:bookmarkStart w:id="7" w:name="__RefHeading___Toc11795_1092322862"/>
       <w:bookmarkEnd w:id="7"/>
       <w:r>
         <w:rPr/>
@@ -8719,7 +8991,7 @@
                 <w:rFonts w:eastAsia="Times New Roman" w:cs="Times New Roman"/>
                 <w:sz w:val="19"/>
               </w:rPr>
-              <w:t>30</w:t>
+              <w:t>31</w:t>
             </w:r>
           </w:p>
         </w:tc>

</xml_diff>

<commit_message>
Update coverage checklist, gap analysis and README for round 2; complete translations
Co-Authored-By: Claude Opus 5.5 <noreply@anthropic.com>
Claude-Session: https://claude.ai/code/session_017KtXLt3mYH4XoBGFVP5Vh6
</commit_message>
<xml_diff>
--- a/cortexplm/docs/guides/CortexPLM_Coverage_Checklist.docx
+++ b/cortexplm/docs/guides/CortexPLM_Coverage_Checklist.docx
@@ -105,7 +105,7 @@
           <w:color w:val="808184"/>
           <w:sz w:val="22"/>
         </w:rPr>
-        <w:t>Version 1.0  ·  September 2026</w:t>
+        <w:t>Version 2.0  ·  September 2026</w:t>
       </w:r>
     </w:p>
     <w:p>
@@ -174,7 +174,7 @@
             </w:rPr>
             <w:fldChar w:fldCharType="separate"/>
           </w:r>
-          <w:hyperlink w:anchor="__RefHeading___Toc11781_1092322862">
+          <w:hyperlink w:anchor="__RefHeading___Toc1227_1420353814">
             <w:r>
               <w:rPr>
                 <w:webHidden/>
@@ -195,7 +195,7 @@
             </w:tabs>
             <w:rPr/>
           </w:pPr>
-          <w:hyperlink w:anchor="__RefHeading___Toc11783_1092322862">
+          <w:hyperlink w:anchor="__RefHeading___Toc1229_1420353814">
             <w:r>
               <w:rPr>
                 <w:webHidden/>
@@ -216,7 +216,7 @@
             </w:tabs>
             <w:rPr/>
           </w:pPr>
-          <w:hyperlink w:anchor="__RefHeading___Toc11785_1092322862">
+          <w:hyperlink w:anchor="__RefHeading___Toc1231_1420353814">
             <w:r>
               <w:rPr>
                 <w:webHidden/>
@@ -237,7 +237,7 @@
             </w:tabs>
             <w:rPr/>
           </w:pPr>
-          <w:hyperlink w:anchor="__RefHeading___Toc11787_1092322862">
+          <w:hyperlink w:anchor="__RefHeading___Toc1233_1420353814">
             <w:r>
               <w:rPr>
                 <w:webHidden/>
@@ -258,7 +258,7 @@
             </w:tabs>
             <w:rPr/>
           </w:pPr>
-          <w:hyperlink w:anchor="__RefHeading___Toc11789_1092322862">
+          <w:hyperlink w:anchor="__RefHeading___Toc1235_1420353814">
             <w:r>
               <w:rPr>
                 <w:webHidden/>
@@ -279,7 +279,7 @@
             </w:tabs>
             <w:rPr/>
           </w:pPr>
-          <w:hyperlink w:anchor="__RefHeading___Toc11791_1092322862">
+          <w:hyperlink w:anchor="__RefHeading___Toc1237_1420353814">
             <w:r>
               <w:rPr>
                 <w:webHidden/>
@@ -300,7 +300,7 @@
             </w:tabs>
             <w:rPr/>
           </w:pPr>
-          <w:hyperlink w:anchor="__RefHeading___Toc11793_1092322862">
+          <w:hyperlink w:anchor="__RefHeading___Toc1239_1420353814">
             <w:r>
               <w:rPr>
                 <w:webHidden/>
@@ -308,7 +308,7 @@
               </w:rPr>
               <w:t>7. Seed data requirement</w:t>
               <w:tab/>
-              <w:t>5</w:t>
+              <w:t>6</w:t>
             </w:r>
           </w:hyperlink>
         </w:p>
@@ -321,15 +321,36 @@
             </w:tabs>
             <w:rPr/>
           </w:pPr>
-          <w:hyperlink w:anchor="__RefHeading___Toc11795_1092322862">
+          <w:hyperlink w:anchor="__RefHeading___Toc1241_1420353814">
             <w:r>
               <w:rPr>
                 <w:webHidden/>
                 <w:rStyle w:val="IndexLink"/>
               </w:rPr>
-              <w:t>8. End-to-End Verification</w:t>
+              <w:t>8. Request of round 2</w:t>
               <w:tab/>
               <w:t>6</w:t>
+            </w:r>
+          </w:hyperlink>
+        </w:p>
+        <w:p>
+          <w:pPr>
+            <w:pStyle w:val="TOC1"/>
+            <w:tabs>
+              <w:tab w:val="clear" w:pos="9746"/>
+              <w:tab w:val="right" w:pos="9745" w:leader="dot"/>
+            </w:tabs>
+            <w:rPr/>
+          </w:pPr>
+          <w:hyperlink w:anchor="__RefHeading___Toc1243_1420353814">
+            <w:r>
+              <w:rPr>
+                <w:webHidden/>
+                <w:rStyle w:val="IndexLink"/>
+              </w:rPr>
+              <w:t>9. End-to-End Verification</w:t>
+              <w:tab/>
+              <w:t>7</w:t>
             </w:r>
           </w:hyperlink>
           <w:r>
@@ -371,7 +392,7 @@
         <w:spacing w:before="0" w:after="160"/>
         <w:rPr/>
       </w:pPr>
-      <w:bookmarkStart w:id="0" w:name="__RefHeading___Toc11781_1092322862"/>
+      <w:bookmarkStart w:id="0" w:name="__RefHeading___Toc1227_1420353814"/>
       <w:bookmarkEnd w:id="0"/>
       <w:r>
         <w:rPr/>
@@ -387,7 +408,7 @@
         <w:rPr>
           <w:rFonts w:eastAsia="Times New Roman" w:cs="Times New Roman"/>
         </w:rPr>
-        <w:t>41 of 43 content blocks of the five source documents and of the request are fully covered. The SRS blocks are marked Partial: 148 of 155 SRS requirements are met, and the remaining ones are listed with next steps in the SRS Gap Analysis. Counts come from the running application after a fresh demonstration seed.</w:t>
+        <w:t>55 of 57 content blocks of the five source documents and of the request are fully covered. The SRS blocks are marked Partial: 148 of 155 SRS requirements are met, and the remaining ones are listed with next steps in the SRS Gap Analysis. Counts come from the running application after a fresh demonstration seed.</w:t>
       </w:r>
     </w:p>
     <w:tbl>
@@ -968,6 +989,88 @@
                 <w:sz w:val="19"/>
               </w:rPr>
               <w:t>5</w:t>
+            </w:r>
+          </w:p>
+        </w:tc>
+        <w:tc>
+          <w:tcPr>
+            <w:tcW w:w="1973" w:type="dxa"/>
+            <w:tcBorders>
+              <w:top w:val="single" w:sz="4" w:space="0" w:color="E3E3E4"/>
+              <w:left w:val="single" w:sz="4" w:space="0" w:color="E3E3E4"/>
+              <w:bottom w:val="single" w:sz="4" w:space="0" w:color="E3E3E4"/>
+              <w:right w:val="single" w:sz="4" w:space="0" w:color="E3E3E4"/>
+            </w:tcBorders>
+            <w:shd w:color="auto" w:fill="D9EAD3" w:val="clear"/>
+          </w:tcPr>
+          <w:p>
+            <w:pPr>
+              <w:pStyle w:val="Normal"/>
+              <w:spacing w:lineRule="auto" w:line="240" w:before="0" w:after="0"/>
+              <w:jc w:val="left"/>
+              <w:rPr/>
+            </w:pPr>
+            <w:r>
+              <w:rPr>
+                <w:rFonts w:eastAsia="Times New Roman" w:cs="Times New Roman"/>
+                <w:sz w:val="19"/>
+              </w:rPr>
+              <w:t>Covered</w:t>
+            </w:r>
+          </w:p>
+        </w:tc>
+      </w:tr>
+      <w:tr>
+        <w:trPr/>
+        <w:tc>
+          <w:tcPr>
+            <w:tcW w:w="6480" w:type="dxa"/>
+            <w:tcBorders>
+              <w:top w:val="single" w:sz="4" w:space="0" w:color="E3E3E4"/>
+              <w:left w:val="single" w:sz="4" w:space="0" w:color="E3E3E4"/>
+              <w:bottom w:val="single" w:sz="4" w:space="0" w:color="E3E3E4"/>
+              <w:right w:val="single" w:sz="4" w:space="0" w:color="E3E3E4"/>
+            </w:tcBorders>
+          </w:tcPr>
+          <w:p>
+            <w:pPr>
+              <w:pStyle w:val="Normal"/>
+              <w:spacing w:lineRule="auto" w:line="240" w:before="0" w:after="0"/>
+              <w:jc w:val="left"/>
+              <w:rPr/>
+            </w:pPr>
+            <w:r>
+              <w:rPr>
+                <w:rFonts w:eastAsia="Times New Roman" w:cs="Times New Roman"/>
+                <w:sz w:val="19"/>
+              </w:rPr>
+              <w:t>Request of round 2</w:t>
+            </w:r>
+          </w:p>
+        </w:tc>
+        <w:tc>
+          <w:tcPr>
+            <w:tcW w:w="1295" w:type="dxa"/>
+            <w:tcBorders>
+              <w:top w:val="single" w:sz="4" w:space="0" w:color="E3E3E4"/>
+              <w:left w:val="single" w:sz="4" w:space="0" w:color="E3E3E4"/>
+              <w:bottom w:val="single" w:sz="4" w:space="0" w:color="E3E3E4"/>
+              <w:right w:val="single" w:sz="4" w:space="0" w:color="E3E3E4"/>
+            </w:tcBorders>
+          </w:tcPr>
+          <w:p>
+            <w:pPr>
+              <w:pStyle w:val="Normal"/>
+              <w:spacing w:lineRule="auto" w:line="240" w:before="0" w:after="0"/>
+              <w:jc w:val="left"/>
+              <w:rPr/>
+            </w:pPr>
+            <w:r>
+              <w:rPr>
+                <w:rFonts w:eastAsia="Times New Roman" w:cs="Times New Roman"/>
+                <w:sz w:val="19"/>
+              </w:rPr>
+              <w:t>14</w:t>
             </w:r>
           </w:p>
         </w:tc>
@@ -1079,7 +1182,7 @@
         <w:pStyle w:val="Heading1"/>
         <w:rPr/>
       </w:pPr>
-      <w:bookmarkStart w:id="1" w:name="__RefHeading___Toc11783_1092322862"/>
+      <w:bookmarkStart w:id="1" w:name="__RefHeading___Toc1229_1420353814"/>
       <w:bookmarkEnd w:id="1"/>
       <w:r>
         <w:rPr/>
@@ -2373,7 +2476,7 @@
         <w:pStyle w:val="Heading1"/>
         <w:rPr/>
       </w:pPr>
-      <w:bookmarkStart w:id="2" w:name="__RefHeading___Toc11785_1092322862"/>
+      <w:bookmarkStart w:id="2" w:name="__RefHeading___Toc1231_1420353814"/>
       <w:bookmarkEnd w:id="2"/>
       <w:r>
         <w:rPr/>
@@ -3075,7 +3178,7 @@
                 <w:rFonts w:eastAsia="Times New Roman" w:cs="Times New Roman"/>
                 <w:sz w:val="17"/>
               </w:rPr>
-              <w:t>64 / 64 / 64 / 64 / 64 / 64 / 64 per organization (60 reference + organization rules)</w:t>
+              <w:t>64 / 64 / 64 / 64 / 64 / 64 / 64 / 65 / 64 / 64 / 64 / 64 / 64 per organization (60 reference + organization rules)</w:t>
             </w:r>
           </w:p>
         </w:tc>
@@ -3347,7 +3450,7 @@
                 <w:rFonts w:eastAsia="Times New Roman" w:cs="Times New Roman"/>
                 <w:sz w:val="17"/>
               </w:rPr>
-              <w:t>58 / 53 / 59 / 53 / 54 / 57 / 57 per organization (47 reference + compliance starters)</w:t>
+              <w:t>58 / 53 / 59 / 53 / 54 / 57 / 57 / 51 / 50 / 50 / 50 / 50 / 50 per organization (47 reference + compliance starters)</w:t>
             </w:r>
           </w:p>
         </w:tc>
@@ -3481,7 +3584,7 @@
                 <w:rFonts w:eastAsia="Times New Roman" w:cs="Times New Roman"/>
                 <w:sz w:val="17"/>
               </w:rPr>
-              <w:t>50 / 48 / 50 / 48 / 49 / 48 / 48 per organization (27 reference + project risks)</w:t>
+              <w:t>50 / 48 / 50 / 48 / 49 / 48 / 48 / 33 / 32 / 32 / 32 / 32 / 32 per organization (27 reference + project risks)</w:t>
             </w:r>
           </w:p>
         </w:tc>
@@ -3619,7 +3722,7 @@
                 <w:rFonts w:eastAsia="Times New Roman" w:cs="Times New Roman"/>
                 <w:sz w:val="17"/>
               </w:rPr>
-              <w:t>38 / 38 / 38 / 38 / 38 / 38 / 38 per organization (38 of 38)</w:t>
+              <w:t>38 / 38 / 38 / 38 / 38 / 38 / 38 / 38 / 38 / 38 / 38 / 38 / 38 per organization (38 of 38)</w:t>
             </w:r>
           </w:p>
         </w:tc>
@@ -4297,7 +4400,7 @@
                 <w:rFonts w:eastAsia="Times New Roman" w:cs="Times New Roman"/>
                 <w:sz w:val="17"/>
               </w:rPr>
-              <w:t>23 / 23 / 23 / 23 / 23 / 23 / 23 per organization (23 of 23)</w:t>
+              <w:t>24 / 24 / 24 / 24 / 24 / 24 / 24 / 23 / 23 / 23 / 23 / 23 / 23 per organization (23 of 23)</w:t>
             </w:r>
           </w:p>
         </w:tc>
@@ -4617,7 +4720,7 @@
         <w:pStyle w:val="Heading1"/>
         <w:rPr/>
       </w:pPr>
-      <w:bookmarkStart w:id="3" w:name="__RefHeading___Toc11787_1092322862"/>
+      <w:bookmarkStart w:id="3" w:name="__RefHeading___Toc1233_1420353814"/>
       <w:bookmarkEnd w:id="3"/>
       <w:r>
         <w:rPr/>
@@ -5773,7 +5876,7 @@
         <w:pStyle w:val="Heading1"/>
         <w:rPr/>
       </w:pPr>
-      <w:bookmarkStart w:id="4" w:name="__RefHeading___Toc11789_1092322862"/>
+      <w:bookmarkStart w:id="4" w:name="__RefHeading___Toc1235_1420353814"/>
       <w:bookmarkEnd w:id="4"/>
       <w:r>
         <w:rPr/>
@@ -6523,7 +6626,7 @@
         <w:pStyle w:val="Heading1"/>
         <w:rPr/>
       </w:pPr>
-      <w:bookmarkStart w:id="5" w:name="__RefHeading___Toc11791_1092322862"/>
+      <w:bookmarkStart w:id="5" w:name="__RefHeading___Toc1237_1420353814"/>
       <w:bookmarkEnd w:id="5"/>
       <w:r>
         <w:rPr/>
@@ -6815,7 +6918,7 @@
                 <w:rFonts w:eastAsia="Times New Roman" w:cs="Times New Roman"/>
                 <w:sz w:val="17"/>
               </w:rPr>
-              <w:t>saas active 25/60 / saas active 24/40 / saas active 24/40 / saas active 24/30 / saas warning 24/30 / saas active 24/30 / saas active 24/40</w:t>
+              <w:t>saas active 25/60 / saas active 24/40 / saas active 24/40 / saas active 24/30 / saas warning 24/30 / saas active 24/30 / saas active 24/40 / saas active 25/25 / saas active 24/25 / saas active 24/25 / saas active 24/25 / saas active 24/25 / saas active 24/25</w:t>
             </w:r>
           </w:p>
         </w:tc>
@@ -7273,7 +7376,7 @@
         <w:pStyle w:val="Heading1"/>
         <w:rPr/>
       </w:pPr>
-      <w:bookmarkStart w:id="6" w:name="__RefHeading___Toc11793_1092322862"/>
+      <w:bookmarkStart w:id="6" w:name="__RefHeading___Toc1239_1420353814"/>
       <w:bookmarkEnd w:id="6"/>
       <w:r>
         <w:rPr/>
@@ -7487,7 +7590,7 @@
                 <w:rFonts w:eastAsia="Times New Roman" w:cs="Times New Roman"/>
                 <w:sz w:val="17"/>
               </w:rPr>
-              <w:t>Seven sectors: Public Sector, Manufacturing in Construction, Healthcare, Agro-Business – Dairy, Transportation, Oil/Gas/Energy, Construction</w:t>
+              <w:t>Seven sectors: Public Sector, Manufacturing, Healthcare, Agro-Business – Dairy, Transportation, Oil/Gas/Energy, Real Estate Development</w:t>
             </w:r>
           </w:p>
         </w:tc>
@@ -7565,7 +7668,7 @@
                 <w:rFonts w:eastAsia="Times New Roman" w:cs="Times New Roman"/>
                 <w:sz w:val="17"/>
               </w:rPr>
-              <w:t>Public Sector / Manufacturing in Construction / Healthcare / Agro-Business - Dairy Products / Transportation / Oil, Gas &amp; Energy / Construction</w:t>
+              <w:t>Public Sector / Manufacturing / Healthcare / Agro-Business - Dairy Products / Transportation / Oil, Gas &amp; Energy / Real Estate Development / Public Sector / Transportation / Agro-Business - Dairy Products / Healthcare / Oil, Gas &amp; Energy / Real Estate Development</w:t>
             </w:r>
           </w:p>
         </w:tc>
@@ -7676,7 +7779,7 @@
                 <w:rFonts w:eastAsia="Times New Roman" w:cs="Times New Roman"/>
                 <w:sz w:val="17"/>
               </w:rPr>
-              <w:t>Administration &gt; Organizations &amp; OBS</w:t>
+              <w:t>Portfolio &gt; Groups, organizations &amp; projects</w:t>
             </w:r>
           </w:p>
         </w:tc>
@@ -7811,7 +7914,7 @@
                 <w:rFonts w:eastAsia="Times New Roman" w:cs="Times New Roman"/>
                 <w:sz w:val="17"/>
               </w:rPr>
-              <w:t>Reports &gt; Benchmarking</w:t>
+              <w:t>Portfolio &gt; Benchmarking</w:t>
             </w:r>
           </w:p>
         </w:tc>
@@ -8157,11 +8260,11 @@
         <w:pStyle w:val="Heading1"/>
         <w:rPr/>
       </w:pPr>
-      <w:bookmarkStart w:id="7" w:name="__RefHeading___Toc11795_1092322862"/>
+      <w:bookmarkStart w:id="7" w:name="__RefHeading___Toc1241_1420353814"/>
       <w:bookmarkEnd w:id="7"/>
       <w:r>
         <w:rPr/>
-        <w:t>8. End-to-End Verification</w:t>
+        <w:t>8. Request of round 2</w:t>
       </w:r>
     </w:p>
     <w:p>
@@ -8173,7 +8276,7 @@
         <w:rPr>
           <w:rFonts w:eastAsia="Times New Roman" w:cs="Times New Roman"/>
         </w:rPr>
-        <w:t>The five User Guide runs were replayed through the application on a fresh database. Each one ran to the end state below.</w:t>
+        <w:t>Source file: tenancy, portfolio, checklists, attachments, AI, BPMN</w:t>
       </w:r>
     </w:p>
     <w:tbl>
@@ -8191,11 +8294,11 @@
         <w:tblLook w:val="04a0" w:noHBand="0" w:noVBand="1" w:firstColumn="1" w:lastRow="0" w:lastColumn="0" w:firstRow="1"/>
       </w:tblPr>
       <w:tblGrid>
-        <w:gridCol w:w="719"/>
-        <w:gridCol w:w="4176"/>
-        <w:gridCol w:w="1152"/>
-        <w:gridCol w:w="1008"/>
-        <w:gridCol w:w="2693"/>
+        <w:gridCol w:w="2591"/>
+        <w:gridCol w:w="2737"/>
+        <w:gridCol w:w="1944"/>
+        <w:gridCol w:w="1584"/>
+        <w:gridCol w:w="892"/>
       </w:tblGrid>
       <w:tr>
         <w:trPr>
@@ -8203,7 +8306,2118 @@
         </w:trPr>
         <w:tc>
           <w:tcPr>
-            <w:tcW w:w="719" w:type="dxa"/>
+            <w:tcW w:w="2591" w:type="dxa"/>
+            <w:tcBorders>
+              <w:top w:val="single" w:sz="4" w:space="0" w:color="E3E3E4"/>
+              <w:left w:val="single" w:sz="4" w:space="0" w:color="E3E3E4"/>
+              <w:bottom w:val="single" w:sz="4" w:space="0" w:color="E3E3E4"/>
+              <w:right w:val="single" w:sz="4" w:space="0" w:color="E3E3E4"/>
+            </w:tcBorders>
+            <w:shd w:color="auto" w:fill="F8931D" w:val="clear"/>
+          </w:tcPr>
+          <w:p>
+            <w:pPr>
+              <w:pStyle w:val="Normal"/>
+              <w:spacing w:before="0" w:after="120"/>
+              <w:jc w:val="left"/>
+              <w:rPr/>
+            </w:pPr>
+            <w:r>
+              <w:rPr>
+                <w:rFonts w:eastAsia="Times New Roman" w:cs="Times New Roman"/>
+                <w:b/>
+                <w:color w:val="FFFFFF"/>
+                <w:sz w:val="17"/>
+              </w:rPr>
+              <w:t>Source content</w:t>
+            </w:r>
+          </w:p>
+        </w:tc>
+        <w:tc>
+          <w:tcPr>
+            <w:tcW w:w="2737" w:type="dxa"/>
+            <w:tcBorders>
+              <w:top w:val="single" w:sz="4" w:space="0" w:color="E3E3E4"/>
+              <w:left w:val="single" w:sz="4" w:space="0" w:color="E3E3E4"/>
+              <w:bottom w:val="single" w:sz="4" w:space="0" w:color="E3E3E4"/>
+              <w:right w:val="single" w:sz="4" w:space="0" w:color="E3E3E4"/>
+            </w:tcBorders>
+            <w:shd w:color="auto" w:fill="F8931D" w:val="clear"/>
+          </w:tcPr>
+          <w:p>
+            <w:pPr>
+              <w:pStyle w:val="Normal"/>
+              <w:spacing w:before="0" w:after="120"/>
+              <w:jc w:val="left"/>
+              <w:rPr/>
+            </w:pPr>
+            <w:r>
+              <w:rPr>
+                <w:rFonts w:eastAsia="Times New Roman" w:cs="Times New Roman"/>
+                <w:b/>
+                <w:color w:val="FFFFFF"/>
+                <w:sz w:val="17"/>
+              </w:rPr>
+              <w:t>Implemented as</w:t>
+            </w:r>
+          </w:p>
+        </w:tc>
+        <w:tc>
+          <w:tcPr>
+            <w:tcW w:w="1944" w:type="dxa"/>
+            <w:tcBorders>
+              <w:top w:val="single" w:sz="4" w:space="0" w:color="E3E3E4"/>
+              <w:left w:val="single" w:sz="4" w:space="0" w:color="E3E3E4"/>
+              <w:bottom w:val="single" w:sz="4" w:space="0" w:color="E3E3E4"/>
+              <w:right w:val="single" w:sz="4" w:space="0" w:color="E3E3E4"/>
+            </w:tcBorders>
+            <w:shd w:color="auto" w:fill="F8931D" w:val="clear"/>
+          </w:tcPr>
+          <w:p>
+            <w:pPr>
+              <w:pStyle w:val="Normal"/>
+              <w:spacing w:before="0" w:after="120"/>
+              <w:jc w:val="left"/>
+              <w:rPr/>
+            </w:pPr>
+            <w:r>
+              <w:rPr>
+                <w:rFonts w:eastAsia="Times New Roman" w:cs="Times New Roman"/>
+                <w:b/>
+                <w:color w:val="FFFFFF"/>
+                <w:sz w:val="17"/>
+              </w:rPr>
+              <w:t>Where to see it</w:t>
+            </w:r>
+          </w:p>
+        </w:tc>
+        <w:tc>
+          <w:tcPr>
+            <w:tcW w:w="1584" w:type="dxa"/>
+            <w:tcBorders>
+              <w:top w:val="single" w:sz="4" w:space="0" w:color="E3E3E4"/>
+              <w:left w:val="single" w:sz="4" w:space="0" w:color="E3E3E4"/>
+              <w:bottom w:val="single" w:sz="4" w:space="0" w:color="E3E3E4"/>
+              <w:right w:val="single" w:sz="4" w:space="0" w:color="E3E3E4"/>
+            </w:tcBorders>
+            <w:shd w:color="auto" w:fill="F8931D" w:val="clear"/>
+          </w:tcPr>
+          <w:p>
+            <w:pPr>
+              <w:pStyle w:val="Normal"/>
+              <w:spacing w:before="0" w:after="120"/>
+              <w:jc w:val="left"/>
+              <w:rPr/>
+            </w:pPr>
+            <w:r>
+              <w:rPr>
+                <w:rFonts w:eastAsia="Times New Roman" w:cs="Times New Roman"/>
+                <w:b/>
+                <w:color w:val="FFFFFF"/>
+                <w:sz w:val="17"/>
+              </w:rPr>
+              <w:t>Measured</w:t>
+            </w:r>
+          </w:p>
+        </w:tc>
+        <w:tc>
+          <w:tcPr>
+            <w:tcW w:w="892" w:type="dxa"/>
+            <w:tcBorders>
+              <w:top w:val="single" w:sz="4" w:space="0" w:color="E3E3E4"/>
+              <w:left w:val="single" w:sz="4" w:space="0" w:color="E3E3E4"/>
+              <w:bottom w:val="single" w:sz="4" w:space="0" w:color="E3E3E4"/>
+              <w:right w:val="single" w:sz="4" w:space="0" w:color="E3E3E4"/>
+            </w:tcBorders>
+            <w:shd w:color="auto" w:fill="F8931D" w:val="clear"/>
+          </w:tcPr>
+          <w:p>
+            <w:pPr>
+              <w:pStyle w:val="Normal"/>
+              <w:spacing w:before="0" w:after="120"/>
+              <w:jc w:val="left"/>
+              <w:rPr/>
+            </w:pPr>
+            <w:r>
+              <w:rPr>
+                <w:rFonts w:eastAsia="Times New Roman" w:cs="Times New Roman"/>
+                <w:b/>
+                <w:color w:val="FFFFFF"/>
+                <w:sz w:val="17"/>
+              </w:rPr>
+              <w:t>Status</w:t>
+            </w:r>
+          </w:p>
+        </w:tc>
+      </w:tr>
+      <w:tr>
+        <w:trPr/>
+        <w:tc>
+          <w:tcPr>
+            <w:tcW w:w="2591" w:type="dxa"/>
+            <w:tcBorders>
+              <w:top w:val="single" w:sz="4" w:space="0" w:color="E3E3E4"/>
+              <w:left w:val="single" w:sz="4" w:space="0" w:color="E3E3E4"/>
+              <w:bottom w:val="single" w:sz="4" w:space="0" w:color="E3E3E4"/>
+              <w:right w:val="single" w:sz="4" w:space="0" w:color="E3E3E4"/>
+            </w:tcBorders>
+          </w:tcPr>
+          <w:p>
+            <w:pPr>
+              <w:pStyle w:val="Normal"/>
+              <w:spacing w:lineRule="auto" w:line="240" w:before="0" w:after="0"/>
+              <w:jc w:val="left"/>
+              <w:rPr/>
+            </w:pPr>
+            <w:r>
+              <w:rPr>
+                <w:rFonts w:eastAsia="Times New Roman" w:cs="Times New Roman"/>
+                <w:sz w:val="17"/>
+              </w:rPr>
+              <w:t>Tenancy: Group (Yes, No), Organization, Projects; projects created and linked to an organization</w:t>
+            </w:r>
+          </w:p>
+        </w:tc>
+        <w:tc>
+          <w:tcPr>
+            <w:tcW w:w="2737" w:type="dxa"/>
+            <w:tcBorders>
+              <w:top w:val="single" w:sz="4" w:space="0" w:color="E3E3E4"/>
+              <w:left w:val="single" w:sz="4" w:space="0" w:color="E3E3E4"/>
+              <w:bottom w:val="single" w:sz="4" w:space="0" w:color="E3E3E4"/>
+              <w:right w:val="single" w:sz="4" w:space="0" w:color="E3E3E4"/>
+            </w:tcBorders>
+          </w:tcPr>
+          <w:p>
+            <w:pPr>
+              <w:pStyle w:val="Normal"/>
+              <w:spacing w:lineRule="auto" w:line="240" w:before="0" w:after="0"/>
+              <w:jc w:val="left"/>
+              <w:rPr/>
+            </w:pPr>
+            <w:r>
+              <w:rPr>
+                <w:rFonts w:eastAsia="Times New Roman" w:cs="Times New Roman"/>
+                <w:sz w:val="17"/>
+              </w:rPr>
+              <w:t>Tree and table Group (Yes/No) &gt; Organization &gt; Projects; Add group; Add organization with Group Yes/No and starting team; New project with an Organization step</w:t>
+            </w:r>
+          </w:p>
+        </w:tc>
+        <w:tc>
+          <w:tcPr>
+            <w:tcW w:w="1944" w:type="dxa"/>
+            <w:tcBorders>
+              <w:top w:val="single" w:sz="4" w:space="0" w:color="E3E3E4"/>
+              <w:left w:val="single" w:sz="4" w:space="0" w:color="E3E3E4"/>
+              <w:bottom w:val="single" w:sz="4" w:space="0" w:color="E3E3E4"/>
+              <w:right w:val="single" w:sz="4" w:space="0" w:color="E3E3E4"/>
+            </w:tcBorders>
+          </w:tcPr>
+          <w:p>
+            <w:pPr>
+              <w:pStyle w:val="Normal"/>
+              <w:spacing w:lineRule="auto" w:line="240" w:before="0" w:after="0"/>
+              <w:jc w:val="left"/>
+              <w:rPr/>
+            </w:pPr>
+            <w:r>
+              <w:rPr>
+                <w:rFonts w:eastAsia="Times New Roman" w:cs="Times New Roman"/>
+                <w:sz w:val="17"/>
+              </w:rPr>
+              <w:t>Portfolio &gt; Groups, organizations &amp; projects</w:t>
+            </w:r>
+          </w:p>
+        </w:tc>
+        <w:tc>
+          <w:tcPr>
+            <w:tcW w:w="1584" w:type="dxa"/>
+            <w:tcBorders>
+              <w:top w:val="single" w:sz="4" w:space="0" w:color="E3E3E4"/>
+              <w:left w:val="single" w:sz="4" w:space="0" w:color="E3E3E4"/>
+              <w:bottom w:val="single" w:sz="4" w:space="0" w:color="E3E3E4"/>
+              <w:right w:val="single" w:sz="4" w:space="0" w:color="E3E3E4"/>
+            </w:tcBorders>
+          </w:tcPr>
+          <w:p>
+            <w:pPr>
+              <w:pStyle w:val="Normal"/>
+              <w:spacing w:lineRule="auto" w:line="240" w:before="0" w:after="0"/>
+              <w:jc w:val="left"/>
+              <w:rPr/>
+            </w:pPr>
+            <w:r>
+              <w:rPr>
+                <w:rFonts w:eastAsia="Times New Roman" w:cs="Times New Roman"/>
+                <w:sz w:val="17"/>
+              </w:rPr>
+              <w:t>2 groups, 7 organizations, 147 projects</w:t>
+            </w:r>
+          </w:p>
+        </w:tc>
+        <w:tc>
+          <w:tcPr>
+            <w:tcW w:w="892" w:type="dxa"/>
+            <w:tcBorders>
+              <w:top w:val="single" w:sz="4" w:space="0" w:color="E3E3E4"/>
+              <w:left w:val="single" w:sz="4" w:space="0" w:color="E3E3E4"/>
+              <w:bottom w:val="single" w:sz="4" w:space="0" w:color="E3E3E4"/>
+              <w:right w:val="single" w:sz="4" w:space="0" w:color="E3E3E4"/>
+            </w:tcBorders>
+            <w:shd w:color="auto" w:fill="D9EAD3" w:val="clear"/>
+          </w:tcPr>
+          <w:p>
+            <w:pPr>
+              <w:pStyle w:val="Normal"/>
+              <w:spacing w:lineRule="auto" w:line="240" w:before="0" w:after="0"/>
+              <w:jc w:val="left"/>
+              <w:rPr/>
+            </w:pPr>
+            <w:r>
+              <w:rPr>
+                <w:rFonts w:eastAsia="Times New Roman" w:cs="Times New Roman"/>
+                <w:sz w:val="17"/>
+              </w:rPr>
+              <w:t>Covered</w:t>
+            </w:r>
+          </w:p>
+        </w:tc>
+      </w:tr>
+      <w:tr>
+        <w:trPr/>
+        <w:tc>
+          <w:tcPr>
+            <w:tcW w:w="2591" w:type="dxa"/>
+            <w:tcBorders>
+              <w:top w:val="single" w:sz="4" w:space="0" w:color="E3E3E4"/>
+              <w:left w:val="single" w:sz="4" w:space="0" w:color="E3E3E4"/>
+              <w:bottom w:val="single" w:sz="4" w:space="0" w:color="E3E3E4"/>
+              <w:right w:val="single" w:sz="4" w:space="0" w:color="E3E3E4"/>
+            </w:tcBorders>
+            <w:shd w:color="auto" w:fill="F2F2F3" w:val="clear"/>
+          </w:tcPr>
+          <w:p>
+            <w:pPr>
+              <w:pStyle w:val="Normal"/>
+              <w:spacing w:lineRule="auto" w:line="240" w:before="0" w:after="0"/>
+              <w:jc w:val="left"/>
+              <w:rPr/>
+            </w:pPr>
+            <w:r>
+              <w:rPr>
+                <w:rFonts w:eastAsia="Times New Roman" w:cs="Times New Roman"/>
+                <w:sz w:val="17"/>
+              </w:rPr>
+              <w:t>See all seeded groups, organizations and projects</w:t>
+            </w:r>
+          </w:p>
+        </w:tc>
+        <w:tc>
+          <w:tcPr>
+            <w:tcW w:w="2737" w:type="dxa"/>
+            <w:tcBorders>
+              <w:top w:val="single" w:sz="4" w:space="0" w:color="E3E3E4"/>
+              <w:left w:val="single" w:sz="4" w:space="0" w:color="E3E3E4"/>
+              <w:bottom w:val="single" w:sz="4" w:space="0" w:color="E3E3E4"/>
+              <w:right w:val="single" w:sz="4" w:space="0" w:color="E3E3E4"/>
+            </w:tcBorders>
+            <w:shd w:color="auto" w:fill="F2F2F3" w:val="clear"/>
+          </w:tcPr>
+          <w:p>
+            <w:pPr>
+              <w:pStyle w:val="Normal"/>
+              <w:spacing w:lineRule="auto" w:line="240" w:before="0" w:after="0"/>
+              <w:jc w:val="left"/>
+              <w:rPr/>
+            </w:pPr>
+            <w:r>
+              <w:rPr>
+                <w:rFonts w:eastAsia="Times New Roman" w:cs="Times New Roman"/>
+                <w:sz w:val="17"/>
+              </w:rPr>
+              <w:t>Platform administrator sees everything; group executives see their group read-only</w:t>
+            </w:r>
+          </w:p>
+        </w:tc>
+        <w:tc>
+          <w:tcPr>
+            <w:tcW w:w="1944" w:type="dxa"/>
+            <w:tcBorders>
+              <w:top w:val="single" w:sz="4" w:space="0" w:color="E3E3E4"/>
+              <w:left w:val="single" w:sz="4" w:space="0" w:color="E3E3E4"/>
+              <w:bottom w:val="single" w:sz="4" w:space="0" w:color="E3E3E4"/>
+              <w:right w:val="single" w:sz="4" w:space="0" w:color="E3E3E4"/>
+            </w:tcBorders>
+            <w:shd w:color="auto" w:fill="F2F2F3" w:val="clear"/>
+          </w:tcPr>
+          <w:p>
+            <w:pPr>
+              <w:pStyle w:val="Normal"/>
+              <w:spacing w:lineRule="auto" w:line="240" w:before="0" w:after="0"/>
+              <w:jc w:val="left"/>
+              <w:rPr/>
+            </w:pPr>
+            <w:r>
+              <w:rPr>
+                <w:rFonts w:eastAsia="Times New Roman" w:cs="Times New Roman"/>
+                <w:sz w:val="17"/>
+              </w:rPr>
+              <w:t>Same screen</w:t>
+            </w:r>
+          </w:p>
+        </w:tc>
+        <w:tc>
+          <w:tcPr>
+            <w:tcW w:w="1584" w:type="dxa"/>
+            <w:tcBorders>
+              <w:top w:val="single" w:sz="4" w:space="0" w:color="E3E3E4"/>
+              <w:left w:val="single" w:sz="4" w:space="0" w:color="E3E3E4"/>
+              <w:bottom w:val="single" w:sz="4" w:space="0" w:color="E3E3E4"/>
+              <w:right w:val="single" w:sz="4" w:space="0" w:color="E3E3E4"/>
+            </w:tcBorders>
+            <w:shd w:color="auto" w:fill="F2F2F3" w:val="clear"/>
+          </w:tcPr>
+          <w:p>
+            <w:pPr>
+              <w:pStyle w:val="Normal"/>
+              <w:spacing w:lineRule="auto" w:line="240" w:before="0" w:after="0"/>
+              <w:jc w:val="left"/>
+              <w:rPr/>
+            </w:pPr>
+            <w:r>
+              <w:rPr>
+                <w:rFonts w:eastAsia="Times New Roman" w:cs="Times New Roman"/>
+                <w:sz w:val="17"/>
+              </w:rPr>
+              <w:t>Automated tests</w:t>
+            </w:r>
+          </w:p>
+        </w:tc>
+        <w:tc>
+          <w:tcPr>
+            <w:tcW w:w="892" w:type="dxa"/>
+            <w:tcBorders>
+              <w:top w:val="single" w:sz="4" w:space="0" w:color="E3E3E4"/>
+              <w:left w:val="single" w:sz="4" w:space="0" w:color="E3E3E4"/>
+              <w:bottom w:val="single" w:sz="4" w:space="0" w:color="E3E3E4"/>
+              <w:right w:val="single" w:sz="4" w:space="0" w:color="E3E3E4"/>
+            </w:tcBorders>
+            <w:shd w:color="auto" w:fill="D9EAD3" w:val="clear"/>
+          </w:tcPr>
+          <w:p>
+            <w:pPr>
+              <w:pStyle w:val="Normal"/>
+              <w:spacing w:lineRule="auto" w:line="240" w:before="0" w:after="0"/>
+              <w:jc w:val="left"/>
+              <w:rPr/>
+            </w:pPr>
+            <w:r>
+              <w:rPr>
+                <w:rFonts w:eastAsia="Times New Roman" w:cs="Times New Roman"/>
+                <w:sz w:val="17"/>
+              </w:rPr>
+              <w:t>Covered</w:t>
+            </w:r>
+          </w:p>
+        </w:tc>
+      </w:tr>
+      <w:tr>
+        <w:trPr/>
+        <w:tc>
+          <w:tcPr>
+            <w:tcW w:w="2591" w:type="dxa"/>
+            <w:tcBorders>
+              <w:top w:val="single" w:sz="4" w:space="0" w:color="E3E3E4"/>
+              <w:left w:val="single" w:sz="4" w:space="0" w:color="E3E3E4"/>
+              <w:bottom w:val="single" w:sz="4" w:space="0" w:color="E3E3E4"/>
+              <w:right w:val="single" w:sz="4" w:space="0" w:color="E3E3E4"/>
+            </w:tcBorders>
+          </w:tcPr>
+          <w:p>
+            <w:pPr>
+              <w:pStyle w:val="Normal"/>
+              <w:spacing w:lineRule="auto" w:line="240" w:before="0" w:after="0"/>
+              <w:jc w:val="left"/>
+              <w:rPr/>
+            </w:pPr>
+            <w:r>
+              <w:rPr>
+                <w:rFonts w:eastAsia="Times New Roman" w:cs="Times New Roman"/>
+                <w:sz w:val="17"/>
+              </w:rPr>
+              <w:t>Seed the OBS of all projects, with roles</w:t>
+            </w:r>
+          </w:p>
+        </w:tc>
+        <w:tc>
+          <w:tcPr>
+            <w:tcW w:w="2737" w:type="dxa"/>
+            <w:tcBorders>
+              <w:top w:val="single" w:sz="4" w:space="0" w:color="E3E3E4"/>
+              <w:left w:val="single" w:sz="4" w:space="0" w:color="E3E3E4"/>
+              <w:bottom w:val="single" w:sz="4" w:space="0" w:color="E3E3E4"/>
+              <w:right w:val="single" w:sz="4" w:space="0" w:color="E3E3E4"/>
+            </w:tcBorders>
+          </w:tcPr>
+          <w:p>
+            <w:pPr>
+              <w:pStyle w:val="Normal"/>
+              <w:spacing w:lineRule="auto" w:line="240" w:before="0" w:after="0"/>
+              <w:jc w:val="left"/>
+              <w:rPr/>
+            </w:pPr>
+            <w:r>
+              <w:rPr>
+                <w:rFonts w:eastAsia="Times New Roman" w:cs="Times New Roman"/>
+                <w:sz w:val="17"/>
+              </w:rPr>
+              <w:t>One team tree per project (steering committee, project management, delivery teams) and department members</w:t>
+            </w:r>
+          </w:p>
+        </w:tc>
+        <w:tc>
+          <w:tcPr>
+            <w:tcW w:w="1944" w:type="dxa"/>
+            <w:tcBorders>
+              <w:top w:val="single" w:sz="4" w:space="0" w:color="E3E3E4"/>
+              <w:left w:val="single" w:sz="4" w:space="0" w:color="E3E3E4"/>
+              <w:bottom w:val="single" w:sz="4" w:space="0" w:color="E3E3E4"/>
+              <w:right w:val="single" w:sz="4" w:space="0" w:color="E3E3E4"/>
+            </w:tcBorders>
+          </w:tcPr>
+          <w:p>
+            <w:pPr>
+              <w:pStyle w:val="Normal"/>
+              <w:spacing w:lineRule="auto" w:line="240" w:before="0" w:after="0"/>
+              <w:jc w:val="left"/>
+              <w:rPr/>
+            </w:pPr>
+            <w:r>
+              <w:rPr>
+                <w:rFonts w:eastAsia="Times New Roman" w:cs="Times New Roman"/>
+                <w:sz w:val="17"/>
+              </w:rPr>
+              <w:t>Administration &gt; Organizations, OBS &amp; teams</w:t>
+            </w:r>
+          </w:p>
+        </w:tc>
+        <w:tc>
+          <w:tcPr>
+            <w:tcW w:w="1584" w:type="dxa"/>
+            <w:tcBorders>
+              <w:top w:val="single" w:sz="4" w:space="0" w:color="E3E3E4"/>
+              <w:left w:val="single" w:sz="4" w:space="0" w:color="E3E3E4"/>
+              <w:bottom w:val="single" w:sz="4" w:space="0" w:color="E3E3E4"/>
+              <w:right w:val="single" w:sz="4" w:space="0" w:color="E3E3E4"/>
+            </w:tcBorders>
+          </w:tcPr>
+          <w:p>
+            <w:pPr>
+              <w:pStyle w:val="Normal"/>
+              <w:spacing w:lineRule="auto" w:line="240" w:before="0" w:after="0"/>
+              <w:jc w:val="left"/>
+              <w:rPr/>
+            </w:pPr>
+            <w:r>
+              <w:rPr>
+                <w:rFonts w:eastAsia="Times New Roman" w:cs="Times New Roman"/>
+                <w:sz w:val="17"/>
+              </w:rPr>
+              <w:t>147 trees, 2,400+ placements</w:t>
+            </w:r>
+          </w:p>
+        </w:tc>
+        <w:tc>
+          <w:tcPr>
+            <w:tcW w:w="892" w:type="dxa"/>
+            <w:tcBorders>
+              <w:top w:val="single" w:sz="4" w:space="0" w:color="E3E3E4"/>
+              <w:left w:val="single" w:sz="4" w:space="0" w:color="E3E3E4"/>
+              <w:bottom w:val="single" w:sz="4" w:space="0" w:color="E3E3E4"/>
+              <w:right w:val="single" w:sz="4" w:space="0" w:color="E3E3E4"/>
+            </w:tcBorders>
+            <w:shd w:color="auto" w:fill="D9EAD3" w:val="clear"/>
+          </w:tcPr>
+          <w:p>
+            <w:pPr>
+              <w:pStyle w:val="Normal"/>
+              <w:spacing w:lineRule="auto" w:line="240" w:before="0" w:after="0"/>
+              <w:jc w:val="left"/>
+              <w:rPr/>
+            </w:pPr>
+            <w:r>
+              <w:rPr>
+                <w:rFonts w:eastAsia="Times New Roman" w:cs="Times New Roman"/>
+                <w:sz w:val="17"/>
+              </w:rPr>
+              <w:t>Covered</w:t>
+            </w:r>
+          </w:p>
+        </w:tc>
+      </w:tr>
+      <w:tr>
+        <w:trPr/>
+        <w:tc>
+          <w:tcPr>
+            <w:tcW w:w="2591" w:type="dxa"/>
+            <w:tcBorders>
+              <w:top w:val="single" w:sz="4" w:space="0" w:color="E3E3E4"/>
+              <w:left w:val="single" w:sz="4" w:space="0" w:color="E3E3E4"/>
+              <w:bottom w:val="single" w:sz="4" w:space="0" w:color="E3E3E4"/>
+              <w:right w:val="single" w:sz="4" w:space="0" w:color="E3E3E4"/>
+            </w:tcBorders>
+            <w:shd w:color="auto" w:fill="F2F2F3" w:val="clear"/>
+          </w:tcPr>
+          <w:p>
+            <w:pPr>
+              <w:pStyle w:val="Normal"/>
+              <w:spacing w:lineRule="auto" w:line="240" w:before="0" w:after="0"/>
+              <w:jc w:val="left"/>
+              <w:rPr/>
+            </w:pPr>
+            <w:r>
+              <w:rPr>
+                <w:rFonts w:eastAsia="Times New Roman" w:cs="Times New Roman"/>
+                <w:sz w:val="17"/>
+              </w:rPr>
+              <w:t>Configure the LLM: provider and model drop-down with a custom choice</w:t>
+            </w:r>
+          </w:p>
+        </w:tc>
+        <w:tc>
+          <w:tcPr>
+            <w:tcW w:w="2737" w:type="dxa"/>
+            <w:tcBorders>
+              <w:top w:val="single" w:sz="4" w:space="0" w:color="E3E3E4"/>
+              <w:left w:val="single" w:sz="4" w:space="0" w:color="E3E3E4"/>
+              <w:bottom w:val="single" w:sz="4" w:space="0" w:color="E3E3E4"/>
+              <w:right w:val="single" w:sz="4" w:space="0" w:color="E3E3E4"/>
+            </w:tcBorders>
+            <w:shd w:color="auto" w:fill="F2F2F3" w:val="clear"/>
+          </w:tcPr>
+          <w:p>
+            <w:pPr>
+              <w:pStyle w:val="Normal"/>
+              <w:spacing w:lineRule="auto" w:line="240" w:before="0" w:after="0"/>
+              <w:jc w:val="left"/>
+              <w:rPr/>
+            </w:pPr>
+            <w:r>
+              <w:rPr>
+                <w:rFonts w:eastAsia="Times New Roman" w:cs="Times New Roman"/>
+                <w:sz w:val="17"/>
+              </w:rPr>
+              <w:t>Provider list, model list, Custom model, custom endpoint, Test connection</w:t>
+            </w:r>
+          </w:p>
+        </w:tc>
+        <w:tc>
+          <w:tcPr>
+            <w:tcW w:w="1944" w:type="dxa"/>
+            <w:tcBorders>
+              <w:top w:val="single" w:sz="4" w:space="0" w:color="E3E3E4"/>
+              <w:left w:val="single" w:sz="4" w:space="0" w:color="E3E3E4"/>
+              <w:bottom w:val="single" w:sz="4" w:space="0" w:color="E3E3E4"/>
+              <w:right w:val="single" w:sz="4" w:space="0" w:color="E3E3E4"/>
+            </w:tcBorders>
+            <w:shd w:color="auto" w:fill="F2F2F3" w:val="clear"/>
+          </w:tcPr>
+          <w:p>
+            <w:pPr>
+              <w:pStyle w:val="Normal"/>
+              <w:spacing w:lineRule="auto" w:line="240" w:before="0" w:after="0"/>
+              <w:jc w:val="left"/>
+              <w:rPr/>
+            </w:pPr>
+            <w:r>
+              <w:rPr>
+                <w:rFonts w:eastAsia="Times New Roman" w:cs="Times New Roman"/>
+                <w:sz w:val="17"/>
+              </w:rPr>
+              <w:t>Settings; Administration &gt; Configuration &amp; AI model</w:t>
+            </w:r>
+          </w:p>
+        </w:tc>
+        <w:tc>
+          <w:tcPr>
+            <w:tcW w:w="1584" w:type="dxa"/>
+            <w:tcBorders>
+              <w:top w:val="single" w:sz="4" w:space="0" w:color="E3E3E4"/>
+              <w:left w:val="single" w:sz="4" w:space="0" w:color="E3E3E4"/>
+              <w:bottom w:val="single" w:sz="4" w:space="0" w:color="E3E3E4"/>
+              <w:right w:val="single" w:sz="4" w:space="0" w:color="E3E3E4"/>
+            </w:tcBorders>
+            <w:shd w:color="auto" w:fill="F2F2F3" w:val="clear"/>
+          </w:tcPr>
+          <w:p>
+            <w:pPr>
+              <w:pStyle w:val="Normal"/>
+              <w:spacing w:lineRule="auto" w:line="240" w:before="0" w:after="0"/>
+              <w:jc w:val="left"/>
+              <w:rPr/>
+            </w:pPr>
+            <w:r>
+              <w:rPr>
+                <w:rFonts w:eastAsia="Times New Roman" w:cs="Times New Roman"/>
+                <w:sz w:val="17"/>
+              </w:rPr>
+              <w:t>5 models + custom</w:t>
+            </w:r>
+          </w:p>
+        </w:tc>
+        <w:tc>
+          <w:tcPr>
+            <w:tcW w:w="892" w:type="dxa"/>
+            <w:tcBorders>
+              <w:top w:val="single" w:sz="4" w:space="0" w:color="E3E3E4"/>
+              <w:left w:val="single" w:sz="4" w:space="0" w:color="E3E3E4"/>
+              <w:bottom w:val="single" w:sz="4" w:space="0" w:color="E3E3E4"/>
+              <w:right w:val="single" w:sz="4" w:space="0" w:color="E3E3E4"/>
+            </w:tcBorders>
+            <w:shd w:color="auto" w:fill="D9EAD3" w:val="clear"/>
+          </w:tcPr>
+          <w:p>
+            <w:pPr>
+              <w:pStyle w:val="Normal"/>
+              <w:spacing w:lineRule="auto" w:line="240" w:before="0" w:after="0"/>
+              <w:jc w:val="left"/>
+              <w:rPr/>
+            </w:pPr>
+            <w:r>
+              <w:rPr>
+                <w:rFonts w:eastAsia="Times New Roman" w:cs="Times New Roman"/>
+                <w:sz w:val="17"/>
+              </w:rPr>
+              <w:t>Covered</w:t>
+            </w:r>
+          </w:p>
+        </w:tc>
+      </w:tr>
+      <w:tr>
+        <w:trPr/>
+        <w:tc>
+          <w:tcPr>
+            <w:tcW w:w="2591" w:type="dxa"/>
+            <w:tcBorders>
+              <w:top w:val="single" w:sz="4" w:space="0" w:color="E3E3E4"/>
+              <w:left w:val="single" w:sz="4" w:space="0" w:color="E3E3E4"/>
+              <w:bottom w:val="single" w:sz="4" w:space="0" w:color="E3E3E4"/>
+              <w:right w:val="single" w:sz="4" w:space="0" w:color="E3E3E4"/>
+            </w:tcBorders>
+          </w:tcPr>
+          <w:p>
+            <w:pPr>
+              <w:pStyle w:val="Normal"/>
+              <w:spacing w:lineRule="auto" w:line="240" w:before="0" w:after="0"/>
+              <w:jc w:val="left"/>
+              <w:rPr/>
+            </w:pPr>
+            <w:r>
+              <w:rPr>
+                <w:rFonts w:eastAsia="Times New Roman" w:cs="Times New Roman"/>
+                <w:sz w:val="17"/>
+              </w:rPr>
+              <w:t>Overall view for a scope: E2E columns, project rows, status at the intersection, legend</w:t>
+            </w:r>
+          </w:p>
+        </w:tc>
+        <w:tc>
+          <w:tcPr>
+            <w:tcW w:w="2737" w:type="dxa"/>
+            <w:tcBorders>
+              <w:top w:val="single" w:sz="4" w:space="0" w:color="E3E3E4"/>
+              <w:left w:val="single" w:sz="4" w:space="0" w:color="E3E3E4"/>
+              <w:bottom w:val="single" w:sz="4" w:space="0" w:color="E3E3E4"/>
+              <w:right w:val="single" w:sz="4" w:space="0" w:color="E3E3E4"/>
+            </w:tcBorders>
+          </w:tcPr>
+          <w:p>
+            <w:pPr>
+              <w:pStyle w:val="Normal"/>
+              <w:spacing w:lineRule="auto" w:line="240" w:before="0" w:after="0"/>
+              <w:jc w:val="left"/>
+              <w:rPr/>
+            </w:pPr>
+            <w:r>
+              <w:rPr>
+                <w:rFonts w:eastAsia="Times New Roman" w:cs="Times New Roman"/>
+                <w:sz w:val="17"/>
+              </w:rPr>
+              <w:t>Portfolio overview with group / organization / set-of-projects scope, 7-status legend, totals, CSV</w:t>
+            </w:r>
+          </w:p>
+        </w:tc>
+        <w:tc>
+          <w:tcPr>
+            <w:tcW w:w="1944" w:type="dxa"/>
+            <w:tcBorders>
+              <w:top w:val="single" w:sz="4" w:space="0" w:color="E3E3E4"/>
+              <w:left w:val="single" w:sz="4" w:space="0" w:color="E3E3E4"/>
+              <w:bottom w:val="single" w:sz="4" w:space="0" w:color="E3E3E4"/>
+              <w:right w:val="single" w:sz="4" w:space="0" w:color="E3E3E4"/>
+            </w:tcBorders>
+          </w:tcPr>
+          <w:p>
+            <w:pPr>
+              <w:pStyle w:val="Normal"/>
+              <w:spacing w:lineRule="auto" w:line="240" w:before="0" w:after="0"/>
+              <w:jc w:val="left"/>
+              <w:rPr/>
+            </w:pPr>
+            <w:r>
+              <w:rPr>
+                <w:rFonts w:eastAsia="Times New Roman" w:cs="Times New Roman"/>
+                <w:sz w:val="17"/>
+              </w:rPr>
+              <w:t>Portfolio &gt; Portfolio overview</w:t>
+            </w:r>
+          </w:p>
+        </w:tc>
+        <w:tc>
+          <w:tcPr>
+            <w:tcW w:w="1584" w:type="dxa"/>
+            <w:tcBorders>
+              <w:top w:val="single" w:sz="4" w:space="0" w:color="E3E3E4"/>
+              <w:left w:val="single" w:sz="4" w:space="0" w:color="E3E3E4"/>
+              <w:bottom w:val="single" w:sz="4" w:space="0" w:color="E3E3E4"/>
+              <w:right w:val="single" w:sz="4" w:space="0" w:color="E3E3E4"/>
+            </w:tcBorders>
+          </w:tcPr>
+          <w:p>
+            <w:pPr>
+              <w:pStyle w:val="Normal"/>
+              <w:spacing w:lineRule="auto" w:line="240" w:before="0" w:after="0"/>
+              <w:jc w:val="left"/>
+              <w:rPr/>
+            </w:pPr>
+            <w:r>
+              <w:rPr>
+                <w:rFonts w:eastAsia="Times New Roman" w:cs="Times New Roman"/>
+                <w:sz w:val="17"/>
+              </w:rPr>
+              <w:t>Implemented</w:t>
+            </w:r>
+          </w:p>
+        </w:tc>
+        <w:tc>
+          <w:tcPr>
+            <w:tcW w:w="892" w:type="dxa"/>
+            <w:tcBorders>
+              <w:top w:val="single" w:sz="4" w:space="0" w:color="E3E3E4"/>
+              <w:left w:val="single" w:sz="4" w:space="0" w:color="E3E3E4"/>
+              <w:bottom w:val="single" w:sz="4" w:space="0" w:color="E3E3E4"/>
+              <w:right w:val="single" w:sz="4" w:space="0" w:color="E3E3E4"/>
+            </w:tcBorders>
+            <w:shd w:color="auto" w:fill="D9EAD3" w:val="clear"/>
+          </w:tcPr>
+          <w:p>
+            <w:pPr>
+              <w:pStyle w:val="Normal"/>
+              <w:spacing w:lineRule="auto" w:line="240" w:before="0" w:after="0"/>
+              <w:jc w:val="left"/>
+              <w:rPr/>
+            </w:pPr>
+            <w:r>
+              <w:rPr>
+                <w:rFonts w:eastAsia="Times New Roman" w:cs="Times New Roman"/>
+                <w:sz w:val="17"/>
+              </w:rPr>
+              <w:t>Covered</w:t>
+            </w:r>
+          </w:p>
+        </w:tc>
+      </w:tr>
+      <w:tr>
+        <w:trPr/>
+        <w:tc>
+          <w:tcPr>
+            <w:tcW w:w="2591" w:type="dxa"/>
+            <w:tcBorders>
+              <w:top w:val="single" w:sz="4" w:space="0" w:color="E3E3E4"/>
+              <w:left w:val="single" w:sz="4" w:space="0" w:color="E3E3E4"/>
+              <w:bottom w:val="single" w:sz="4" w:space="0" w:color="E3E3E4"/>
+              <w:right w:val="single" w:sz="4" w:space="0" w:color="E3E3E4"/>
+            </w:tcBorders>
+            <w:shd w:color="auto" w:fill="F2F2F3" w:val="clear"/>
+          </w:tcPr>
+          <w:p>
+            <w:pPr>
+              <w:pStyle w:val="Normal"/>
+              <w:spacing w:lineRule="auto" w:line="240" w:before="0" w:after="0"/>
+              <w:jc w:val="left"/>
+              <w:rPr/>
+            </w:pPr>
+            <w:r>
+              <w:rPr>
+                <w:rFonts w:eastAsia="Times New Roman" w:cs="Times New Roman"/>
+                <w:sz w:val="17"/>
+              </w:rPr>
+              <w:t>Process design: legend for Part; tasks with Assistive / Augmented AI</w:t>
+            </w:r>
+          </w:p>
+        </w:tc>
+        <w:tc>
+          <w:tcPr>
+            <w:tcW w:w="2737" w:type="dxa"/>
+            <w:tcBorders>
+              <w:top w:val="single" w:sz="4" w:space="0" w:color="E3E3E4"/>
+              <w:left w:val="single" w:sz="4" w:space="0" w:color="E3E3E4"/>
+              <w:bottom w:val="single" w:sz="4" w:space="0" w:color="E3E3E4"/>
+              <w:right w:val="single" w:sz="4" w:space="0" w:color="E3E3E4"/>
+            </w:tcBorders>
+            <w:shd w:color="auto" w:fill="F2F2F3" w:val="clear"/>
+          </w:tcPr>
+          <w:p>
+            <w:pPr>
+              <w:pStyle w:val="Normal"/>
+              <w:spacing w:lineRule="auto" w:line="240" w:before="0" w:after="0"/>
+              <w:jc w:val="left"/>
+              <w:rPr/>
+            </w:pPr>
+            <w:r>
+              <w:rPr>
+                <w:rFonts w:eastAsia="Times New Roman" w:cs="Times New Roman"/>
+                <w:sz w:val="17"/>
+              </w:rPr>
+              <w:t>Legend: Part card; AI column; Tasks and AI tab</w:t>
+            </w:r>
+          </w:p>
+        </w:tc>
+        <w:tc>
+          <w:tcPr>
+            <w:tcW w:w="1944" w:type="dxa"/>
+            <w:tcBorders>
+              <w:top w:val="single" w:sz="4" w:space="0" w:color="E3E3E4"/>
+              <w:left w:val="single" w:sz="4" w:space="0" w:color="E3E3E4"/>
+              <w:bottom w:val="single" w:sz="4" w:space="0" w:color="E3E3E4"/>
+              <w:right w:val="single" w:sz="4" w:space="0" w:color="E3E3E4"/>
+            </w:tcBorders>
+            <w:shd w:color="auto" w:fill="F2F2F3" w:val="clear"/>
+          </w:tcPr>
+          <w:p>
+            <w:pPr>
+              <w:pStyle w:val="Normal"/>
+              <w:spacing w:lineRule="auto" w:line="240" w:before="0" w:after="0"/>
+              <w:jc w:val="left"/>
+              <w:rPr/>
+            </w:pPr>
+            <w:r>
+              <w:rPr>
+                <w:rFonts w:eastAsia="Times New Roman" w:cs="Times New Roman"/>
+                <w:sz w:val="17"/>
+              </w:rPr>
+              <w:t>Process design &gt; Macro processes; End-to-end processes</w:t>
+            </w:r>
+          </w:p>
+        </w:tc>
+        <w:tc>
+          <w:tcPr>
+            <w:tcW w:w="1584" w:type="dxa"/>
+            <w:tcBorders>
+              <w:top w:val="single" w:sz="4" w:space="0" w:color="E3E3E4"/>
+              <w:left w:val="single" w:sz="4" w:space="0" w:color="E3E3E4"/>
+              <w:bottom w:val="single" w:sz="4" w:space="0" w:color="E3E3E4"/>
+              <w:right w:val="single" w:sz="4" w:space="0" w:color="E3E3E4"/>
+            </w:tcBorders>
+            <w:shd w:color="auto" w:fill="F2F2F3" w:val="clear"/>
+          </w:tcPr>
+          <w:p>
+            <w:pPr>
+              <w:pStyle w:val="Normal"/>
+              <w:spacing w:lineRule="auto" w:line="240" w:before="0" w:after="0"/>
+              <w:jc w:val="left"/>
+              <w:rPr/>
+            </w:pPr>
+            <w:r>
+              <w:rPr>
+                <w:rFonts w:eastAsia="Times New Roman" w:cs="Times New Roman"/>
+                <w:sz w:val="17"/>
+              </w:rPr>
+              <w:t>54 of 81 tasks with AI</w:t>
+            </w:r>
+          </w:p>
+        </w:tc>
+        <w:tc>
+          <w:tcPr>
+            <w:tcW w:w="892" w:type="dxa"/>
+            <w:tcBorders>
+              <w:top w:val="single" w:sz="4" w:space="0" w:color="E3E3E4"/>
+              <w:left w:val="single" w:sz="4" w:space="0" w:color="E3E3E4"/>
+              <w:bottom w:val="single" w:sz="4" w:space="0" w:color="E3E3E4"/>
+              <w:right w:val="single" w:sz="4" w:space="0" w:color="E3E3E4"/>
+            </w:tcBorders>
+            <w:shd w:color="auto" w:fill="D9EAD3" w:val="clear"/>
+          </w:tcPr>
+          <w:p>
+            <w:pPr>
+              <w:pStyle w:val="Normal"/>
+              <w:spacing w:lineRule="auto" w:line="240" w:before="0" w:after="0"/>
+              <w:jc w:val="left"/>
+              <w:rPr/>
+            </w:pPr>
+            <w:r>
+              <w:rPr>
+                <w:rFonts w:eastAsia="Times New Roman" w:cs="Times New Roman"/>
+                <w:sz w:val="17"/>
+              </w:rPr>
+              <w:t>Covered</w:t>
+            </w:r>
+          </w:p>
+        </w:tc>
+      </w:tr>
+      <w:tr>
+        <w:trPr/>
+        <w:tc>
+          <w:tcPr>
+            <w:tcW w:w="2591" w:type="dxa"/>
+            <w:tcBorders>
+              <w:top w:val="single" w:sz="4" w:space="0" w:color="E3E3E4"/>
+              <w:left w:val="single" w:sz="4" w:space="0" w:color="E3E3E4"/>
+              <w:bottom w:val="single" w:sz="4" w:space="0" w:color="E3E3E4"/>
+              <w:right w:val="single" w:sz="4" w:space="0" w:color="E3E3E4"/>
+            </w:tcBorders>
+          </w:tcPr>
+          <w:p>
+            <w:pPr>
+              <w:pStyle w:val="Normal"/>
+              <w:spacing w:lineRule="auto" w:line="240" w:before="0" w:after="0"/>
+              <w:jc w:val="left"/>
+              <w:rPr/>
+            </w:pPr>
+            <w:r>
+              <w:rPr>
+                <w:rFonts w:eastAsia="Times New Roman" w:cs="Times New Roman"/>
+                <w:sz w:val="17"/>
+              </w:rPr>
+              <w:t>AI use cases CRUD; visible and runnable (Accept, Modify, Reject) on E2E, macro processes, tasks and steps</w:t>
+            </w:r>
+          </w:p>
+        </w:tc>
+        <w:tc>
+          <w:tcPr>
+            <w:tcW w:w="2737" w:type="dxa"/>
+            <w:tcBorders>
+              <w:top w:val="single" w:sz="4" w:space="0" w:color="E3E3E4"/>
+              <w:left w:val="single" w:sz="4" w:space="0" w:color="E3E3E4"/>
+              <w:bottom w:val="single" w:sz="4" w:space="0" w:color="E3E3E4"/>
+              <w:right w:val="single" w:sz="4" w:space="0" w:color="E3E3E4"/>
+            </w:tcBorders>
+          </w:tcPr>
+          <w:p>
+            <w:pPr>
+              <w:pStyle w:val="Normal"/>
+              <w:spacing w:lineRule="auto" w:line="240" w:before="0" w:after="0"/>
+              <w:jc w:val="left"/>
+              <w:rPr/>
+            </w:pPr>
+            <w:r>
+              <w:rPr>
+                <w:rFonts w:eastAsia="Times New Roman" w:cs="Times New Roman"/>
+                <w:sz w:val="17"/>
+              </w:rPr>
+              <w:t>Create, versioned edit, delete (custom), activation; sparkle badges run the use case in place</w:t>
+            </w:r>
+          </w:p>
+        </w:tc>
+        <w:tc>
+          <w:tcPr>
+            <w:tcW w:w="1944" w:type="dxa"/>
+            <w:tcBorders>
+              <w:top w:val="single" w:sz="4" w:space="0" w:color="E3E3E4"/>
+              <w:left w:val="single" w:sz="4" w:space="0" w:color="E3E3E4"/>
+              <w:bottom w:val="single" w:sz="4" w:space="0" w:color="E3E3E4"/>
+              <w:right w:val="single" w:sz="4" w:space="0" w:color="E3E3E4"/>
+            </w:tcBorders>
+          </w:tcPr>
+          <w:p>
+            <w:pPr>
+              <w:pStyle w:val="Normal"/>
+              <w:spacing w:lineRule="auto" w:line="240" w:before="0" w:after="0"/>
+              <w:jc w:val="left"/>
+              <w:rPr/>
+            </w:pPr>
+            <w:r>
+              <w:rPr>
+                <w:rFonts w:eastAsia="Times New Roman" w:cs="Times New Roman"/>
+                <w:sz w:val="17"/>
+              </w:rPr>
+              <w:t>AI use cases; E2E; macro process; task page</w:t>
+            </w:r>
+          </w:p>
+        </w:tc>
+        <w:tc>
+          <w:tcPr>
+            <w:tcW w:w="1584" w:type="dxa"/>
+            <w:tcBorders>
+              <w:top w:val="single" w:sz="4" w:space="0" w:color="E3E3E4"/>
+              <w:left w:val="single" w:sz="4" w:space="0" w:color="E3E3E4"/>
+              <w:bottom w:val="single" w:sz="4" w:space="0" w:color="E3E3E4"/>
+              <w:right w:val="single" w:sz="4" w:space="0" w:color="E3E3E4"/>
+            </w:tcBorders>
+          </w:tcPr>
+          <w:p>
+            <w:pPr>
+              <w:pStyle w:val="Normal"/>
+              <w:spacing w:lineRule="auto" w:line="240" w:before="0" w:after="0"/>
+              <w:jc w:val="left"/>
+              <w:rPr/>
+            </w:pPr>
+            <w:r>
+              <w:rPr>
+                <w:rFonts w:eastAsia="Times New Roman" w:cs="Times New Roman"/>
+                <w:sz w:val="17"/>
+              </w:rPr>
+              <w:t>Implemented</w:t>
+            </w:r>
+          </w:p>
+        </w:tc>
+        <w:tc>
+          <w:tcPr>
+            <w:tcW w:w="892" w:type="dxa"/>
+            <w:tcBorders>
+              <w:top w:val="single" w:sz="4" w:space="0" w:color="E3E3E4"/>
+              <w:left w:val="single" w:sz="4" w:space="0" w:color="E3E3E4"/>
+              <w:bottom w:val="single" w:sz="4" w:space="0" w:color="E3E3E4"/>
+              <w:right w:val="single" w:sz="4" w:space="0" w:color="E3E3E4"/>
+            </w:tcBorders>
+            <w:shd w:color="auto" w:fill="D9EAD3" w:val="clear"/>
+          </w:tcPr>
+          <w:p>
+            <w:pPr>
+              <w:pStyle w:val="Normal"/>
+              <w:spacing w:lineRule="auto" w:line="240" w:before="0" w:after="0"/>
+              <w:jc w:val="left"/>
+              <w:rPr/>
+            </w:pPr>
+            <w:r>
+              <w:rPr>
+                <w:rFonts w:eastAsia="Times New Roman" w:cs="Times New Roman"/>
+                <w:sz w:val="17"/>
+              </w:rPr>
+              <w:t>Covered</w:t>
+            </w:r>
+          </w:p>
+        </w:tc>
+      </w:tr>
+      <w:tr>
+        <w:trPr/>
+        <w:tc>
+          <w:tcPr>
+            <w:tcW w:w="2591" w:type="dxa"/>
+            <w:tcBorders>
+              <w:top w:val="single" w:sz="4" w:space="0" w:color="E3E3E4"/>
+              <w:left w:val="single" w:sz="4" w:space="0" w:color="E3E3E4"/>
+              <w:bottom w:val="single" w:sz="4" w:space="0" w:color="E3E3E4"/>
+              <w:right w:val="single" w:sz="4" w:space="0" w:color="E3E3E4"/>
+            </w:tcBorders>
+            <w:shd w:color="auto" w:fill="F2F2F3" w:val="clear"/>
+          </w:tcPr>
+          <w:p>
+            <w:pPr>
+              <w:pStyle w:val="Normal"/>
+              <w:spacing w:lineRule="auto" w:line="240" w:before="0" w:after="0"/>
+              <w:jc w:val="left"/>
+              <w:rPr/>
+            </w:pPr>
+            <w:r>
+              <w:rPr>
+                <w:rFonts w:eastAsia="Times New Roman" w:cs="Times New Roman"/>
+                <w:sz w:val="17"/>
+              </w:rPr>
+              <w:t>Checklist template library per gate per track; link to gates; create from template or manually at the gate</w:t>
+            </w:r>
+          </w:p>
+        </w:tc>
+        <w:tc>
+          <w:tcPr>
+            <w:tcW w:w="2737" w:type="dxa"/>
+            <w:tcBorders>
+              <w:top w:val="single" w:sz="4" w:space="0" w:color="E3E3E4"/>
+              <w:left w:val="single" w:sz="4" w:space="0" w:color="E3E3E4"/>
+              <w:bottom w:val="single" w:sz="4" w:space="0" w:color="E3E3E4"/>
+              <w:right w:val="single" w:sz="4" w:space="0" w:color="E3E3E4"/>
+            </w:tcBorders>
+            <w:shd w:color="auto" w:fill="F2F2F3" w:val="clear"/>
+          </w:tcPr>
+          <w:p>
+            <w:pPr>
+              <w:pStyle w:val="Normal"/>
+              <w:spacing w:lineRule="auto" w:line="240" w:before="0" w:after="0"/>
+              <w:jc w:val="left"/>
+              <w:rPr/>
+            </w:pPr>
+            <w:r>
+              <w:rPr>
+                <w:rFonts w:eastAsia="Times New Roman" w:cs="Times New Roman"/>
+                <w:sz w:val="17"/>
+              </w:rPr>
+              <w:t>Standard and sector templates; linked templates applied when the gate opens; Add to this checklist; Save as template</w:t>
+            </w:r>
+          </w:p>
+        </w:tc>
+        <w:tc>
+          <w:tcPr>
+            <w:tcW w:w="1944" w:type="dxa"/>
+            <w:tcBorders>
+              <w:top w:val="single" w:sz="4" w:space="0" w:color="E3E3E4"/>
+              <w:left w:val="single" w:sz="4" w:space="0" w:color="E3E3E4"/>
+              <w:bottom w:val="single" w:sz="4" w:space="0" w:color="E3E3E4"/>
+              <w:right w:val="single" w:sz="4" w:space="0" w:color="E3E3E4"/>
+            </w:tcBorders>
+            <w:shd w:color="auto" w:fill="F2F2F3" w:val="clear"/>
+          </w:tcPr>
+          <w:p>
+            <w:pPr>
+              <w:pStyle w:val="Normal"/>
+              <w:spacing w:lineRule="auto" w:line="240" w:before="0" w:after="0"/>
+              <w:jc w:val="left"/>
+              <w:rPr/>
+            </w:pPr>
+            <w:r>
+              <w:rPr>
+                <w:rFonts w:eastAsia="Times New Roman" w:cs="Times New Roman"/>
+                <w:sz w:val="17"/>
+              </w:rPr>
+              <w:t>Process design &gt; Checklist templates; gate page</w:t>
+            </w:r>
+          </w:p>
+        </w:tc>
+        <w:tc>
+          <w:tcPr>
+            <w:tcW w:w="1584" w:type="dxa"/>
+            <w:tcBorders>
+              <w:top w:val="single" w:sz="4" w:space="0" w:color="E3E3E4"/>
+              <w:left w:val="single" w:sz="4" w:space="0" w:color="E3E3E4"/>
+              <w:bottom w:val="single" w:sz="4" w:space="0" w:color="E3E3E4"/>
+              <w:right w:val="single" w:sz="4" w:space="0" w:color="E3E3E4"/>
+            </w:tcBorders>
+            <w:shd w:color="auto" w:fill="F2F2F3" w:val="clear"/>
+          </w:tcPr>
+          <w:p>
+            <w:pPr>
+              <w:pStyle w:val="Normal"/>
+              <w:spacing w:lineRule="auto" w:line="240" w:before="0" w:after="0"/>
+              <w:jc w:val="left"/>
+              <w:rPr/>
+            </w:pPr>
+            <w:r>
+              <w:rPr>
+                <w:rFonts w:eastAsia="Times New Roman" w:cs="Times New Roman"/>
+                <w:sz w:val="17"/>
+              </w:rPr>
+              <w:t>145 templates seeded</w:t>
+            </w:r>
+          </w:p>
+        </w:tc>
+        <w:tc>
+          <w:tcPr>
+            <w:tcW w:w="892" w:type="dxa"/>
+            <w:tcBorders>
+              <w:top w:val="single" w:sz="4" w:space="0" w:color="E3E3E4"/>
+              <w:left w:val="single" w:sz="4" w:space="0" w:color="E3E3E4"/>
+              <w:bottom w:val="single" w:sz="4" w:space="0" w:color="E3E3E4"/>
+              <w:right w:val="single" w:sz="4" w:space="0" w:color="E3E3E4"/>
+            </w:tcBorders>
+            <w:shd w:color="auto" w:fill="D9EAD3" w:val="clear"/>
+          </w:tcPr>
+          <w:p>
+            <w:pPr>
+              <w:pStyle w:val="Normal"/>
+              <w:spacing w:lineRule="auto" w:line="240" w:before="0" w:after="0"/>
+              <w:jc w:val="left"/>
+              <w:rPr/>
+            </w:pPr>
+            <w:r>
+              <w:rPr>
+                <w:rFonts w:eastAsia="Times New Roman" w:cs="Times New Roman"/>
+                <w:sz w:val="17"/>
+              </w:rPr>
+              <w:t>Covered</w:t>
+            </w:r>
+          </w:p>
+        </w:tc>
+      </w:tr>
+      <w:tr>
+        <w:trPr/>
+        <w:tc>
+          <w:tcPr>
+            <w:tcW w:w="2591" w:type="dxa"/>
+            <w:tcBorders>
+              <w:top w:val="single" w:sz="4" w:space="0" w:color="E3E3E4"/>
+              <w:left w:val="single" w:sz="4" w:space="0" w:color="E3E3E4"/>
+              <w:bottom w:val="single" w:sz="4" w:space="0" w:color="E3E3E4"/>
+              <w:right w:val="single" w:sz="4" w:space="0" w:color="E3E3E4"/>
+            </w:tcBorders>
+          </w:tcPr>
+          <w:p>
+            <w:pPr>
+              <w:pStyle w:val="Normal"/>
+              <w:spacing w:lineRule="auto" w:line="240" w:before="0" w:after="0"/>
+              <w:jc w:val="left"/>
+              <w:rPr/>
+            </w:pPr>
+            <w:r>
+              <w:rPr>
+                <w:rFonts w:eastAsia="Times New Roman" w:cs="Times New Roman"/>
+                <w:sz w:val="17"/>
+              </w:rPr>
+              <w:t>Attach documents in many formats to all tasks</w:t>
+            </w:r>
+          </w:p>
+        </w:tc>
+        <w:tc>
+          <w:tcPr>
+            <w:tcW w:w="2737" w:type="dxa"/>
+            <w:tcBorders>
+              <w:top w:val="single" w:sz="4" w:space="0" w:color="E3E3E4"/>
+              <w:left w:val="single" w:sz="4" w:space="0" w:color="E3E3E4"/>
+              <w:bottom w:val="single" w:sz="4" w:space="0" w:color="E3E3E4"/>
+              <w:right w:val="single" w:sz="4" w:space="0" w:color="E3E3E4"/>
+            </w:tcBorders>
+          </w:tcPr>
+          <w:p>
+            <w:pPr>
+              <w:pStyle w:val="Normal"/>
+              <w:spacing w:lineRule="auto" w:line="240" w:before="0" w:after="0"/>
+              <w:jc w:val="left"/>
+              <w:rPr/>
+            </w:pPr>
+            <w:r>
+              <w:rPr>
+                <w:rFonts w:eastAsia="Times New Roman" w:cs="Times New Roman"/>
+                <w:sz w:val="17"/>
+              </w:rPr>
+              <w:t>Multi-file upload, drag-and-drop, 9 format families, 25 MB, delete, audit</w:t>
+            </w:r>
+          </w:p>
+        </w:tc>
+        <w:tc>
+          <w:tcPr>
+            <w:tcW w:w="1944" w:type="dxa"/>
+            <w:tcBorders>
+              <w:top w:val="single" w:sz="4" w:space="0" w:color="E3E3E4"/>
+              <w:left w:val="single" w:sz="4" w:space="0" w:color="E3E3E4"/>
+              <w:bottom w:val="single" w:sz="4" w:space="0" w:color="E3E3E4"/>
+              <w:right w:val="single" w:sz="4" w:space="0" w:color="E3E3E4"/>
+            </w:tcBorders>
+          </w:tcPr>
+          <w:p>
+            <w:pPr>
+              <w:pStyle w:val="Normal"/>
+              <w:spacing w:lineRule="auto" w:line="240" w:before="0" w:after="0"/>
+              <w:jc w:val="left"/>
+              <w:rPr/>
+            </w:pPr>
+            <w:r>
+              <w:rPr>
+                <w:rFonts w:eastAsia="Times New Roman" w:cs="Times New Roman"/>
+                <w:sz w:val="17"/>
+              </w:rPr>
+              <w:t>Every task page</w:t>
+            </w:r>
+          </w:p>
+        </w:tc>
+        <w:tc>
+          <w:tcPr>
+            <w:tcW w:w="1584" w:type="dxa"/>
+            <w:tcBorders>
+              <w:top w:val="single" w:sz="4" w:space="0" w:color="E3E3E4"/>
+              <w:left w:val="single" w:sz="4" w:space="0" w:color="E3E3E4"/>
+              <w:bottom w:val="single" w:sz="4" w:space="0" w:color="E3E3E4"/>
+              <w:right w:val="single" w:sz="4" w:space="0" w:color="E3E3E4"/>
+            </w:tcBorders>
+          </w:tcPr>
+          <w:p>
+            <w:pPr>
+              <w:pStyle w:val="Normal"/>
+              <w:spacing w:lineRule="auto" w:line="240" w:before="0" w:after="0"/>
+              <w:jc w:val="left"/>
+              <w:rPr/>
+            </w:pPr>
+            <w:r>
+              <w:rPr>
+                <w:rFonts w:eastAsia="Times New Roman" w:cs="Times New Roman"/>
+                <w:sz w:val="17"/>
+              </w:rPr>
+              <w:t>440+ files seeded</w:t>
+            </w:r>
+          </w:p>
+        </w:tc>
+        <w:tc>
+          <w:tcPr>
+            <w:tcW w:w="892" w:type="dxa"/>
+            <w:tcBorders>
+              <w:top w:val="single" w:sz="4" w:space="0" w:color="E3E3E4"/>
+              <w:left w:val="single" w:sz="4" w:space="0" w:color="E3E3E4"/>
+              <w:bottom w:val="single" w:sz="4" w:space="0" w:color="E3E3E4"/>
+              <w:right w:val="single" w:sz="4" w:space="0" w:color="E3E3E4"/>
+            </w:tcBorders>
+            <w:shd w:color="auto" w:fill="D9EAD3" w:val="clear"/>
+          </w:tcPr>
+          <w:p>
+            <w:pPr>
+              <w:pStyle w:val="Normal"/>
+              <w:spacing w:lineRule="auto" w:line="240" w:before="0" w:after="0"/>
+              <w:jc w:val="left"/>
+              <w:rPr/>
+            </w:pPr>
+            <w:r>
+              <w:rPr>
+                <w:rFonts w:eastAsia="Times New Roman" w:cs="Times New Roman"/>
+                <w:sz w:val="17"/>
+              </w:rPr>
+              <w:t>Covered</w:t>
+            </w:r>
+          </w:p>
+        </w:tc>
+      </w:tr>
+      <w:tr>
+        <w:trPr/>
+        <w:tc>
+          <w:tcPr>
+            <w:tcW w:w="2591" w:type="dxa"/>
+            <w:tcBorders>
+              <w:top w:val="single" w:sz="4" w:space="0" w:color="E3E3E4"/>
+              <w:left w:val="single" w:sz="4" w:space="0" w:color="E3E3E4"/>
+              <w:bottom w:val="single" w:sz="4" w:space="0" w:color="E3E3E4"/>
+              <w:right w:val="single" w:sz="4" w:space="0" w:color="E3E3E4"/>
+            </w:tcBorders>
+            <w:shd w:color="auto" w:fill="F2F2F3" w:val="clear"/>
+          </w:tcPr>
+          <w:p>
+            <w:pPr>
+              <w:pStyle w:val="Normal"/>
+              <w:spacing w:lineRule="auto" w:line="240" w:before="0" w:after="0"/>
+              <w:jc w:val="left"/>
+              <w:rPr/>
+            </w:pPr>
+            <w:r>
+              <w:rPr>
+                <w:rFonts w:eastAsia="Times New Roman" w:cs="Times New Roman"/>
+                <w:sz w:val="17"/>
+              </w:rPr>
+              <w:t>Filter innovation projects by group, organization and project within permissions</w:t>
+            </w:r>
+          </w:p>
+        </w:tc>
+        <w:tc>
+          <w:tcPr>
+            <w:tcW w:w="2737" w:type="dxa"/>
+            <w:tcBorders>
+              <w:top w:val="single" w:sz="4" w:space="0" w:color="E3E3E4"/>
+              <w:left w:val="single" w:sz="4" w:space="0" w:color="E3E3E4"/>
+              <w:bottom w:val="single" w:sz="4" w:space="0" w:color="E3E3E4"/>
+              <w:right w:val="single" w:sz="4" w:space="0" w:color="E3E3E4"/>
+            </w:tcBorders>
+            <w:shd w:color="auto" w:fill="F2F2F3" w:val="clear"/>
+          </w:tcPr>
+          <w:p>
+            <w:pPr>
+              <w:pStyle w:val="Normal"/>
+              <w:spacing w:lineRule="auto" w:line="240" w:before="0" w:after="0"/>
+              <w:jc w:val="left"/>
+              <w:rPr/>
+            </w:pPr>
+            <w:r>
+              <w:rPr>
+                <w:rFonts w:eastAsia="Times New Roman" w:cs="Times New Roman"/>
+                <w:sz w:val="17"/>
+              </w:rPr>
+              <w:t>Scope filters limited to permitted organizations; foreign projects read-only</w:t>
+            </w:r>
+          </w:p>
+        </w:tc>
+        <w:tc>
+          <w:tcPr>
+            <w:tcW w:w="1944" w:type="dxa"/>
+            <w:tcBorders>
+              <w:top w:val="single" w:sz="4" w:space="0" w:color="E3E3E4"/>
+              <w:left w:val="single" w:sz="4" w:space="0" w:color="E3E3E4"/>
+              <w:bottom w:val="single" w:sz="4" w:space="0" w:color="E3E3E4"/>
+              <w:right w:val="single" w:sz="4" w:space="0" w:color="E3E3E4"/>
+            </w:tcBorders>
+            <w:shd w:color="auto" w:fill="F2F2F3" w:val="clear"/>
+          </w:tcPr>
+          <w:p>
+            <w:pPr>
+              <w:pStyle w:val="Normal"/>
+              <w:spacing w:lineRule="auto" w:line="240" w:before="0" w:after="0"/>
+              <w:jc w:val="left"/>
+              <w:rPr/>
+            </w:pPr>
+            <w:r>
+              <w:rPr>
+                <w:rFonts w:eastAsia="Times New Roman" w:cs="Times New Roman"/>
+                <w:sz w:val="17"/>
+              </w:rPr>
+              <w:t>Portfolio &gt; Innovation projects</w:t>
+            </w:r>
+          </w:p>
+        </w:tc>
+        <w:tc>
+          <w:tcPr>
+            <w:tcW w:w="1584" w:type="dxa"/>
+            <w:tcBorders>
+              <w:top w:val="single" w:sz="4" w:space="0" w:color="E3E3E4"/>
+              <w:left w:val="single" w:sz="4" w:space="0" w:color="E3E3E4"/>
+              <w:bottom w:val="single" w:sz="4" w:space="0" w:color="E3E3E4"/>
+              <w:right w:val="single" w:sz="4" w:space="0" w:color="E3E3E4"/>
+            </w:tcBorders>
+            <w:shd w:color="auto" w:fill="F2F2F3" w:val="clear"/>
+          </w:tcPr>
+          <w:p>
+            <w:pPr>
+              <w:pStyle w:val="Normal"/>
+              <w:spacing w:lineRule="auto" w:line="240" w:before="0" w:after="0"/>
+              <w:jc w:val="left"/>
+              <w:rPr/>
+            </w:pPr>
+            <w:r>
+              <w:rPr>
+                <w:rFonts w:eastAsia="Times New Roman" w:cs="Times New Roman"/>
+                <w:sz w:val="17"/>
+              </w:rPr>
+              <w:t>Automated tests</w:t>
+            </w:r>
+          </w:p>
+        </w:tc>
+        <w:tc>
+          <w:tcPr>
+            <w:tcW w:w="892" w:type="dxa"/>
+            <w:tcBorders>
+              <w:top w:val="single" w:sz="4" w:space="0" w:color="E3E3E4"/>
+              <w:left w:val="single" w:sz="4" w:space="0" w:color="E3E3E4"/>
+              <w:bottom w:val="single" w:sz="4" w:space="0" w:color="E3E3E4"/>
+              <w:right w:val="single" w:sz="4" w:space="0" w:color="E3E3E4"/>
+            </w:tcBorders>
+            <w:shd w:color="auto" w:fill="D9EAD3" w:val="clear"/>
+          </w:tcPr>
+          <w:p>
+            <w:pPr>
+              <w:pStyle w:val="Normal"/>
+              <w:spacing w:lineRule="auto" w:line="240" w:before="0" w:after="0"/>
+              <w:jc w:val="left"/>
+              <w:rPr/>
+            </w:pPr>
+            <w:r>
+              <w:rPr>
+                <w:rFonts w:eastAsia="Times New Roman" w:cs="Times New Roman"/>
+                <w:sz w:val="17"/>
+              </w:rPr>
+              <w:t>Covered</w:t>
+            </w:r>
+          </w:p>
+        </w:tc>
+      </w:tr>
+      <w:tr>
+        <w:trPr/>
+        <w:tc>
+          <w:tcPr>
+            <w:tcW w:w="2591" w:type="dxa"/>
+            <w:tcBorders>
+              <w:top w:val="single" w:sz="4" w:space="0" w:color="E3E3E4"/>
+              <w:left w:val="single" w:sz="4" w:space="0" w:color="E3E3E4"/>
+              <w:bottom w:val="single" w:sz="4" w:space="0" w:color="E3E3E4"/>
+              <w:right w:val="single" w:sz="4" w:space="0" w:color="E3E3E4"/>
+            </w:tcBorders>
+          </w:tcPr>
+          <w:p>
+            <w:pPr>
+              <w:pStyle w:val="Normal"/>
+              <w:spacing w:lineRule="auto" w:line="240" w:before="0" w:after="0"/>
+              <w:jc w:val="left"/>
+              <w:rPr/>
+            </w:pPr>
+            <w:r>
+              <w:rPr>
+                <w:rFonts w:eastAsia="Times New Roman" w:cs="Times New Roman"/>
+                <w:sz w:val="17"/>
+              </w:rPr>
+              <w:t>Seed all application aspects</w:t>
+            </w:r>
+          </w:p>
+        </w:tc>
+        <w:tc>
+          <w:tcPr>
+            <w:tcW w:w="2737" w:type="dxa"/>
+            <w:tcBorders>
+              <w:top w:val="single" w:sz="4" w:space="0" w:color="E3E3E4"/>
+              <w:left w:val="single" w:sz="4" w:space="0" w:color="E3E3E4"/>
+              <w:bottom w:val="single" w:sz="4" w:space="0" w:color="E3E3E4"/>
+              <w:right w:val="single" w:sz="4" w:space="0" w:color="E3E3E4"/>
+            </w:tcBorders>
+          </w:tcPr>
+          <w:p>
+            <w:pPr>
+              <w:pStyle w:val="Normal"/>
+              <w:spacing w:lineRule="auto" w:line="240" w:before="0" w:after="0"/>
+              <w:jc w:val="left"/>
+              <w:rPr/>
+            </w:pPr>
+            <w:r>
+              <w:rPr>
+                <w:rFonts w:eastAsia="Times New Roman" w:cs="Times New Roman"/>
+                <w:sz w:val="17"/>
+              </w:rPr>
+              <w:t>Every table populated (custom AI use cases, overrides, alert settings, reads, webhooks, attachments, teams)</w:t>
+            </w:r>
+          </w:p>
+        </w:tc>
+        <w:tc>
+          <w:tcPr>
+            <w:tcW w:w="1944" w:type="dxa"/>
+            <w:tcBorders>
+              <w:top w:val="single" w:sz="4" w:space="0" w:color="E3E3E4"/>
+              <w:left w:val="single" w:sz="4" w:space="0" w:color="E3E3E4"/>
+              <w:bottom w:val="single" w:sz="4" w:space="0" w:color="E3E3E4"/>
+              <w:right w:val="single" w:sz="4" w:space="0" w:color="E3E3E4"/>
+            </w:tcBorders>
+          </w:tcPr>
+          <w:p>
+            <w:pPr>
+              <w:pStyle w:val="Normal"/>
+              <w:spacing w:lineRule="auto" w:line="240" w:before="0" w:after="0"/>
+              <w:jc w:val="left"/>
+              <w:rPr/>
+            </w:pPr>
+            <w:r>
+              <w:rPr>
+                <w:rFonts w:eastAsia="Times New Roman" w:cs="Times New Roman"/>
+                <w:sz w:val="17"/>
+              </w:rPr>
+              <w:t>Whole application</w:t>
+            </w:r>
+          </w:p>
+        </w:tc>
+        <w:tc>
+          <w:tcPr>
+            <w:tcW w:w="1584" w:type="dxa"/>
+            <w:tcBorders>
+              <w:top w:val="single" w:sz="4" w:space="0" w:color="E3E3E4"/>
+              <w:left w:val="single" w:sz="4" w:space="0" w:color="E3E3E4"/>
+              <w:bottom w:val="single" w:sz="4" w:space="0" w:color="E3E3E4"/>
+              <w:right w:val="single" w:sz="4" w:space="0" w:color="E3E3E4"/>
+            </w:tcBorders>
+          </w:tcPr>
+          <w:p>
+            <w:pPr>
+              <w:pStyle w:val="Normal"/>
+              <w:spacing w:lineRule="auto" w:line="240" w:before="0" w:after="0"/>
+              <w:jc w:val="left"/>
+              <w:rPr/>
+            </w:pPr>
+            <w:r>
+              <w:rPr>
+                <w:rFonts w:eastAsia="Times New Roman" w:cs="Times New Roman"/>
+                <w:sz w:val="17"/>
+              </w:rPr>
+              <w:t>No empty table</w:t>
+            </w:r>
+          </w:p>
+        </w:tc>
+        <w:tc>
+          <w:tcPr>
+            <w:tcW w:w="892" w:type="dxa"/>
+            <w:tcBorders>
+              <w:top w:val="single" w:sz="4" w:space="0" w:color="E3E3E4"/>
+              <w:left w:val="single" w:sz="4" w:space="0" w:color="E3E3E4"/>
+              <w:bottom w:val="single" w:sz="4" w:space="0" w:color="E3E3E4"/>
+              <w:right w:val="single" w:sz="4" w:space="0" w:color="E3E3E4"/>
+            </w:tcBorders>
+            <w:shd w:color="auto" w:fill="D9EAD3" w:val="clear"/>
+          </w:tcPr>
+          <w:p>
+            <w:pPr>
+              <w:pStyle w:val="Normal"/>
+              <w:spacing w:lineRule="auto" w:line="240" w:before="0" w:after="0"/>
+              <w:jc w:val="left"/>
+              <w:rPr/>
+            </w:pPr>
+            <w:r>
+              <w:rPr>
+                <w:rFonts w:eastAsia="Times New Roman" w:cs="Times New Roman"/>
+                <w:sz w:val="17"/>
+              </w:rPr>
+              <w:t>Covered</w:t>
+            </w:r>
+          </w:p>
+        </w:tc>
+      </w:tr>
+      <w:tr>
+        <w:trPr/>
+        <w:tc>
+          <w:tcPr>
+            <w:tcW w:w="2591" w:type="dxa"/>
+            <w:tcBorders>
+              <w:top w:val="single" w:sz="4" w:space="0" w:color="E3E3E4"/>
+              <w:left w:val="single" w:sz="4" w:space="0" w:color="E3E3E4"/>
+              <w:bottom w:val="single" w:sz="4" w:space="0" w:color="E3E3E4"/>
+              <w:right w:val="single" w:sz="4" w:space="0" w:color="E3E3E4"/>
+            </w:tcBorders>
+            <w:shd w:color="auto" w:fill="F2F2F3" w:val="clear"/>
+          </w:tcPr>
+          <w:p>
+            <w:pPr>
+              <w:pStyle w:val="Normal"/>
+              <w:spacing w:lineRule="auto" w:line="240" w:before="0" w:after="0"/>
+              <w:jc w:val="left"/>
+              <w:rPr/>
+            </w:pPr>
+            <w:r>
+              <w:rPr>
+                <w:rFonts w:eastAsia="Times New Roman" w:cs="Times New Roman"/>
+                <w:sz w:val="17"/>
+              </w:rPr>
+              <w:t>BPMN: palette section; full screen with palette and return</w:t>
+            </w:r>
+          </w:p>
+        </w:tc>
+        <w:tc>
+          <w:tcPr>
+            <w:tcW w:w="2737" w:type="dxa"/>
+            <w:tcBorders>
+              <w:top w:val="single" w:sz="4" w:space="0" w:color="E3E3E4"/>
+              <w:left w:val="single" w:sz="4" w:space="0" w:color="E3E3E4"/>
+              <w:bottom w:val="single" w:sz="4" w:space="0" w:color="E3E3E4"/>
+              <w:right w:val="single" w:sz="4" w:space="0" w:color="E3E3E4"/>
+            </w:tcBorders>
+            <w:shd w:color="auto" w:fill="F2F2F3" w:val="clear"/>
+          </w:tcPr>
+          <w:p>
+            <w:pPr>
+              <w:pStyle w:val="Normal"/>
+              <w:spacing w:lineRule="auto" w:line="240" w:before="0" w:after="0"/>
+              <w:jc w:val="left"/>
+              <w:rPr/>
+            </w:pPr>
+            <w:r>
+              <w:rPr>
+                <w:rFonts w:eastAsia="Times New Roman" w:cs="Times New Roman"/>
+                <w:sz w:val="17"/>
+              </w:rPr>
+              <w:t>Shapes palette panel, legend when view-only, slide-away palette, zoom slider, Full screen / Back to the page</w:t>
+            </w:r>
+          </w:p>
+        </w:tc>
+        <w:tc>
+          <w:tcPr>
+            <w:tcW w:w="1944" w:type="dxa"/>
+            <w:tcBorders>
+              <w:top w:val="single" w:sz="4" w:space="0" w:color="E3E3E4"/>
+              <w:left w:val="single" w:sz="4" w:space="0" w:color="E3E3E4"/>
+              <w:bottom w:val="single" w:sz="4" w:space="0" w:color="E3E3E4"/>
+              <w:right w:val="single" w:sz="4" w:space="0" w:color="E3E3E4"/>
+            </w:tcBorders>
+            <w:shd w:color="auto" w:fill="F2F2F3" w:val="clear"/>
+          </w:tcPr>
+          <w:p>
+            <w:pPr>
+              <w:pStyle w:val="Normal"/>
+              <w:spacing w:lineRule="auto" w:line="240" w:before="0" w:after="0"/>
+              <w:jc w:val="left"/>
+              <w:rPr/>
+            </w:pPr>
+            <w:r>
+              <w:rPr>
+                <w:rFonts w:eastAsia="Times New Roman" w:cs="Times New Roman"/>
+                <w:sz w:val="17"/>
+              </w:rPr>
+              <w:t>Process design &gt; BPMN diagrams</w:t>
+            </w:r>
+          </w:p>
+        </w:tc>
+        <w:tc>
+          <w:tcPr>
+            <w:tcW w:w="1584" w:type="dxa"/>
+            <w:tcBorders>
+              <w:top w:val="single" w:sz="4" w:space="0" w:color="E3E3E4"/>
+              <w:left w:val="single" w:sz="4" w:space="0" w:color="E3E3E4"/>
+              <w:bottom w:val="single" w:sz="4" w:space="0" w:color="E3E3E4"/>
+              <w:right w:val="single" w:sz="4" w:space="0" w:color="E3E3E4"/>
+            </w:tcBorders>
+            <w:shd w:color="auto" w:fill="F2F2F3" w:val="clear"/>
+          </w:tcPr>
+          <w:p>
+            <w:pPr>
+              <w:pStyle w:val="Normal"/>
+              <w:spacing w:lineRule="auto" w:line="240" w:before="0" w:after="0"/>
+              <w:jc w:val="left"/>
+              <w:rPr/>
+            </w:pPr>
+            <w:r>
+              <w:rPr>
+                <w:rFonts w:eastAsia="Times New Roman" w:cs="Times New Roman"/>
+                <w:sz w:val="17"/>
+              </w:rPr>
+              <w:t>Implemented</w:t>
+            </w:r>
+          </w:p>
+        </w:tc>
+        <w:tc>
+          <w:tcPr>
+            <w:tcW w:w="892" w:type="dxa"/>
+            <w:tcBorders>
+              <w:top w:val="single" w:sz="4" w:space="0" w:color="E3E3E4"/>
+              <w:left w:val="single" w:sz="4" w:space="0" w:color="E3E3E4"/>
+              <w:bottom w:val="single" w:sz="4" w:space="0" w:color="E3E3E4"/>
+              <w:right w:val="single" w:sz="4" w:space="0" w:color="E3E3E4"/>
+            </w:tcBorders>
+            <w:shd w:color="auto" w:fill="D9EAD3" w:val="clear"/>
+          </w:tcPr>
+          <w:p>
+            <w:pPr>
+              <w:pStyle w:val="Normal"/>
+              <w:spacing w:lineRule="auto" w:line="240" w:before="0" w:after="0"/>
+              <w:jc w:val="left"/>
+              <w:rPr/>
+            </w:pPr>
+            <w:r>
+              <w:rPr>
+                <w:rFonts w:eastAsia="Times New Roman" w:cs="Times New Roman"/>
+                <w:sz w:val="17"/>
+              </w:rPr>
+              <w:t>Covered</w:t>
+            </w:r>
+          </w:p>
+        </w:tc>
+      </w:tr>
+      <w:tr>
+        <w:trPr/>
+        <w:tc>
+          <w:tcPr>
+            <w:tcW w:w="2591" w:type="dxa"/>
+            <w:tcBorders>
+              <w:top w:val="single" w:sz="4" w:space="0" w:color="E3E3E4"/>
+              <w:left w:val="single" w:sz="4" w:space="0" w:color="E3E3E4"/>
+              <w:bottom w:val="single" w:sz="4" w:space="0" w:color="E3E3E4"/>
+              <w:right w:val="single" w:sz="4" w:space="0" w:color="E3E3E4"/>
+            </w:tcBorders>
+          </w:tcPr>
+          <w:p>
+            <w:pPr>
+              <w:pStyle w:val="Normal"/>
+              <w:spacing w:lineRule="auto" w:line="240" w:before="0" w:after="0"/>
+              <w:jc w:val="left"/>
+              <w:rPr/>
+            </w:pPr>
+            <w:r>
+              <w:rPr>
+                <w:rFonts w:eastAsia="Times New Roman" w:cs="Times New Roman"/>
+                <w:sz w:val="17"/>
+              </w:rPr>
+              <w:t>Organize the modules for a better user experience</w:t>
+            </w:r>
+          </w:p>
+        </w:tc>
+        <w:tc>
+          <w:tcPr>
+            <w:tcW w:w="2737" w:type="dxa"/>
+            <w:tcBorders>
+              <w:top w:val="single" w:sz="4" w:space="0" w:color="E3E3E4"/>
+              <w:left w:val="single" w:sz="4" w:space="0" w:color="E3E3E4"/>
+              <w:bottom w:val="single" w:sz="4" w:space="0" w:color="E3E3E4"/>
+              <w:right w:val="single" w:sz="4" w:space="0" w:color="E3E3E4"/>
+            </w:tcBorders>
+          </w:tcPr>
+          <w:p>
+            <w:pPr>
+              <w:pStyle w:val="Normal"/>
+              <w:spacing w:lineRule="auto" w:line="240" w:before="0" w:after="0"/>
+              <w:jc w:val="left"/>
+              <w:rPr/>
+            </w:pPr>
+            <w:r>
+              <w:rPr>
+                <w:rFonts w:eastAsia="Times New Roman" w:cs="Times New Roman"/>
+                <w:sz w:val="17"/>
+              </w:rPr>
+              <w:t>Menu regrouped: Home, Portfolio, Process design, Governance &amp; risk, AI &amp; knowledge, Reports, Administration, Me</w:t>
+            </w:r>
+          </w:p>
+        </w:tc>
+        <w:tc>
+          <w:tcPr>
+            <w:tcW w:w="1944" w:type="dxa"/>
+            <w:tcBorders>
+              <w:top w:val="single" w:sz="4" w:space="0" w:color="E3E3E4"/>
+              <w:left w:val="single" w:sz="4" w:space="0" w:color="E3E3E4"/>
+              <w:bottom w:val="single" w:sz="4" w:space="0" w:color="E3E3E4"/>
+              <w:right w:val="single" w:sz="4" w:space="0" w:color="E3E3E4"/>
+            </w:tcBorders>
+          </w:tcPr>
+          <w:p>
+            <w:pPr>
+              <w:pStyle w:val="Normal"/>
+              <w:spacing w:lineRule="auto" w:line="240" w:before="0" w:after="0"/>
+              <w:jc w:val="left"/>
+              <w:rPr/>
+            </w:pPr>
+            <w:r>
+              <w:rPr>
+                <w:rFonts w:eastAsia="Times New Roman" w:cs="Times New Roman"/>
+                <w:sz w:val="17"/>
+              </w:rPr>
+              <w:t>Navigation bar</w:t>
+            </w:r>
+          </w:p>
+        </w:tc>
+        <w:tc>
+          <w:tcPr>
+            <w:tcW w:w="1584" w:type="dxa"/>
+            <w:tcBorders>
+              <w:top w:val="single" w:sz="4" w:space="0" w:color="E3E3E4"/>
+              <w:left w:val="single" w:sz="4" w:space="0" w:color="E3E3E4"/>
+              <w:bottom w:val="single" w:sz="4" w:space="0" w:color="E3E3E4"/>
+              <w:right w:val="single" w:sz="4" w:space="0" w:color="E3E3E4"/>
+            </w:tcBorders>
+          </w:tcPr>
+          <w:p>
+            <w:pPr>
+              <w:pStyle w:val="Normal"/>
+              <w:spacing w:lineRule="auto" w:line="240" w:before="0" w:after="0"/>
+              <w:jc w:val="left"/>
+              <w:rPr/>
+            </w:pPr>
+            <w:r>
+              <w:rPr>
+                <w:rFonts w:eastAsia="Times New Roman" w:cs="Times New Roman"/>
+                <w:sz w:val="17"/>
+              </w:rPr>
+              <w:t>Implemented</w:t>
+            </w:r>
+          </w:p>
+        </w:tc>
+        <w:tc>
+          <w:tcPr>
+            <w:tcW w:w="892" w:type="dxa"/>
+            <w:tcBorders>
+              <w:top w:val="single" w:sz="4" w:space="0" w:color="E3E3E4"/>
+              <w:left w:val="single" w:sz="4" w:space="0" w:color="E3E3E4"/>
+              <w:bottom w:val="single" w:sz="4" w:space="0" w:color="E3E3E4"/>
+              <w:right w:val="single" w:sz="4" w:space="0" w:color="E3E3E4"/>
+            </w:tcBorders>
+            <w:shd w:color="auto" w:fill="D9EAD3" w:val="clear"/>
+          </w:tcPr>
+          <w:p>
+            <w:pPr>
+              <w:pStyle w:val="Normal"/>
+              <w:spacing w:lineRule="auto" w:line="240" w:before="0" w:after="0"/>
+              <w:jc w:val="left"/>
+              <w:rPr/>
+            </w:pPr>
+            <w:r>
+              <w:rPr>
+                <w:rFonts w:eastAsia="Times New Roman" w:cs="Times New Roman"/>
+                <w:sz w:val="17"/>
+              </w:rPr>
+              <w:t>Covered</w:t>
+            </w:r>
+          </w:p>
+        </w:tc>
+      </w:tr>
+      <w:tr>
+        <w:trPr/>
+        <w:tc>
+          <w:tcPr>
+            <w:tcW w:w="2591" w:type="dxa"/>
+            <w:tcBorders>
+              <w:top w:val="single" w:sz="4" w:space="0" w:color="E3E3E4"/>
+              <w:left w:val="single" w:sz="4" w:space="0" w:color="E3E3E4"/>
+              <w:bottom w:val="single" w:sz="4" w:space="0" w:color="E3E3E4"/>
+              <w:right w:val="single" w:sz="4" w:space="0" w:color="E3E3E4"/>
+            </w:tcBorders>
+            <w:shd w:color="auto" w:fill="F2F2F3" w:val="clear"/>
+          </w:tcPr>
+          <w:p>
+            <w:pPr>
+              <w:pStyle w:val="Normal"/>
+              <w:spacing w:lineRule="auto" w:line="240" w:before="0" w:after="0"/>
+              <w:jc w:val="left"/>
+              <w:rPr/>
+            </w:pPr>
+            <w:r>
+              <w:rPr>
+                <w:rFonts w:eastAsia="Times New Roman" w:cs="Times New Roman"/>
+                <w:sz w:val="17"/>
+              </w:rPr>
+              <w:t>User Guide: scenarios start with Group (Yes/No), Organization, then Project(s); decision matrix</w:t>
+            </w:r>
+          </w:p>
+        </w:tc>
+        <w:tc>
+          <w:tcPr>
+            <w:tcW w:w="2737" w:type="dxa"/>
+            <w:tcBorders>
+              <w:top w:val="single" w:sz="4" w:space="0" w:color="E3E3E4"/>
+              <w:left w:val="single" w:sz="4" w:space="0" w:color="E3E3E4"/>
+              <w:bottom w:val="single" w:sz="4" w:space="0" w:color="E3E3E4"/>
+              <w:right w:val="single" w:sz="4" w:space="0" w:color="E3E3E4"/>
+            </w:tcBorders>
+            <w:shd w:color="auto" w:fill="F2F2F3" w:val="clear"/>
+          </w:tcPr>
+          <w:p>
+            <w:pPr>
+              <w:pStyle w:val="Normal"/>
+              <w:spacing w:lineRule="auto" w:line="240" w:before="0" w:after="0"/>
+              <w:jc w:val="left"/>
+              <w:rPr/>
+            </w:pPr>
+            <w:r>
+              <w:rPr>
+                <w:rFonts w:eastAsia="Times New Roman" w:cs="Times New Roman"/>
+                <w:sz w:val="17"/>
+              </w:rPr>
+              <w:t>Six runs with Step 0 tenancy; Chapter 4 Decision Matrix; in-app Decision matrix button</w:t>
+            </w:r>
+          </w:p>
+        </w:tc>
+        <w:tc>
+          <w:tcPr>
+            <w:tcW w:w="1944" w:type="dxa"/>
+            <w:tcBorders>
+              <w:top w:val="single" w:sz="4" w:space="0" w:color="E3E3E4"/>
+              <w:left w:val="single" w:sz="4" w:space="0" w:color="E3E3E4"/>
+              <w:bottom w:val="single" w:sz="4" w:space="0" w:color="E3E3E4"/>
+              <w:right w:val="single" w:sz="4" w:space="0" w:color="E3E3E4"/>
+            </w:tcBorders>
+            <w:shd w:color="auto" w:fill="F2F2F3" w:val="clear"/>
+          </w:tcPr>
+          <w:p>
+            <w:pPr>
+              <w:pStyle w:val="Normal"/>
+              <w:spacing w:lineRule="auto" w:line="240" w:before="0" w:after="0"/>
+              <w:jc w:val="left"/>
+              <w:rPr/>
+            </w:pPr>
+            <w:r>
+              <w:rPr>
+                <w:rFonts w:eastAsia="Times New Roman" w:cs="Times New Roman"/>
+                <w:sz w:val="17"/>
+              </w:rPr>
+              <w:t>User Guide</w:t>
+            </w:r>
+          </w:p>
+        </w:tc>
+        <w:tc>
+          <w:tcPr>
+            <w:tcW w:w="1584" w:type="dxa"/>
+            <w:tcBorders>
+              <w:top w:val="single" w:sz="4" w:space="0" w:color="E3E3E4"/>
+              <w:left w:val="single" w:sz="4" w:space="0" w:color="E3E3E4"/>
+              <w:bottom w:val="single" w:sz="4" w:space="0" w:color="E3E3E4"/>
+              <w:right w:val="single" w:sz="4" w:space="0" w:color="E3E3E4"/>
+            </w:tcBorders>
+            <w:shd w:color="auto" w:fill="F2F2F3" w:val="clear"/>
+          </w:tcPr>
+          <w:p>
+            <w:pPr>
+              <w:pStyle w:val="Normal"/>
+              <w:spacing w:lineRule="auto" w:line="240" w:before="0" w:after="0"/>
+              <w:jc w:val="left"/>
+              <w:rPr/>
+            </w:pPr>
+            <w:r>
+              <w:rPr>
+                <w:rFonts w:eastAsia="Times New Roman" w:cs="Times New Roman"/>
+                <w:sz w:val="17"/>
+              </w:rPr>
+              <w:t>6 runs replayed</w:t>
+            </w:r>
+          </w:p>
+        </w:tc>
+        <w:tc>
+          <w:tcPr>
+            <w:tcW w:w="892" w:type="dxa"/>
+            <w:tcBorders>
+              <w:top w:val="single" w:sz="4" w:space="0" w:color="E3E3E4"/>
+              <w:left w:val="single" w:sz="4" w:space="0" w:color="E3E3E4"/>
+              <w:bottom w:val="single" w:sz="4" w:space="0" w:color="E3E3E4"/>
+              <w:right w:val="single" w:sz="4" w:space="0" w:color="E3E3E4"/>
+            </w:tcBorders>
+            <w:shd w:color="auto" w:fill="D9EAD3" w:val="clear"/>
+          </w:tcPr>
+          <w:p>
+            <w:pPr>
+              <w:pStyle w:val="Normal"/>
+              <w:spacing w:lineRule="auto" w:line="240" w:before="0" w:after="0"/>
+              <w:jc w:val="left"/>
+              <w:rPr/>
+            </w:pPr>
+            <w:r>
+              <w:rPr>
+                <w:rFonts w:eastAsia="Times New Roman" w:cs="Times New Roman"/>
+                <w:sz w:val="17"/>
+              </w:rPr>
+              <w:t>Covered</w:t>
+            </w:r>
+          </w:p>
+        </w:tc>
+      </w:tr>
+    </w:tbl>
+    <w:p>
+      <w:pPr>
+        <w:pStyle w:val="Normal"/>
+        <w:spacing w:before="0" w:after="40"/>
+        <w:rPr/>
+      </w:pPr>
+      <w:r>
+        <w:rPr/>
+      </w:r>
+    </w:p>
+    <w:p>
+      <w:pPr>
+        <w:pStyle w:val="Heading1"/>
+        <w:rPr/>
+      </w:pPr>
+      <w:bookmarkStart w:id="8" w:name="__RefHeading___Toc1243_1420353814"/>
+      <w:bookmarkEnd w:id="8"/>
+      <w:r>
+        <w:rPr/>
+        <w:t>9. End-to-End Verification</w:t>
+      </w:r>
+    </w:p>
+    <w:p>
+      <w:pPr>
+        <w:pStyle w:val="Normal"/>
+        <w:rPr/>
+      </w:pPr>
+      <w:r>
+        <w:rPr>
+          <w:rFonts w:eastAsia="Times New Roman" w:cs="Times New Roman"/>
+        </w:rPr>
+        <w:t>The six User Guide runs were replayed through the application on a fresh database. Each one first created its group (if any) and its organization, then ran to the end state below.</w:t>
+      </w:r>
+    </w:p>
+    <w:tbl>
+      <w:tblPr>
+        <w:tblW w:w="9748" w:type="dxa"/>
+        <w:jc w:val="center"/>
+        <w:tblInd w:w="0" w:type="dxa"/>
+        <w:tblLayout w:type="fixed"/>
+        <w:tblCellMar>
+          <w:top w:w="0" w:type="dxa"/>
+          <w:left w:w="108" w:type="dxa"/>
+          <w:bottom w:w="0" w:type="dxa"/>
+          <w:right w:w="108" w:type="dxa"/>
+        </w:tblCellMar>
+        <w:tblLook w:val="04a0" w:noHBand="0" w:noVBand="1" w:firstColumn="1" w:lastRow="0" w:lastColumn="0" w:firstRow="1"/>
+      </w:tblPr>
+      <w:tblGrid>
+        <w:gridCol w:w="502"/>
+        <w:gridCol w:w="2593"/>
+        <w:gridCol w:w="2592"/>
+        <w:gridCol w:w="720"/>
+        <w:gridCol w:w="719"/>
+        <w:gridCol w:w="2621"/>
+      </w:tblGrid>
+      <w:tr>
+        <w:trPr>
+          <w:tblHeader w:val="true"/>
+        </w:trPr>
+        <w:tc>
+          <w:tcPr>
+            <w:tcW w:w="502" w:type="dxa"/>
             <w:tcBorders>
               <w:top w:val="single" w:sz="4" w:space="0" w:color="E3E3E4"/>
               <w:left w:val="single" w:sz="4" w:space="0" w:color="E3E3E4"/>
@@ -8232,7 +10446,7 @@
         </w:tc>
         <w:tc>
           <w:tcPr>
-            <w:tcW w:w="4176" w:type="dxa"/>
+            <w:tcW w:w="2593" w:type="dxa"/>
             <w:tcBorders>
               <w:top w:val="single" w:sz="4" w:space="0" w:color="E3E3E4"/>
               <w:left w:val="single" w:sz="4" w:space="0" w:color="E3E3E4"/>
@@ -8255,13 +10469,13 @@
                 <w:color w:val="FFFFFF"/>
                 <w:sz w:val="19"/>
               </w:rPr>
-              <w:t>Project</w:t>
-            </w:r>
-          </w:p>
-        </w:tc>
-        <w:tc>
-          <w:tcPr>
-            <w:tcW w:w="1152" w:type="dxa"/>
+              <w:t>Tenancy</w:t>
+            </w:r>
+          </w:p>
+        </w:tc>
+        <w:tc>
+          <w:tcPr>
+            <w:tcW w:w="2592" w:type="dxa"/>
             <w:tcBorders>
               <w:top w:val="single" w:sz="4" w:space="0" w:color="E3E3E4"/>
               <w:left w:val="single" w:sz="4" w:space="0" w:color="E3E3E4"/>
@@ -8284,13 +10498,13 @@
                 <w:color w:val="FFFFFF"/>
                 <w:sz w:val="19"/>
               </w:rPr>
-              <w:t>Track</w:t>
-            </w:r>
-          </w:p>
-        </w:tc>
-        <w:tc>
-          <w:tcPr>
-            <w:tcW w:w="1008" w:type="dxa"/>
+              <w:t>Project</w:t>
+            </w:r>
+          </w:p>
+        </w:tc>
+        <w:tc>
+          <w:tcPr>
+            <w:tcW w:w="720" w:type="dxa"/>
             <w:tcBorders>
               <w:top w:val="single" w:sz="4" w:space="0" w:color="E3E3E4"/>
               <w:left w:val="single" w:sz="4" w:space="0" w:color="E3E3E4"/>
@@ -8313,13 +10527,13 @@
                 <w:color w:val="FFFFFF"/>
                 <w:sz w:val="19"/>
               </w:rPr>
-              <w:t>Steps</w:t>
-            </w:r>
-          </w:p>
-        </w:tc>
-        <w:tc>
-          <w:tcPr>
-            <w:tcW w:w="2693" w:type="dxa"/>
+              <w:t>Track</w:t>
+            </w:r>
+          </w:p>
+        </w:tc>
+        <w:tc>
+          <w:tcPr>
+            <w:tcW w:w="719" w:type="dxa"/>
             <w:tcBorders>
               <w:top w:val="single" w:sz="4" w:space="0" w:color="E3E3E4"/>
               <w:left w:val="single" w:sz="4" w:space="0" w:color="E3E3E4"/>
@@ -8342,6 +10556,35 @@
                 <w:color w:val="FFFFFF"/>
                 <w:sz w:val="19"/>
               </w:rPr>
+              <w:t>Steps</w:t>
+            </w:r>
+          </w:p>
+        </w:tc>
+        <w:tc>
+          <w:tcPr>
+            <w:tcW w:w="2621" w:type="dxa"/>
+            <w:tcBorders>
+              <w:top w:val="single" w:sz="4" w:space="0" w:color="E3E3E4"/>
+              <w:left w:val="single" w:sz="4" w:space="0" w:color="E3E3E4"/>
+              <w:bottom w:val="single" w:sz="4" w:space="0" w:color="E3E3E4"/>
+              <w:right w:val="single" w:sz="4" w:space="0" w:color="E3E3E4"/>
+            </w:tcBorders>
+            <w:shd w:color="auto" w:fill="F8931D" w:val="clear"/>
+          </w:tcPr>
+          <w:p>
+            <w:pPr>
+              <w:pStyle w:val="Normal"/>
+              <w:spacing w:before="0" w:after="120"/>
+              <w:jc w:val="left"/>
+              <w:rPr/>
+            </w:pPr>
+            <w:r>
+              <w:rPr>
+                <w:rFonts w:eastAsia="Times New Roman" w:cs="Times New Roman"/>
+                <w:b/>
+                <w:color w:val="FFFFFF"/>
+                <w:sz w:val="19"/>
+              </w:rPr>
               <w:t>End state</w:t>
             </w:r>
           </w:p>
@@ -8351,6 +10594,110 @@
         <w:trPr/>
         <w:tc>
           <w:tcPr>
+            <w:tcW w:w="502" w:type="dxa"/>
+            <w:tcBorders>
+              <w:top w:val="single" w:sz="4" w:space="0" w:color="E3E3E4"/>
+              <w:left w:val="single" w:sz="4" w:space="0" w:color="E3E3E4"/>
+              <w:bottom w:val="single" w:sz="4" w:space="0" w:color="E3E3E4"/>
+              <w:right w:val="single" w:sz="4" w:space="0" w:color="E3E3E4"/>
+            </w:tcBorders>
+          </w:tcPr>
+          <w:p>
+            <w:pPr>
+              <w:pStyle w:val="Normal"/>
+              <w:spacing w:lineRule="auto" w:line="240" w:before="0" w:after="0"/>
+              <w:jc w:val="left"/>
+              <w:rPr/>
+            </w:pPr>
+            <w:r>
+              <w:rPr>
+                <w:rFonts w:eastAsia="Times New Roman" w:cs="Times New Roman"/>
+                <w:sz w:val="19"/>
+              </w:rPr>
+              <w:t>1</w:t>
+            </w:r>
+          </w:p>
+        </w:tc>
+        <w:tc>
+          <w:tcPr>
+            <w:tcW w:w="2593" w:type="dxa"/>
+            <w:tcBorders>
+              <w:top w:val="single" w:sz="4" w:space="0" w:color="E3E3E4"/>
+              <w:left w:val="single" w:sz="4" w:space="0" w:color="E3E3E4"/>
+              <w:bottom w:val="single" w:sz="4" w:space="0" w:color="E3E3E4"/>
+              <w:right w:val="single" w:sz="4" w:space="0" w:color="E3E3E4"/>
+            </w:tcBorders>
+          </w:tcPr>
+          <w:p>
+            <w:pPr>
+              <w:pStyle w:val="Normal"/>
+              <w:spacing w:lineRule="auto" w:line="240" w:before="0" w:after="0"/>
+              <w:jc w:val="left"/>
+              <w:rPr/>
+            </w:pPr>
+            <w:r>
+              <w:rPr>
+                <w:rFonts w:eastAsia="Times New Roman" w:cs="Times New Roman"/>
+                <w:sz w:val="19"/>
+              </w:rPr>
+              <w:t>Group: No &gt; Harbourview City Services</w:t>
+            </w:r>
+          </w:p>
+        </w:tc>
+        <w:tc>
+          <w:tcPr>
+            <w:tcW w:w="2592" w:type="dxa"/>
+            <w:tcBorders>
+              <w:top w:val="single" w:sz="4" w:space="0" w:color="E3E3E4"/>
+              <w:left w:val="single" w:sz="4" w:space="0" w:color="E3E3E4"/>
+              <w:bottom w:val="single" w:sz="4" w:space="0" w:color="E3E3E4"/>
+              <w:right w:val="single" w:sz="4" w:space="0" w:color="E3E3E4"/>
+            </w:tcBorders>
+          </w:tcPr>
+          <w:p>
+            <w:pPr>
+              <w:pStyle w:val="Normal"/>
+              <w:spacing w:lineRule="auto" w:line="240" w:before="0" w:after="0"/>
+              <w:jc w:val="left"/>
+              <w:rPr/>
+            </w:pPr>
+            <w:r>
+              <w:rPr>
+                <w:rFonts w:eastAsia="Times New Roman" w:cs="Times New Roman"/>
+                <w:sz w:val="19"/>
+              </w:rPr>
+              <w:t>HAR-001 Online Parking Permit Renewal</w:t>
+            </w:r>
+          </w:p>
+        </w:tc>
+        <w:tc>
+          <w:tcPr>
+            <w:tcW w:w="720" w:type="dxa"/>
+            <w:tcBorders>
+              <w:top w:val="single" w:sz="4" w:space="0" w:color="E3E3E4"/>
+              <w:left w:val="single" w:sz="4" w:space="0" w:color="E3E3E4"/>
+              <w:bottom w:val="single" w:sz="4" w:space="0" w:color="E3E3E4"/>
+              <w:right w:val="single" w:sz="4" w:space="0" w:color="E3E3E4"/>
+            </w:tcBorders>
+          </w:tcPr>
+          <w:p>
+            <w:pPr>
+              <w:pStyle w:val="Normal"/>
+              <w:spacing w:lineRule="auto" w:line="240" w:before="0" w:after="0"/>
+              <w:jc w:val="left"/>
+              <w:rPr/>
+            </w:pPr>
+            <w:r>
+              <w:rPr>
+                <w:rFonts w:eastAsia="Times New Roman" w:cs="Times New Roman"/>
+                <w:sz w:val="19"/>
+              </w:rPr>
+              <w:t>Fast</w:t>
+            </w:r>
+          </w:p>
+        </w:tc>
+        <w:tc>
+          <w:tcPr>
             <w:tcW w:w="719" w:type="dxa"/>
             <w:tcBorders>
               <w:top w:val="single" w:sz="4" w:space="0" w:color="E3E3E4"/>
@@ -8371,91 +10718,13 @@
                 <w:rFonts w:eastAsia="Times New Roman" w:cs="Times New Roman"/>
                 <w:sz w:val="19"/>
               </w:rPr>
-              <w:t>1</w:t>
-            </w:r>
-          </w:p>
-        </w:tc>
-        <w:tc>
-          <w:tcPr>
-            <w:tcW w:w="4176" w:type="dxa"/>
-            <w:tcBorders>
-              <w:top w:val="single" w:sz="4" w:space="0" w:color="E3E3E4"/>
-              <w:left w:val="single" w:sz="4" w:space="0" w:color="E3E3E4"/>
-              <w:bottom w:val="single" w:sz="4" w:space="0" w:color="E3E3E4"/>
-              <w:right w:val="single" w:sz="4" w:space="0" w:color="E3E3E4"/>
-            </w:tcBorders>
-          </w:tcPr>
-          <w:p>
-            <w:pPr>
-              <w:pStyle w:val="Normal"/>
-              <w:spacing w:lineRule="auto" w:line="240" w:before="0" w:after="0"/>
-              <w:jc w:val="left"/>
-              <w:rPr/>
-            </w:pPr>
-            <w:r>
-              <w:rPr>
-                <w:rFonts w:eastAsia="Times New Roman" w:cs="Times New Roman"/>
-                <w:sz w:val="19"/>
-              </w:rPr>
-              <w:t>PUB-022 Online Parking Permit Renewal</w:t>
-            </w:r>
-          </w:p>
-        </w:tc>
-        <w:tc>
-          <w:tcPr>
-            <w:tcW w:w="1152" w:type="dxa"/>
-            <w:tcBorders>
-              <w:top w:val="single" w:sz="4" w:space="0" w:color="E3E3E4"/>
-              <w:left w:val="single" w:sz="4" w:space="0" w:color="E3E3E4"/>
-              <w:bottom w:val="single" w:sz="4" w:space="0" w:color="E3E3E4"/>
-              <w:right w:val="single" w:sz="4" w:space="0" w:color="E3E3E4"/>
-            </w:tcBorders>
-          </w:tcPr>
-          <w:p>
-            <w:pPr>
-              <w:pStyle w:val="Normal"/>
-              <w:spacing w:lineRule="auto" w:line="240" w:before="0" w:after="0"/>
-              <w:jc w:val="left"/>
-              <w:rPr/>
-            </w:pPr>
-            <w:r>
-              <w:rPr>
-                <w:rFonts w:eastAsia="Times New Roman" w:cs="Times New Roman"/>
-                <w:sz w:val="19"/>
-              </w:rPr>
-              <w:t>Fast</w:t>
-            </w:r>
-          </w:p>
-        </w:tc>
-        <w:tc>
-          <w:tcPr>
-            <w:tcW w:w="1008" w:type="dxa"/>
-            <w:tcBorders>
-              <w:top w:val="single" w:sz="4" w:space="0" w:color="E3E3E4"/>
-              <w:left w:val="single" w:sz="4" w:space="0" w:color="E3E3E4"/>
-              <w:bottom w:val="single" w:sz="4" w:space="0" w:color="E3E3E4"/>
-              <w:right w:val="single" w:sz="4" w:space="0" w:color="E3E3E4"/>
-            </w:tcBorders>
-          </w:tcPr>
-          <w:p>
-            <w:pPr>
-              <w:pStyle w:val="Normal"/>
-              <w:spacing w:lineRule="auto" w:line="240" w:before="0" w:after="0"/>
-              <w:jc w:val="left"/>
-              <w:rPr/>
-            </w:pPr>
-            <w:r>
-              <w:rPr>
-                <w:rFonts w:eastAsia="Times New Roman" w:cs="Times New Roman"/>
-                <w:sz w:val="19"/>
-              </w:rPr>
               <w:t>29</w:t>
             </w:r>
           </w:p>
         </w:tc>
         <w:tc>
           <w:tcPr>
-            <w:tcW w:w="2693" w:type="dxa"/>
+            <w:tcW w:w="2621" w:type="dxa"/>
             <w:tcBorders>
               <w:top w:val="single" w:sz="4" w:space="0" w:color="E3E3E4"/>
               <w:left w:val="single" w:sz="4" w:space="0" w:color="E3E3E4"/>
@@ -8484,6 +10753,114 @@
         <w:trPr/>
         <w:tc>
           <w:tcPr>
+            <w:tcW w:w="502" w:type="dxa"/>
+            <w:tcBorders>
+              <w:top w:val="single" w:sz="4" w:space="0" w:color="E3E3E4"/>
+              <w:left w:val="single" w:sz="4" w:space="0" w:color="E3E3E4"/>
+              <w:bottom w:val="single" w:sz="4" w:space="0" w:color="E3E3E4"/>
+              <w:right w:val="single" w:sz="4" w:space="0" w:color="E3E3E4"/>
+            </w:tcBorders>
+            <w:shd w:color="auto" w:fill="F2F2F3" w:val="clear"/>
+          </w:tcPr>
+          <w:p>
+            <w:pPr>
+              <w:pStyle w:val="Normal"/>
+              <w:spacing w:lineRule="auto" w:line="240" w:before="0" w:after="0"/>
+              <w:jc w:val="left"/>
+              <w:rPr/>
+            </w:pPr>
+            <w:r>
+              <w:rPr>
+                <w:rFonts w:eastAsia="Times New Roman" w:cs="Times New Roman"/>
+                <w:sz w:val="19"/>
+              </w:rPr>
+              <w:t>2</w:t>
+            </w:r>
+          </w:p>
+        </w:tc>
+        <w:tc>
+          <w:tcPr>
+            <w:tcW w:w="2593" w:type="dxa"/>
+            <w:tcBorders>
+              <w:top w:val="single" w:sz="4" w:space="0" w:color="E3E3E4"/>
+              <w:left w:val="single" w:sz="4" w:space="0" w:color="E3E3E4"/>
+              <w:bottom w:val="single" w:sz="4" w:space="0" w:color="E3E3E4"/>
+              <w:right w:val="single" w:sz="4" w:space="0" w:color="E3E3E4"/>
+            </w:tcBorders>
+            <w:shd w:color="auto" w:fill="F2F2F3" w:val="clear"/>
+          </w:tcPr>
+          <w:p>
+            <w:pPr>
+              <w:pStyle w:val="Normal"/>
+              <w:spacing w:lineRule="auto" w:line="240" w:before="0" w:after="0"/>
+              <w:jc w:val="left"/>
+              <w:rPr/>
+            </w:pPr>
+            <w:r>
+              <w:rPr>
+                <w:rFonts w:eastAsia="Times New Roman" w:cs="Times New Roman"/>
+                <w:sz w:val="19"/>
+              </w:rPr>
+              <w:t>Group: Yes (Meridian Mobility Holding) &gt; Northline Regional Transit</w:t>
+            </w:r>
+          </w:p>
+        </w:tc>
+        <w:tc>
+          <w:tcPr>
+            <w:tcW w:w="2592" w:type="dxa"/>
+            <w:tcBorders>
+              <w:top w:val="single" w:sz="4" w:space="0" w:color="E3E3E4"/>
+              <w:left w:val="single" w:sz="4" w:space="0" w:color="E3E3E4"/>
+              <w:bottom w:val="single" w:sz="4" w:space="0" w:color="E3E3E4"/>
+              <w:right w:val="single" w:sz="4" w:space="0" w:color="E3E3E4"/>
+            </w:tcBorders>
+            <w:shd w:color="auto" w:fill="F2F2F3" w:val="clear"/>
+          </w:tcPr>
+          <w:p>
+            <w:pPr>
+              <w:pStyle w:val="Normal"/>
+              <w:spacing w:lineRule="auto" w:line="240" w:before="0" w:after="0"/>
+              <w:jc w:val="left"/>
+              <w:rPr/>
+            </w:pPr>
+            <w:r>
+              <w:rPr>
+                <w:rFonts w:eastAsia="Times New Roman" w:cs="Times New Roman"/>
+                <w:sz w:val="19"/>
+              </w:rPr>
+              <w:t>NOR-001 Real-time Bus Crowding Indicator</w:t>
+            </w:r>
+          </w:p>
+        </w:tc>
+        <w:tc>
+          <w:tcPr>
+            <w:tcW w:w="720" w:type="dxa"/>
+            <w:tcBorders>
+              <w:top w:val="single" w:sz="4" w:space="0" w:color="E3E3E4"/>
+              <w:left w:val="single" w:sz="4" w:space="0" w:color="E3E3E4"/>
+              <w:bottom w:val="single" w:sz="4" w:space="0" w:color="E3E3E4"/>
+              <w:right w:val="single" w:sz="4" w:space="0" w:color="E3E3E4"/>
+            </w:tcBorders>
+            <w:shd w:color="auto" w:fill="F2F2F3" w:val="clear"/>
+          </w:tcPr>
+          <w:p>
+            <w:pPr>
+              <w:pStyle w:val="Normal"/>
+              <w:spacing w:lineRule="auto" w:line="240" w:before="0" w:after="0"/>
+              <w:jc w:val="left"/>
+              <w:rPr/>
+            </w:pPr>
+            <w:r>
+              <w:rPr>
+                <w:rFonts w:eastAsia="Times New Roman" w:cs="Times New Roman"/>
+                <w:sz w:val="19"/>
+              </w:rPr>
+              <w:t>Fast</w:t>
+            </w:r>
+          </w:p>
+        </w:tc>
+        <w:tc>
+          <w:tcPr>
             <w:tcW w:w="719" w:type="dxa"/>
             <w:tcBorders>
               <w:top w:val="single" w:sz="4" w:space="0" w:color="E3E3E4"/>
@@ -8505,94 +10882,13 @@
                 <w:rFonts w:eastAsia="Times New Roman" w:cs="Times New Roman"/>
                 <w:sz w:val="19"/>
               </w:rPr>
-              <w:t>2</w:t>
-            </w:r>
-          </w:p>
-        </w:tc>
-        <w:tc>
-          <w:tcPr>
-            <w:tcW w:w="4176" w:type="dxa"/>
-            <w:tcBorders>
-              <w:top w:val="single" w:sz="4" w:space="0" w:color="E3E3E4"/>
-              <w:left w:val="single" w:sz="4" w:space="0" w:color="E3E3E4"/>
-              <w:bottom w:val="single" w:sz="4" w:space="0" w:color="E3E3E4"/>
-              <w:right w:val="single" w:sz="4" w:space="0" w:color="E3E3E4"/>
-            </w:tcBorders>
-            <w:shd w:color="auto" w:fill="F2F2F3" w:val="clear"/>
-          </w:tcPr>
-          <w:p>
-            <w:pPr>
-              <w:pStyle w:val="Normal"/>
-              <w:spacing w:lineRule="auto" w:line="240" w:before="0" w:after="0"/>
-              <w:jc w:val="left"/>
-              <w:rPr/>
-            </w:pPr>
-            <w:r>
-              <w:rPr>
-                <w:rFonts w:eastAsia="Times New Roman" w:cs="Times New Roman"/>
-                <w:sz w:val="19"/>
-              </w:rPr>
-              <w:t>TRN-022 Real-time Bus Crowding Indicator</w:t>
-            </w:r>
-          </w:p>
-        </w:tc>
-        <w:tc>
-          <w:tcPr>
-            <w:tcW w:w="1152" w:type="dxa"/>
-            <w:tcBorders>
-              <w:top w:val="single" w:sz="4" w:space="0" w:color="E3E3E4"/>
-              <w:left w:val="single" w:sz="4" w:space="0" w:color="E3E3E4"/>
-              <w:bottom w:val="single" w:sz="4" w:space="0" w:color="E3E3E4"/>
-              <w:right w:val="single" w:sz="4" w:space="0" w:color="E3E3E4"/>
-            </w:tcBorders>
-            <w:shd w:color="auto" w:fill="F2F2F3" w:val="clear"/>
-          </w:tcPr>
-          <w:p>
-            <w:pPr>
-              <w:pStyle w:val="Normal"/>
-              <w:spacing w:lineRule="auto" w:line="240" w:before="0" w:after="0"/>
-              <w:jc w:val="left"/>
-              <w:rPr/>
-            </w:pPr>
-            <w:r>
-              <w:rPr>
-                <w:rFonts w:eastAsia="Times New Roman" w:cs="Times New Roman"/>
-                <w:sz w:val="19"/>
-              </w:rPr>
-              <w:t>Fast</w:t>
-            </w:r>
-          </w:p>
-        </w:tc>
-        <w:tc>
-          <w:tcPr>
-            <w:tcW w:w="1008" w:type="dxa"/>
-            <w:tcBorders>
-              <w:top w:val="single" w:sz="4" w:space="0" w:color="E3E3E4"/>
-              <w:left w:val="single" w:sz="4" w:space="0" w:color="E3E3E4"/>
-              <w:bottom w:val="single" w:sz="4" w:space="0" w:color="E3E3E4"/>
-              <w:right w:val="single" w:sz="4" w:space="0" w:color="E3E3E4"/>
-            </w:tcBorders>
-            <w:shd w:color="auto" w:fill="F2F2F3" w:val="clear"/>
-          </w:tcPr>
-          <w:p>
-            <w:pPr>
-              <w:pStyle w:val="Normal"/>
-              <w:spacing w:lineRule="auto" w:line="240" w:before="0" w:after="0"/>
-              <w:jc w:val="left"/>
-              <w:rPr/>
-            </w:pPr>
-            <w:r>
-              <w:rPr>
-                <w:rFonts w:eastAsia="Times New Roman" w:cs="Times New Roman"/>
-                <w:sz w:val="19"/>
-              </w:rPr>
               <w:t>32</w:t>
             </w:r>
           </w:p>
         </w:tc>
         <w:tc>
           <w:tcPr>
-            <w:tcW w:w="2693" w:type="dxa"/>
+            <w:tcW w:w="2621" w:type="dxa"/>
             <w:tcBorders>
               <w:top w:val="single" w:sz="4" w:space="0" w:color="E3E3E4"/>
               <w:left w:val="single" w:sz="4" w:space="0" w:color="E3E3E4"/>
@@ -8622,6 +10918,110 @@
         <w:trPr/>
         <w:tc>
           <w:tcPr>
+            <w:tcW w:w="502" w:type="dxa"/>
+            <w:tcBorders>
+              <w:top w:val="single" w:sz="4" w:space="0" w:color="E3E3E4"/>
+              <w:left w:val="single" w:sz="4" w:space="0" w:color="E3E3E4"/>
+              <w:bottom w:val="single" w:sz="4" w:space="0" w:color="E3E3E4"/>
+              <w:right w:val="single" w:sz="4" w:space="0" w:color="E3E3E4"/>
+            </w:tcBorders>
+          </w:tcPr>
+          <w:p>
+            <w:pPr>
+              <w:pStyle w:val="Normal"/>
+              <w:spacing w:lineRule="auto" w:line="240" w:before="0" w:after="0"/>
+              <w:jc w:val="left"/>
+              <w:rPr/>
+            </w:pPr>
+            <w:r>
+              <w:rPr>
+                <w:rFonts w:eastAsia="Times New Roman" w:cs="Times New Roman"/>
+                <w:sz w:val="19"/>
+              </w:rPr>
+              <w:t>3</w:t>
+            </w:r>
+          </w:p>
+        </w:tc>
+        <w:tc>
+          <w:tcPr>
+            <w:tcW w:w="2593" w:type="dxa"/>
+            <w:tcBorders>
+              <w:top w:val="single" w:sz="4" w:space="0" w:color="E3E3E4"/>
+              <w:left w:val="single" w:sz="4" w:space="0" w:color="E3E3E4"/>
+              <w:bottom w:val="single" w:sz="4" w:space="0" w:color="E3E3E4"/>
+              <w:right w:val="single" w:sz="4" w:space="0" w:color="E3E3E4"/>
+            </w:tcBorders>
+          </w:tcPr>
+          <w:p>
+            <w:pPr>
+              <w:pStyle w:val="Normal"/>
+              <w:spacing w:lineRule="auto" w:line="240" w:before="0" w:after="0"/>
+              <w:jc w:val="left"/>
+              <w:rPr/>
+            </w:pPr>
+            <w:r>
+              <w:rPr>
+                <w:rFonts w:eastAsia="Times New Roman" w:cs="Times New Roman"/>
+                <w:sz w:val="19"/>
+              </w:rPr>
+              <w:t>Group: Yes (Crescent Agro-Energy Group) &gt; Oasis Fresh Dairies</w:t>
+            </w:r>
+          </w:p>
+        </w:tc>
+        <w:tc>
+          <w:tcPr>
+            <w:tcW w:w="2592" w:type="dxa"/>
+            <w:tcBorders>
+              <w:top w:val="single" w:sz="4" w:space="0" w:color="E3E3E4"/>
+              <w:left w:val="single" w:sz="4" w:space="0" w:color="E3E3E4"/>
+              <w:bottom w:val="single" w:sz="4" w:space="0" w:color="E3E3E4"/>
+              <w:right w:val="single" w:sz="4" w:space="0" w:color="E3E3E4"/>
+            </w:tcBorders>
+          </w:tcPr>
+          <w:p>
+            <w:pPr>
+              <w:pStyle w:val="Normal"/>
+              <w:spacing w:lineRule="auto" w:line="240" w:before="0" w:after="0"/>
+              <w:jc w:val="left"/>
+              <w:rPr/>
+            </w:pPr>
+            <w:r>
+              <w:rPr>
+                <w:rFonts w:eastAsia="Times New Roman" w:cs="Times New Roman"/>
+                <w:sz w:val="19"/>
+              </w:rPr>
+              <w:t>OAS-001 Lactose-free Greek Yogurt 500 g</w:t>
+            </w:r>
+          </w:p>
+        </w:tc>
+        <w:tc>
+          <w:tcPr>
+            <w:tcW w:w="720" w:type="dxa"/>
+            <w:tcBorders>
+              <w:top w:val="single" w:sz="4" w:space="0" w:color="E3E3E4"/>
+              <w:left w:val="single" w:sz="4" w:space="0" w:color="E3E3E4"/>
+              <w:bottom w:val="single" w:sz="4" w:space="0" w:color="E3E3E4"/>
+              <w:right w:val="single" w:sz="4" w:space="0" w:color="E3E3E4"/>
+            </w:tcBorders>
+          </w:tcPr>
+          <w:p>
+            <w:pPr>
+              <w:pStyle w:val="Normal"/>
+              <w:spacing w:lineRule="auto" w:line="240" w:before="0" w:after="0"/>
+              <w:jc w:val="left"/>
+              <w:rPr/>
+            </w:pPr>
+            <w:r>
+              <w:rPr>
+                <w:rFonts w:eastAsia="Times New Roman" w:cs="Times New Roman"/>
+                <w:sz w:val="19"/>
+              </w:rPr>
+              <w:t>Light</w:t>
+            </w:r>
+          </w:p>
+        </w:tc>
+        <w:tc>
+          <w:tcPr>
             <w:tcW w:w="719" w:type="dxa"/>
             <w:tcBorders>
               <w:top w:val="single" w:sz="4" w:space="0" w:color="E3E3E4"/>
@@ -8642,91 +11042,13 @@
                 <w:rFonts w:eastAsia="Times New Roman" w:cs="Times New Roman"/>
                 <w:sz w:val="19"/>
               </w:rPr>
-              <w:t>3</w:t>
-            </w:r>
-          </w:p>
-        </w:tc>
-        <w:tc>
-          <w:tcPr>
-            <w:tcW w:w="4176" w:type="dxa"/>
-            <w:tcBorders>
-              <w:top w:val="single" w:sz="4" w:space="0" w:color="E3E3E4"/>
-              <w:left w:val="single" w:sz="4" w:space="0" w:color="E3E3E4"/>
-              <w:bottom w:val="single" w:sz="4" w:space="0" w:color="E3E3E4"/>
-              <w:right w:val="single" w:sz="4" w:space="0" w:color="E3E3E4"/>
-            </w:tcBorders>
-          </w:tcPr>
-          <w:p>
-            <w:pPr>
-              <w:pStyle w:val="Normal"/>
-              <w:spacing w:lineRule="auto" w:line="240" w:before="0" w:after="0"/>
-              <w:jc w:val="left"/>
-              <w:rPr/>
-            </w:pPr>
-            <w:r>
-              <w:rPr>
-                <w:rFonts w:eastAsia="Times New Roman" w:cs="Times New Roman"/>
-                <w:sz w:val="19"/>
-              </w:rPr>
-              <w:t>DAI-022 Lactose-free Greek Yogurt 500 g</w:t>
-            </w:r>
-          </w:p>
-        </w:tc>
-        <w:tc>
-          <w:tcPr>
-            <w:tcW w:w="1152" w:type="dxa"/>
-            <w:tcBorders>
-              <w:top w:val="single" w:sz="4" w:space="0" w:color="E3E3E4"/>
-              <w:left w:val="single" w:sz="4" w:space="0" w:color="E3E3E4"/>
-              <w:bottom w:val="single" w:sz="4" w:space="0" w:color="E3E3E4"/>
-              <w:right w:val="single" w:sz="4" w:space="0" w:color="E3E3E4"/>
-            </w:tcBorders>
-          </w:tcPr>
-          <w:p>
-            <w:pPr>
-              <w:pStyle w:val="Normal"/>
-              <w:spacing w:lineRule="auto" w:line="240" w:before="0" w:after="0"/>
-              <w:jc w:val="left"/>
-              <w:rPr/>
-            </w:pPr>
-            <w:r>
-              <w:rPr>
-                <w:rFonts w:eastAsia="Times New Roman" w:cs="Times New Roman"/>
-                <w:sz w:val="19"/>
-              </w:rPr>
-              <w:t>Light</w:t>
-            </w:r>
-          </w:p>
-        </w:tc>
-        <w:tc>
-          <w:tcPr>
-            <w:tcW w:w="1008" w:type="dxa"/>
-            <w:tcBorders>
-              <w:top w:val="single" w:sz="4" w:space="0" w:color="E3E3E4"/>
-              <w:left w:val="single" w:sz="4" w:space="0" w:color="E3E3E4"/>
-              <w:bottom w:val="single" w:sz="4" w:space="0" w:color="E3E3E4"/>
-              <w:right w:val="single" w:sz="4" w:space="0" w:color="E3E3E4"/>
-            </w:tcBorders>
-          </w:tcPr>
-          <w:p>
-            <w:pPr>
-              <w:pStyle w:val="Normal"/>
-              <w:spacing w:lineRule="auto" w:line="240" w:before="0" w:after="0"/>
-              <w:jc w:val="left"/>
-              <w:rPr/>
-            </w:pPr>
-            <w:r>
-              <w:rPr>
-                <w:rFonts w:eastAsia="Times New Roman" w:cs="Times New Roman"/>
-                <w:sz w:val="19"/>
-              </w:rPr>
               <w:t>78</w:t>
             </w:r>
           </w:p>
         </w:tc>
         <w:tc>
           <w:tcPr>
-            <w:tcW w:w="2693" w:type="dxa"/>
+            <w:tcW w:w="2621" w:type="dxa"/>
             <w:tcBorders>
               <w:top w:val="single" w:sz="4" w:space="0" w:color="E3E3E4"/>
               <w:left w:val="single" w:sz="4" w:space="0" w:color="E3E3E4"/>
@@ -8755,6 +11077,114 @@
         <w:trPr/>
         <w:tc>
           <w:tcPr>
+            <w:tcW w:w="502" w:type="dxa"/>
+            <w:tcBorders>
+              <w:top w:val="single" w:sz="4" w:space="0" w:color="E3E3E4"/>
+              <w:left w:val="single" w:sz="4" w:space="0" w:color="E3E3E4"/>
+              <w:bottom w:val="single" w:sz="4" w:space="0" w:color="E3E3E4"/>
+              <w:right w:val="single" w:sz="4" w:space="0" w:color="E3E3E4"/>
+            </w:tcBorders>
+            <w:shd w:color="auto" w:fill="F2F2F3" w:val="clear"/>
+          </w:tcPr>
+          <w:p>
+            <w:pPr>
+              <w:pStyle w:val="Normal"/>
+              <w:spacing w:lineRule="auto" w:line="240" w:before="0" w:after="0"/>
+              <w:jc w:val="left"/>
+              <w:rPr/>
+            </w:pPr>
+            <w:r>
+              <w:rPr>
+                <w:rFonts w:eastAsia="Times New Roman" w:cs="Times New Roman"/>
+                <w:sz w:val="19"/>
+              </w:rPr>
+              <w:t>4</w:t>
+            </w:r>
+          </w:p>
+        </w:tc>
+        <w:tc>
+          <w:tcPr>
+            <w:tcW w:w="2593" w:type="dxa"/>
+            <w:tcBorders>
+              <w:top w:val="single" w:sz="4" w:space="0" w:color="E3E3E4"/>
+              <w:left w:val="single" w:sz="4" w:space="0" w:color="E3E3E4"/>
+              <w:bottom w:val="single" w:sz="4" w:space="0" w:color="E3E3E4"/>
+              <w:right w:val="single" w:sz="4" w:space="0" w:color="E3E3E4"/>
+            </w:tcBorders>
+            <w:shd w:color="auto" w:fill="F2F2F3" w:val="clear"/>
+          </w:tcPr>
+          <w:p>
+            <w:pPr>
+              <w:pStyle w:val="Normal"/>
+              <w:spacing w:lineRule="auto" w:line="240" w:before="0" w:after="0"/>
+              <w:jc w:val="left"/>
+              <w:rPr/>
+            </w:pPr>
+            <w:r>
+              <w:rPr>
+                <w:rFonts w:eastAsia="Times New Roman" w:cs="Times New Roman"/>
+                <w:sz w:val="19"/>
+              </w:rPr>
+              <w:t>Group: No &gt; Clearwater Medical Devices</w:t>
+            </w:r>
+          </w:p>
+        </w:tc>
+        <w:tc>
+          <w:tcPr>
+            <w:tcW w:w="2592" w:type="dxa"/>
+            <w:tcBorders>
+              <w:top w:val="single" w:sz="4" w:space="0" w:color="E3E3E4"/>
+              <w:left w:val="single" w:sz="4" w:space="0" w:color="E3E3E4"/>
+              <w:bottom w:val="single" w:sz="4" w:space="0" w:color="E3E3E4"/>
+              <w:right w:val="single" w:sz="4" w:space="0" w:color="E3E3E4"/>
+            </w:tcBorders>
+            <w:shd w:color="auto" w:fill="F2F2F3" w:val="clear"/>
+          </w:tcPr>
+          <w:p>
+            <w:pPr>
+              <w:pStyle w:val="Normal"/>
+              <w:spacing w:lineRule="auto" w:line="240" w:before="0" w:after="0"/>
+              <w:jc w:val="left"/>
+              <w:rPr/>
+            </w:pPr>
+            <w:r>
+              <w:rPr>
+                <w:rFonts w:eastAsia="Times New Roman" w:cs="Times New Roman"/>
+                <w:sz w:val="19"/>
+              </w:rPr>
+              <w:t>CLE-001 Remote Cardiac Monitoring Patch</w:t>
+            </w:r>
+          </w:p>
+        </w:tc>
+        <w:tc>
+          <w:tcPr>
+            <w:tcW w:w="720" w:type="dxa"/>
+            <w:tcBorders>
+              <w:top w:val="single" w:sz="4" w:space="0" w:color="E3E3E4"/>
+              <w:left w:val="single" w:sz="4" w:space="0" w:color="E3E3E4"/>
+              <w:bottom w:val="single" w:sz="4" w:space="0" w:color="E3E3E4"/>
+              <w:right w:val="single" w:sz="4" w:space="0" w:color="E3E3E4"/>
+            </w:tcBorders>
+            <w:shd w:color="auto" w:fill="F2F2F3" w:val="clear"/>
+          </w:tcPr>
+          <w:p>
+            <w:pPr>
+              <w:pStyle w:val="Normal"/>
+              <w:spacing w:lineRule="auto" w:line="240" w:before="0" w:after="0"/>
+              <w:jc w:val="left"/>
+              <w:rPr/>
+            </w:pPr>
+            <w:r>
+              <w:rPr>
+                <w:rFonts w:eastAsia="Times New Roman" w:cs="Times New Roman"/>
+                <w:sz w:val="19"/>
+              </w:rPr>
+              <w:t>Full</w:t>
+            </w:r>
+          </w:p>
+        </w:tc>
+        <w:tc>
+          <w:tcPr>
             <w:tcW w:w="719" w:type="dxa"/>
             <w:tcBorders>
               <w:top w:val="single" w:sz="4" w:space="0" w:color="E3E3E4"/>
@@ -8776,94 +11206,13 @@
                 <w:rFonts w:eastAsia="Times New Roman" w:cs="Times New Roman"/>
                 <w:sz w:val="19"/>
               </w:rPr>
-              <w:t>4</w:t>
-            </w:r>
-          </w:p>
-        </w:tc>
-        <w:tc>
-          <w:tcPr>
-            <w:tcW w:w="4176" w:type="dxa"/>
-            <w:tcBorders>
-              <w:top w:val="single" w:sz="4" w:space="0" w:color="E3E3E4"/>
-              <w:left w:val="single" w:sz="4" w:space="0" w:color="E3E3E4"/>
-              <w:bottom w:val="single" w:sz="4" w:space="0" w:color="E3E3E4"/>
-              <w:right w:val="single" w:sz="4" w:space="0" w:color="E3E3E4"/>
-            </w:tcBorders>
-            <w:shd w:color="auto" w:fill="F2F2F3" w:val="clear"/>
-          </w:tcPr>
-          <w:p>
-            <w:pPr>
-              <w:pStyle w:val="Normal"/>
-              <w:spacing w:lineRule="auto" w:line="240" w:before="0" w:after="0"/>
-              <w:jc w:val="left"/>
-              <w:rPr/>
-            </w:pPr>
-            <w:r>
-              <w:rPr>
-                <w:rFonts w:eastAsia="Times New Roman" w:cs="Times New Roman"/>
-                <w:sz w:val="19"/>
-              </w:rPr>
-              <w:t>HLT-022 Remote Cardiac Monitoring Patch</w:t>
-            </w:r>
-          </w:p>
-        </w:tc>
-        <w:tc>
-          <w:tcPr>
-            <w:tcW w:w="1152" w:type="dxa"/>
-            <w:tcBorders>
-              <w:top w:val="single" w:sz="4" w:space="0" w:color="E3E3E4"/>
-              <w:left w:val="single" w:sz="4" w:space="0" w:color="E3E3E4"/>
-              <w:bottom w:val="single" w:sz="4" w:space="0" w:color="E3E3E4"/>
-              <w:right w:val="single" w:sz="4" w:space="0" w:color="E3E3E4"/>
-            </w:tcBorders>
-            <w:shd w:color="auto" w:fill="F2F2F3" w:val="clear"/>
-          </w:tcPr>
-          <w:p>
-            <w:pPr>
-              <w:pStyle w:val="Normal"/>
-              <w:spacing w:lineRule="auto" w:line="240" w:before="0" w:after="0"/>
-              <w:jc w:val="left"/>
-              <w:rPr/>
-            </w:pPr>
-            <w:r>
-              <w:rPr>
-                <w:rFonts w:eastAsia="Times New Roman" w:cs="Times New Roman"/>
-                <w:sz w:val="19"/>
-              </w:rPr>
-              <w:t>Full</w:t>
-            </w:r>
-          </w:p>
-        </w:tc>
-        <w:tc>
-          <w:tcPr>
-            <w:tcW w:w="1008" w:type="dxa"/>
-            <w:tcBorders>
-              <w:top w:val="single" w:sz="4" w:space="0" w:color="E3E3E4"/>
-              <w:left w:val="single" w:sz="4" w:space="0" w:color="E3E3E4"/>
-              <w:bottom w:val="single" w:sz="4" w:space="0" w:color="E3E3E4"/>
-              <w:right w:val="single" w:sz="4" w:space="0" w:color="E3E3E4"/>
-            </w:tcBorders>
-            <w:shd w:color="auto" w:fill="F2F2F3" w:val="clear"/>
-          </w:tcPr>
-          <w:p>
-            <w:pPr>
-              <w:pStyle w:val="Normal"/>
-              <w:spacing w:lineRule="auto" w:line="240" w:before="0" w:after="0"/>
-              <w:jc w:val="left"/>
-              <w:rPr/>
-            </w:pPr>
-            <w:r>
-              <w:rPr>
-                <w:rFonts w:eastAsia="Times New Roman" w:cs="Times New Roman"/>
-                <w:sz w:val="19"/>
-              </w:rPr>
               <w:t>77</w:t>
             </w:r>
           </w:p>
         </w:tc>
         <w:tc>
           <w:tcPr>
-            <w:tcW w:w="2693" w:type="dxa"/>
+            <w:tcW w:w="2621" w:type="dxa"/>
             <w:tcBorders>
               <w:top w:val="single" w:sz="4" w:space="0" w:color="E3E3E4"/>
               <w:left w:val="single" w:sz="4" w:space="0" w:color="E3E3E4"/>
@@ -8893,6 +11242,110 @@
         <w:trPr/>
         <w:tc>
           <w:tcPr>
+            <w:tcW w:w="502" w:type="dxa"/>
+            <w:tcBorders>
+              <w:top w:val="single" w:sz="4" w:space="0" w:color="E3E3E4"/>
+              <w:left w:val="single" w:sz="4" w:space="0" w:color="E3E3E4"/>
+              <w:bottom w:val="single" w:sz="4" w:space="0" w:color="E3E3E4"/>
+              <w:right w:val="single" w:sz="4" w:space="0" w:color="E3E3E4"/>
+            </w:tcBorders>
+          </w:tcPr>
+          <w:p>
+            <w:pPr>
+              <w:pStyle w:val="Normal"/>
+              <w:spacing w:lineRule="auto" w:line="240" w:before="0" w:after="0"/>
+              <w:jc w:val="left"/>
+              <w:rPr/>
+            </w:pPr>
+            <w:r>
+              <w:rPr>
+                <w:rFonts w:eastAsia="Times New Roman" w:cs="Times New Roman"/>
+                <w:sz w:val="19"/>
+              </w:rPr>
+              <w:t>5</w:t>
+            </w:r>
+          </w:p>
+        </w:tc>
+        <w:tc>
+          <w:tcPr>
+            <w:tcW w:w="2593" w:type="dxa"/>
+            <w:tcBorders>
+              <w:top w:val="single" w:sz="4" w:space="0" w:color="E3E3E4"/>
+              <w:left w:val="single" w:sz="4" w:space="0" w:color="E3E3E4"/>
+              <w:bottom w:val="single" w:sz="4" w:space="0" w:color="E3E3E4"/>
+              <w:right w:val="single" w:sz="4" w:space="0" w:color="E3E3E4"/>
+            </w:tcBorders>
+          </w:tcPr>
+          <w:p>
+            <w:pPr>
+              <w:pStyle w:val="Normal"/>
+              <w:spacing w:lineRule="auto" w:line="240" w:before="0" w:after="0"/>
+              <w:jc w:val="left"/>
+              <w:rPr/>
+            </w:pPr>
+            <w:r>
+              <w:rPr>
+                <w:rFonts w:eastAsia="Times New Roman" w:cs="Times New Roman"/>
+                <w:sz w:val="19"/>
+              </w:rPr>
+              <w:t>Group: Yes (Crescent Agro-Energy Group) &gt; Sahara Hydrogen Energy</w:t>
+            </w:r>
+          </w:p>
+        </w:tc>
+        <w:tc>
+          <w:tcPr>
+            <w:tcW w:w="2592" w:type="dxa"/>
+            <w:tcBorders>
+              <w:top w:val="single" w:sz="4" w:space="0" w:color="E3E3E4"/>
+              <w:left w:val="single" w:sz="4" w:space="0" w:color="E3E3E4"/>
+              <w:bottom w:val="single" w:sz="4" w:space="0" w:color="E3E3E4"/>
+              <w:right w:val="single" w:sz="4" w:space="0" w:color="E3E3E4"/>
+            </w:tcBorders>
+          </w:tcPr>
+          <w:p>
+            <w:pPr>
+              <w:pStyle w:val="Normal"/>
+              <w:spacing w:lineRule="auto" w:line="240" w:before="0" w:after="0"/>
+              <w:jc w:val="left"/>
+              <w:rPr/>
+            </w:pPr>
+            <w:r>
+              <w:rPr>
+                <w:rFonts w:eastAsia="Times New Roman" w:cs="Times New Roman"/>
+                <w:sz w:val="19"/>
+              </w:rPr>
+              <w:t>SAH-001 Green Hydrogen Refuelling Kit</w:t>
+            </w:r>
+          </w:p>
+        </w:tc>
+        <w:tc>
+          <w:tcPr>
+            <w:tcW w:w="720" w:type="dxa"/>
+            <w:tcBorders>
+              <w:top w:val="single" w:sz="4" w:space="0" w:color="E3E3E4"/>
+              <w:left w:val="single" w:sz="4" w:space="0" w:color="E3E3E4"/>
+              <w:bottom w:val="single" w:sz="4" w:space="0" w:color="E3E3E4"/>
+              <w:right w:val="single" w:sz="4" w:space="0" w:color="E3E3E4"/>
+            </w:tcBorders>
+          </w:tcPr>
+          <w:p>
+            <w:pPr>
+              <w:pStyle w:val="Normal"/>
+              <w:spacing w:lineRule="auto" w:line="240" w:before="0" w:after="0"/>
+              <w:jc w:val="left"/>
+              <w:rPr/>
+            </w:pPr>
+            <w:r>
+              <w:rPr>
+                <w:rFonts w:eastAsia="Times New Roman" w:cs="Times New Roman"/>
+                <w:sz w:val="19"/>
+              </w:rPr>
+              <w:t>Full</w:t>
+            </w:r>
+          </w:p>
+        </w:tc>
+        <w:tc>
+          <w:tcPr>
             <w:tcW w:w="719" w:type="dxa"/>
             <w:tcBorders>
               <w:top w:val="single" w:sz="4" w:space="0" w:color="E3E3E4"/>
@@ -8913,13 +11366,13 @@
                 <w:rFonts w:eastAsia="Times New Roman" w:cs="Times New Roman"/>
                 <w:sz w:val="19"/>
               </w:rPr>
-              <w:t>5</w:t>
-            </w:r>
-          </w:p>
-        </w:tc>
-        <w:tc>
-          <w:tcPr>
-            <w:tcW w:w="4176" w:type="dxa"/>
+              <w:t>92</w:t>
+            </w:r>
+          </w:p>
+        </w:tc>
+        <w:tc>
+          <w:tcPr>
+            <w:tcW w:w="2621" w:type="dxa"/>
             <w:tcBorders>
               <w:top w:val="single" w:sz="4" w:space="0" w:color="E3E3E4"/>
               <w:left w:val="single" w:sz="4" w:space="0" w:color="E3E3E4"/>
@@ -8939,19 +11392,23 @@
                 <w:rFonts w:eastAsia="Times New Roman" w:cs="Times New Roman"/>
                 <w:sz w:val="19"/>
               </w:rPr>
-              <w:t>ENR-012 Green Hydrogen Electrolyser Pilot</w:t>
-            </w:r>
-          </w:p>
-        </w:tc>
-        <w:tc>
-          <w:tcPr>
-            <w:tcW w:w="1152" w:type="dxa"/>
-            <w:tcBorders>
-              <w:top w:val="single" w:sz="4" w:space="0" w:color="E3E3E4"/>
-              <w:left w:val="single" w:sz="4" w:space="0" w:color="E3E3E4"/>
-              <w:bottom w:val="single" w:sz="4" w:space="0" w:color="E3E3E4"/>
-              <w:right w:val="single" w:sz="4" w:space="0" w:color="E3E3E4"/>
-            </w:tcBorders>
+              <w:t>Active</w:t>
+            </w:r>
+          </w:p>
+        </w:tc>
+      </w:tr>
+      <w:tr>
+        <w:trPr/>
+        <w:tc>
+          <w:tcPr>
+            <w:tcW w:w="502" w:type="dxa"/>
+            <w:tcBorders>
+              <w:top w:val="single" w:sz="4" w:space="0" w:color="E3E3E4"/>
+              <w:left w:val="single" w:sz="4" w:space="0" w:color="E3E3E4"/>
+              <w:bottom w:val="single" w:sz="4" w:space="0" w:color="E3E3E4"/>
+              <w:right w:val="single" w:sz="4" w:space="0" w:color="E3E3E4"/>
+            </w:tcBorders>
+            <w:shd w:color="auto" w:fill="F2F2F3" w:val="clear"/>
           </w:tcPr>
           <w:p>
             <w:pPr>
@@ -8965,19 +11422,20 @@
                 <w:rFonts w:eastAsia="Times New Roman" w:cs="Times New Roman"/>
                 <w:sz w:val="19"/>
               </w:rPr>
-              <w:t>Full</w:t>
-            </w:r>
-          </w:p>
-        </w:tc>
-        <w:tc>
-          <w:tcPr>
-            <w:tcW w:w="1008" w:type="dxa"/>
-            <w:tcBorders>
-              <w:top w:val="single" w:sz="4" w:space="0" w:color="E3E3E4"/>
-              <w:left w:val="single" w:sz="4" w:space="0" w:color="E3E3E4"/>
-              <w:bottom w:val="single" w:sz="4" w:space="0" w:color="E3E3E4"/>
-              <w:right w:val="single" w:sz="4" w:space="0" w:color="E3E3E4"/>
-            </w:tcBorders>
+              <w:t>6</w:t>
+            </w:r>
+          </w:p>
+        </w:tc>
+        <w:tc>
+          <w:tcPr>
+            <w:tcW w:w="2593" w:type="dxa"/>
+            <w:tcBorders>
+              <w:top w:val="single" w:sz="4" w:space="0" w:color="E3E3E4"/>
+              <w:left w:val="single" w:sz="4" w:space="0" w:color="E3E3E4"/>
+              <w:bottom w:val="single" w:sz="4" w:space="0" w:color="E3E3E4"/>
+              <w:right w:val="single" w:sz="4" w:space="0" w:color="E3E3E4"/>
+            </w:tcBorders>
+            <w:shd w:color="auto" w:fill="F2F2F3" w:val="clear"/>
           </w:tcPr>
           <w:p>
             <w:pPr>
@@ -8991,19 +11449,101 @@
                 <w:rFonts w:eastAsia="Times New Roman" w:cs="Times New Roman"/>
                 <w:sz w:val="19"/>
               </w:rPr>
-              <w:t>31</w:t>
-            </w:r>
-          </w:p>
-        </w:tc>
-        <w:tc>
-          <w:tcPr>
-            <w:tcW w:w="2693" w:type="dxa"/>
-            <w:tcBorders>
-              <w:top w:val="single" w:sz="4" w:space="0" w:color="E3E3E4"/>
-              <w:left w:val="single" w:sz="4" w:space="0" w:color="E3E3E4"/>
-              <w:bottom w:val="single" w:sz="4" w:space="0" w:color="E3E3E4"/>
-              <w:right w:val="single" w:sz="4" w:space="0" w:color="E3E3E4"/>
-            </w:tcBorders>
+              <w:t>Group: Yes (Atlas Infrastructure Holding) &gt; Palmgrove Residential Developers</w:t>
+            </w:r>
+          </w:p>
+        </w:tc>
+        <w:tc>
+          <w:tcPr>
+            <w:tcW w:w="2592" w:type="dxa"/>
+            <w:tcBorders>
+              <w:top w:val="single" w:sz="4" w:space="0" w:color="E3E3E4"/>
+              <w:left w:val="single" w:sz="4" w:space="0" w:color="E3E3E4"/>
+              <w:bottom w:val="single" w:sz="4" w:space="0" w:color="E3E3E4"/>
+              <w:right w:val="single" w:sz="4" w:space="0" w:color="E3E3E4"/>
+            </w:tcBorders>
+            <w:shd w:color="auto" w:fill="F2F2F3" w:val="clear"/>
+          </w:tcPr>
+          <w:p>
+            <w:pPr>
+              <w:pStyle w:val="Normal"/>
+              <w:spacing w:lineRule="auto" w:line="240" w:before="0" w:after="0"/>
+              <w:jc w:val="left"/>
+              <w:rPr/>
+            </w:pPr>
+            <w:r>
+              <w:rPr>
+                <w:rFonts w:eastAsia="Times New Roman" w:cs="Times New Roman"/>
+                <w:sz w:val="19"/>
+              </w:rPr>
+              <w:t>PAL-001 Smart Townhouse Collection</w:t>
+            </w:r>
+          </w:p>
+        </w:tc>
+        <w:tc>
+          <w:tcPr>
+            <w:tcW w:w="720" w:type="dxa"/>
+            <w:tcBorders>
+              <w:top w:val="single" w:sz="4" w:space="0" w:color="E3E3E4"/>
+              <w:left w:val="single" w:sz="4" w:space="0" w:color="E3E3E4"/>
+              <w:bottom w:val="single" w:sz="4" w:space="0" w:color="E3E3E4"/>
+              <w:right w:val="single" w:sz="4" w:space="0" w:color="E3E3E4"/>
+            </w:tcBorders>
+            <w:shd w:color="auto" w:fill="F2F2F3" w:val="clear"/>
+          </w:tcPr>
+          <w:p>
+            <w:pPr>
+              <w:pStyle w:val="Normal"/>
+              <w:spacing w:lineRule="auto" w:line="240" w:before="0" w:after="0"/>
+              <w:jc w:val="left"/>
+              <w:rPr/>
+            </w:pPr>
+            <w:r>
+              <w:rPr>
+                <w:rFonts w:eastAsia="Times New Roman" w:cs="Times New Roman"/>
+                <w:sz w:val="19"/>
+              </w:rPr>
+              <w:t>Light</w:t>
+            </w:r>
+          </w:p>
+        </w:tc>
+        <w:tc>
+          <w:tcPr>
+            <w:tcW w:w="719" w:type="dxa"/>
+            <w:tcBorders>
+              <w:top w:val="single" w:sz="4" w:space="0" w:color="E3E3E4"/>
+              <w:left w:val="single" w:sz="4" w:space="0" w:color="E3E3E4"/>
+              <w:bottom w:val="single" w:sz="4" w:space="0" w:color="E3E3E4"/>
+              <w:right w:val="single" w:sz="4" w:space="0" w:color="E3E3E4"/>
+            </w:tcBorders>
+            <w:shd w:color="auto" w:fill="F2F2F3" w:val="clear"/>
+          </w:tcPr>
+          <w:p>
+            <w:pPr>
+              <w:pStyle w:val="Normal"/>
+              <w:spacing w:lineRule="auto" w:line="240" w:before="0" w:after="0"/>
+              <w:jc w:val="left"/>
+              <w:rPr/>
+            </w:pPr>
+            <w:r>
+              <w:rPr>
+                <w:rFonts w:eastAsia="Times New Roman" w:cs="Times New Roman"/>
+                <w:sz w:val="19"/>
+              </w:rPr>
+              <w:t>48</w:t>
+            </w:r>
+          </w:p>
+        </w:tc>
+        <w:tc>
+          <w:tcPr>
+            <w:tcW w:w="2621" w:type="dxa"/>
+            <w:tcBorders>
+              <w:top w:val="single" w:sz="4" w:space="0" w:color="E3E3E4"/>
+              <w:left w:val="single" w:sz="4" w:space="0" w:color="E3E3E4"/>
+              <w:bottom w:val="single" w:sz="4" w:space="0" w:color="E3E3E4"/>
+              <w:right w:val="single" w:sz="4" w:space="0" w:color="E3E3E4"/>
+            </w:tcBorders>
+            <w:shd w:color="auto" w:fill="F2F2F3" w:val="clear"/>
           </w:tcPr>
           <w:p>
             <w:pPr>
@@ -9048,7 +11588,25 @@
         <w:rPr>
           <w:rFonts w:eastAsia="Times New Roman" w:cs="Times New Roman"/>
         </w:rPr>
-        <w:t>Server tests: tenant isolation suite passes (npm test).</w:t>
+        <w:t>Server tests: 17 automated tests pass (npm test): tenant isolation, benchmarking, group portfolio scope, checklist templates, attachments, organization provisioning.</w:t>
+      </w:r>
+    </w:p>
+    <w:p>
+      <w:pPr>
+        <w:pStyle w:val="ListBullet"/>
+        <w:numPr>
+          <w:ilvl w:val="0"/>
+          <w:numId w:val="1"/>
+        </w:numPr>
+        <w:spacing w:before="0" w:after="40"/>
+        <w:contextualSpacing/>
+        <w:rPr/>
+      </w:pPr>
+      <w:r>
+        <w:rPr>
+          <w:rFonts w:eastAsia="Times New Roman" w:cs="Times New Roman"/>
+        </w:rPr>
+        <w:t>Module scenarios of the User Guide: 43 checks pass (replay-module-scenarios.mjs).</w:t>
       </w:r>
     </w:p>
     <w:p>
@@ -9084,7 +11642,7 @@
         <w:rPr>
           <w:rFonts w:eastAsia="Times New Roman" w:cs="Times New Roman"/>
         </w:rPr>
-        <w:t>Translations: 1,041 interface strings in English, French and Arabic, plus reference labels (statuses, processes, tasks, gates, roles).</w:t>
+        <w:t>Translations: 1,400 interface strings in English, French and Arabic, plus reference labels (statuses, processes, tasks, gates, roles).</w:t>
       </w:r>
     </w:p>
     <w:sectPr>
@@ -9167,7 +11725,7 @@
         <w:rFonts w:eastAsia="Times New Roman" w:cs="Times New Roman"/>
         <w:color w:val="808184"/>
       </w:rPr>
-      <w:t>6</w:t>
+      <w:t>7</w:t>
     </w:r>
     <w:r>
       <w:rPr>
@@ -9215,7 +11773,7 @@
         <w:rFonts w:eastAsia="Times New Roman" w:cs="Times New Roman"/>
         <w:color w:val="808184"/>
       </w:rPr>
-      <w:t>6</w:t>
+      <w:t>7</w:t>
     </w:r>
     <w:r>
       <w:rPr>

</xml_diff>